<commit_message>
Add invoice view and PDF export
Introduce invoice support: new /orders/<id>/invoice and /orders/<id>/invoice/pdf routes in app.py that create/fetch invoice records and render invoice data. Add invoice.html template for on-screen and printable invoices and a PDF export using xhtml2pdf (pisa). Update UI (orders and order_detail templates) to include View Invoice / Download PDF actions and add xhtml2pdf to requirements. Also add Commands.txt and update README with PDF/WeasyPrint notes; include uploaded proposal files and a compiled __pycache__ entry.
</commit_message>
<xml_diff>
--- a/FreshPlate_Project_Proposal.docx
+++ b/FreshPlate_Project_Proposal.docx
@@ -1,6 +1,6 @@
 
 <file path=word/document.xml><?xml version="1.0" encoding="utf-8"?>
-<w:document xmlns:wpc="http://schemas.microsoft.com/office/word/2010/wordprocessingCanvas" xmlns:cx="http://schemas.microsoft.com/office/drawing/2014/chartex" xmlns:cx1="http://schemas.microsoft.com/office/drawing/2015/9/8/chartex" xmlns:cx2="http://schemas.microsoft.com/office/drawing/2015/10/21/chartex" xmlns:cx3="http://schemas.microsoft.com/office/drawing/2016/5/9/chartex" xmlns:cx4="http://schemas.microsoft.com/office/drawing/2016/5/10/chartex" xmlns:cx5="http://schemas.microsoft.com/office/drawing/2016/5/11/chartex" xmlns:cx6="http://schemas.microsoft.com/office/drawing/2016/5/12/chartex" xmlns:cx7="http://schemas.microsoft.com/office/drawing/2016/5/13/chartex" xmlns:cx8="http://schemas.microsoft.com/office/drawing/2016/5/14/chartex" xmlns:mc="http://schemas.openxmlformats.org/markup-compatibility/2006" xmlns:aink="http://schemas.microsoft.com/office/drawing/2016/ink" xmlns:am3d="http://schemas.microsoft.com/office/drawing/2017/model3d" xmlns:o="urn:schemas-microsoft-com:office:office" xmlns:oel="http://schemas.microsoft.com/office/2019/extlst" xmlns:r="http://schemas.openxmlformats.org/officeDocument/2006/relationships" xmlns:m="http://schemas.openxmlformats.org/officeDocument/2006/math" xmlns:v="urn:schemas-microsoft-com:vml" xmlns:wp14="http://schemas.microsoft.com/office/word/2010/wordprocessingDrawing" xmlns:wp="http://schemas.openxmlformats.org/drawingml/2006/wordprocessingDrawing" xmlns:w10="urn:schemas-microsoft-com:office:word" xmlns:w="http://schemas.openxmlformats.org/wordprocessingml/2006/main" xmlns:w14="http://schemas.microsoft.com/office/word/2010/wordml" xmlns:w15="http://schemas.microsoft.com/office/word/2012/wordml" xmlns:w16cex="http://schemas.microsoft.com/office/word/2018/wordml/cex" xmlns:w16cid="http://schemas.microsoft.com/office/word/2016/wordml/cid" xmlns:w16="http://schemas.microsoft.com/office/word/2018/wordml" xmlns:w16du="http://schemas.microsoft.com/office/word/2023/wordml/word16du" xmlns:w16sdtdh="http://schemas.microsoft.com/office/word/2020/wordml/sdtdatahash" xmlns:w16sdtfl="http://schemas.microsoft.com/office/word/2024/wordml/sdtformatlock" xmlns:w16se="http://schemas.microsoft.com/office/word/2015/wordml/symex" xmlns:wpg="http://schemas.microsoft.com/office/word/2010/wordprocessingGroup" xmlns:wpi="http://schemas.microsoft.com/office/word/2010/wordprocessingInk" xmlns:wne="http://schemas.microsoft.com/office/word/2006/wordml" xmlns:wps="http://schemas.microsoft.com/office/word/2010/wordprocessingShape" mc:Ignorable="w14 w15 w16se w16cid w16 w16cex w16sdtdh w16sdtfl w16du wp14">
+<w:document xmlns:wpc="http://schemas.microsoft.com/office/word/2010/wordprocessingCanvas" xmlns:mc="http://schemas.openxmlformats.org/markup-compatibility/2006" xmlns:o="urn:schemas-microsoft-com:office:office" xmlns:r="http://schemas.openxmlformats.org/officeDocument/2006/relationships" xmlns:m="http://schemas.openxmlformats.org/officeDocument/2006/math" xmlns:v="urn:schemas-microsoft-com:vml" xmlns:wp14="http://schemas.microsoft.com/office/word/2010/wordprocessingDrawing" xmlns:wp="http://schemas.openxmlformats.org/drawingml/2006/wordprocessingDrawing" xmlns:w="http://schemas.openxmlformats.org/wordprocessingml/2006/main" xmlns:w14="http://schemas.microsoft.com/office/word/2010/wordml" xmlns:w10="urn:schemas-microsoft-com:office:word" xmlns:w15="http://schemas.microsoft.com/office/word/2012/wordml" xmlns:wpg="http://schemas.microsoft.com/office/word/2010/wordprocessingGroup" xmlns:wpi="http://schemas.microsoft.com/office/word/2010/wordprocessingInk" xmlns:wne="http://schemas.microsoft.com/office/word/2006/wordml" xmlns:wps="http://schemas.microsoft.com/office/word/2010/wordprocessingShape" xmlns:wpsCustomData="http://www.wps.cn/officeDocument/2013/wpsCustomData" mc:Ignorable="w14 w15 wp14">
   <w:body>
     <w:p>
       <w:pPr>
@@ -15,6 +15,8 @@
         </w:rPr>
         <w:t>DBMS – Lab</w:t>
       </w:r>
+      <w:bookmarkStart w:id="0" w:name="_GoBack"/>
+      <w:bookmarkEnd w:id="0"/>
     </w:p>
     <w:p>
       <w:pPr>
@@ -29,7 +31,7 @@
           <w:sz w:val="24"/>
           <w:szCs w:val="24"/>
         </w:rPr>
-        <w:t>BSCS [2-A]</w:t>
+        <w:t>BSCS [-A]</w:t>
       </w:r>
     </w:p>
     <w:p>
@@ -59,39 +61,53 @@
     </w:p>
     <w:tbl>
       <w:tblPr>
+        <w:tblStyle w:val="9"/>
         <w:tblW w:w="9360" w:type="dxa"/>
+        <w:tblInd w:w="0" w:type="dxa"/>
         <w:tblBorders>
-          <w:top w:val="none" w:sz="0" w:space="0" w:color="FFFFFF"/>
-          <w:left w:val="none" w:sz="0" w:space="0" w:color="FFFFFF"/>
-          <w:bottom w:val="none" w:sz="0" w:space="0" w:color="FFFFFF"/>
-          <w:right w:val="none" w:sz="0" w:space="0" w:color="FFFFFF"/>
-          <w:insideH w:val="single" w:sz="4" w:space="0" w:color="auto"/>
-          <w:insideV w:val="single" w:sz="4" w:space="0" w:color="auto"/>
+          <w:top w:val="none" w:color="FFFFFF" w:sz="0" w:space="0"/>
+          <w:left w:val="none" w:color="FFFFFF" w:sz="0" w:space="0"/>
+          <w:bottom w:val="none" w:color="FFFFFF" w:sz="0" w:space="0"/>
+          <w:right w:val="none" w:color="FFFFFF" w:sz="0" w:space="0"/>
+          <w:insideH w:val="single" w:color="auto" w:sz="4" w:space="0"/>
+          <w:insideV w:val="single" w:color="auto" w:sz="4" w:space="0"/>
         </w:tblBorders>
+        <w:tblLayout w:type="autofit"/>
         <w:tblCellMar>
+          <w:top w:w="0" w:type="dxa"/>
           <w:left w:w="10" w:type="dxa"/>
+          <w:bottom w:w="0" w:type="dxa"/>
           <w:right w:w="10" w:type="dxa"/>
         </w:tblCellMar>
-        <w:tblLook w:val="04A0" w:firstRow="1" w:lastRow="0" w:firstColumn="1" w:lastColumn="0" w:noHBand="0" w:noVBand="1"/>
       </w:tblPr>
       <w:tblGrid>
         <w:gridCol w:w="9360"/>
       </w:tblGrid>
       <w:tr>
         <w:tblPrEx>
+          <w:tblBorders>
+            <w:top w:val="none" w:color="FFFFFF" w:sz="0" w:space="0"/>
+            <w:left w:val="none" w:color="FFFFFF" w:sz="0" w:space="0"/>
+            <w:bottom w:val="none" w:color="FFFFFF" w:sz="0" w:space="0"/>
+            <w:right w:val="none" w:color="FFFFFF" w:sz="0" w:space="0"/>
+            <w:insideH w:val="single" w:color="auto" w:sz="4" w:space="0"/>
+            <w:insideV w:val="single" w:color="auto" w:sz="4" w:space="0"/>
+          </w:tblBorders>
           <w:tblCellMar>
             <w:top w:w="0" w:type="dxa"/>
+            <w:left w:w="10" w:type="dxa"/>
             <w:bottom w:w="0" w:type="dxa"/>
+            <w:right w:w="10" w:type="dxa"/>
           </w:tblCellMar>
         </w:tblPrEx>
         <w:tc>
           <w:tcPr>
             <w:tcW w:w="9360" w:type="dxa"/>
             <w:tcBorders>
-              <w:top w:val="none" w:sz="0" w:space="0" w:color="FFFFFF"/>
-              <w:left w:val="none" w:sz="0" w:space="0" w:color="FFFFFF"/>
-              <w:bottom w:val="none" w:sz="0" w:space="0" w:color="FFFFFF"/>
-              <w:right w:val="none" w:sz="0" w:space="0" w:color="FFFFFF"/>
+              <w:top w:val="nil"/>
+              <w:left w:val="nil"/>
+              <w:bottom w:val="nil"/>
+              <w:right w:val="nil"/>
             </w:tcBorders>
             <w:tcMar>
               <w:top w:w="80" w:type="dxa"/>
@@ -111,71 +127,41 @@
           </w:p>
           <w:p>
             <w:pPr>
-              <w:pStyle w:val="ListParagraph"/>
+              <w:pStyle w:val="17"/>
               <w:numPr>
                 <w:ilvl w:val="0"/>
-                <w:numId w:val="2"/>
+                <w:numId w:val="1"/>
               </w:numPr>
               <w:spacing w:before="40" w:after="40"/>
             </w:pPr>
             <w:r>
-              <w:t>Mian AbdurRahman Qayyum</w:t>
-            </w:r>
-            <w:r>
-              <w:t xml:space="preserve">   (</w:t>
-            </w:r>
-            <w:r>
-              <w:t>03-134242-039</w:t>
-            </w:r>
-            <w:r>
-              <w:t>)</w:t>
+              <w:t>Mian AbdurRahman Qayyum   (03-134242-039)</w:t>
             </w:r>
           </w:p>
           <w:p>
             <w:pPr>
-              <w:pStyle w:val="ListParagraph"/>
+              <w:pStyle w:val="17"/>
               <w:numPr>
                 <w:ilvl w:val="0"/>
-                <w:numId w:val="2"/>
+                <w:numId w:val="1"/>
               </w:numPr>
               <w:spacing w:before="40" w:after="40"/>
             </w:pPr>
             <w:r>
-              <w:t>Haider Ali</w:t>
-            </w:r>
-            <w:r>
-              <w:t xml:space="preserve">   (</w:t>
-            </w:r>
-            <w:r>
-              <w:t>03-134242-0</w:t>
-            </w:r>
-            <w:r>
-              <w:t>22</w:t>
-            </w:r>
-            <w:r>
-              <w:t>)</w:t>
+              <w:t>Haider Ali   (03-134242-022)</w:t>
             </w:r>
           </w:p>
           <w:p>
             <w:pPr>
-              <w:pStyle w:val="ListParagraph"/>
+              <w:pStyle w:val="17"/>
               <w:numPr>
                 <w:ilvl w:val="0"/>
-                <w:numId w:val="2"/>
+                <w:numId w:val="1"/>
               </w:numPr>
               <w:spacing w:before="40" w:after="40"/>
             </w:pPr>
             <w:r>
-              <w:t xml:space="preserve">Ahmad Uneeb </w:t>
-            </w:r>
-            <w:r>
-              <w:t>(03-134242-</w:t>
-            </w:r>
-            <w:r>
-              <w:t>047</w:t>
-            </w:r>
-            <w:r>
-              <w:t>)</w:t>
+              <w:t>Ahmad Uneeb (03-134242-047)</w:t>
             </w:r>
           </w:p>
         </w:tc>
@@ -195,7 +181,11 @@
         <w:t xml:space="preserve">Submitted to: </w:t>
       </w:r>
       <w:r>
-        <w:t xml:space="preserve">Sir </w:t>
+        <w:rPr>
+          <w:rFonts w:hint="default"/>
+          <w:lang w:val="en-US"/>
+        </w:rPr>
+        <w:t xml:space="preserve">Miss </w:t>
       </w:r>
       <w:r>
         <w:t>Nadia Shakir</w:t>
@@ -279,7 +269,7 @@
     <w:p>
       <w:pPr>
         <w:pBdr>
-          <w:bottom w:val="single" w:sz="4" w:space="4" w:color="2E3A87"/>
+          <w:bottom w:val="single" w:color="2E3A87" w:sz="4" w:space="4"/>
         </w:pBdr>
         <w:spacing w:before="180" w:after="80"/>
       </w:pPr>
@@ -289,7 +279,6 @@
           <w:bCs/>
           <w:color w:val="2E3A87"/>
         </w:rPr>
-        <w:lastRenderedPageBreak/>
         <w:t>Table of Contents</w:t>
       </w:r>
     </w:p>
@@ -304,6 +293,8 @@
       </w:r>
       <w:r>
         <w:tab/>
+      </w:r>
+      <w:r>
         <w:t>3</w:t>
       </w:r>
     </w:p>
@@ -318,6 +309,8 @@
       </w:r>
       <w:r>
         <w:tab/>
+      </w:r>
+      <w:r>
         <w:t>4</w:t>
       </w:r>
     </w:p>
@@ -332,10 +325,14 @@
       </w:r>
       <w:r>
         <w:tab/>
+      </w:r>
+      <w:r>
         <w:t>Introduction</w:t>
       </w:r>
       <w:r>
         <w:tab/>
+      </w:r>
+      <w:r>
         <w:t>5</w:t>
       </w:r>
     </w:p>
@@ -350,10 +347,14 @@
       </w:r>
       <w:r>
         <w:tab/>
+      </w:r>
+      <w:r>
         <w:t>Objectives</w:t>
       </w:r>
       <w:r>
         <w:tab/>
+      </w:r>
+      <w:r>
         <w:t>5</w:t>
       </w:r>
     </w:p>
@@ -368,10 +369,14 @@
       </w:r>
       <w:r>
         <w:tab/>
+      </w:r>
+      <w:r>
         <w:t>Database Design</w:t>
       </w:r>
       <w:r>
         <w:tab/>
+      </w:r>
+      <w:r>
         <w:t>6</w:t>
       </w:r>
     </w:p>
@@ -386,10 +391,14 @@
       </w:r>
       <w:r>
         <w:tab/>
+      </w:r>
+      <w:r>
         <w:t>System Features</w:t>
       </w:r>
       <w:r>
         <w:tab/>
+      </w:r>
+      <w:r>
         <w:t>7</w:t>
       </w:r>
     </w:p>
@@ -404,10 +413,14 @@
       </w:r>
       <w:r>
         <w:tab/>
+      </w:r>
+      <w:r>
         <w:t>Technologies Used</w:t>
       </w:r>
       <w:r>
         <w:tab/>
+      </w:r>
+      <w:r>
         <w:t>8</w:t>
       </w:r>
     </w:p>
@@ -419,7 +432,7 @@
     <w:p>
       <w:pPr>
         <w:pBdr>
-          <w:bottom w:val="single" w:sz="4" w:space="4" w:color="2E3A87"/>
+          <w:bottom w:val="single" w:color="2E3A87" w:sz="4" w:space="4"/>
         </w:pBdr>
         <w:spacing w:before="180" w:after="80"/>
       </w:pPr>
@@ -429,7 +442,6 @@
           <w:bCs/>
           <w:color w:val="2E3A87"/>
         </w:rPr>
-        <w:lastRenderedPageBreak/>
         <w:t>Marks Distribution</w:t>
       </w:r>
     </w:p>
@@ -454,20 +466,24 @@
     </w:p>
     <w:tbl>
       <w:tblPr>
+        <w:tblStyle w:val="9"/>
         <w:tblW w:w="9360" w:type="dxa"/>
+        <w:tblInd w:w="0" w:type="dxa"/>
         <w:tblBorders>
-          <w:top w:val="single" w:sz="4" w:space="0" w:color="auto"/>
-          <w:left w:val="single" w:sz="4" w:space="0" w:color="auto"/>
-          <w:bottom w:val="single" w:sz="4" w:space="0" w:color="auto"/>
-          <w:right w:val="single" w:sz="4" w:space="0" w:color="auto"/>
-          <w:insideH w:val="single" w:sz="4" w:space="0" w:color="auto"/>
-          <w:insideV w:val="single" w:sz="4" w:space="0" w:color="auto"/>
+          <w:top w:val="single" w:color="auto" w:sz="4" w:space="0"/>
+          <w:left w:val="single" w:color="auto" w:sz="4" w:space="0"/>
+          <w:bottom w:val="single" w:color="auto" w:sz="4" w:space="0"/>
+          <w:right w:val="single" w:color="auto" w:sz="4" w:space="0"/>
+          <w:insideH w:val="single" w:color="auto" w:sz="4" w:space="0"/>
+          <w:insideV w:val="single" w:color="auto" w:sz="4" w:space="0"/>
         </w:tblBorders>
+        <w:tblLayout w:type="autofit"/>
         <w:tblCellMar>
+          <w:top w:w="0" w:type="dxa"/>
           <w:left w:w="10" w:type="dxa"/>
+          <w:bottom w:w="0" w:type="dxa"/>
           <w:right w:w="10" w:type="dxa"/>
         </w:tblCellMar>
-        <w:tblLook w:val="04A0" w:firstRow="1" w:lastRow="0" w:firstColumn="1" w:lastColumn="0" w:noHBand="0" w:noVBand="1"/>
       </w:tblPr>
       <w:tblGrid>
         <w:gridCol w:w="720"/>
@@ -478,9 +494,19 @@
       </w:tblGrid>
       <w:tr>
         <w:tblPrEx>
+          <w:tblBorders>
+            <w:top w:val="single" w:color="auto" w:sz="4" w:space="0"/>
+            <w:left w:val="single" w:color="auto" w:sz="4" w:space="0"/>
+            <w:bottom w:val="single" w:color="auto" w:sz="4" w:space="0"/>
+            <w:right w:val="single" w:color="auto" w:sz="4" w:space="0"/>
+            <w:insideH w:val="single" w:color="auto" w:sz="4" w:space="0"/>
+            <w:insideV w:val="single" w:color="auto" w:sz="4" w:space="0"/>
+          </w:tblBorders>
           <w:tblCellMar>
             <w:top w:w="0" w:type="dxa"/>
+            <w:left w:w="10" w:type="dxa"/>
             <w:bottom w:w="0" w:type="dxa"/>
+            <w:right w:w="10" w:type="dxa"/>
           </w:tblCellMar>
         </w:tblPrEx>
         <w:tc>
@@ -488,10 +514,10 @@
             <w:tcW w:w="9360" w:type="dxa"/>
             <w:gridSpan w:val="5"/>
             <w:tcBorders>
-              <w:top w:val="single" w:sz="4" w:space="0" w:color="2E3A87"/>
-              <w:left w:val="single" w:sz="4" w:space="0" w:color="2E3A87"/>
-              <w:bottom w:val="single" w:sz="4" w:space="0" w:color="2E3A87"/>
-              <w:right w:val="single" w:sz="4" w:space="0" w:color="2E3A87"/>
+              <w:top w:val="single" w:color="2E3A87" w:sz="4" w:space="0"/>
+              <w:left w:val="single" w:color="2E3A87" w:sz="4" w:space="0"/>
+              <w:bottom w:val="single" w:color="2E3A87" w:sz="4" w:space="0"/>
+              <w:right w:val="single" w:color="2E3A87" w:sz="4" w:space="0"/>
             </w:tcBorders>
             <w:shd w:val="clear" w:color="auto" w:fill="2E3A87"/>
             <w:tcMar>
@@ -518,19 +544,29 @@
       </w:tr>
       <w:tr>
         <w:tblPrEx>
+          <w:tblBorders>
+            <w:top w:val="single" w:color="auto" w:sz="4" w:space="0"/>
+            <w:left w:val="single" w:color="auto" w:sz="4" w:space="0"/>
+            <w:bottom w:val="single" w:color="auto" w:sz="4" w:space="0"/>
+            <w:right w:val="single" w:color="auto" w:sz="4" w:space="0"/>
+            <w:insideH w:val="single" w:color="auto" w:sz="4" w:space="0"/>
+            <w:insideV w:val="single" w:color="auto" w:sz="4" w:space="0"/>
+          </w:tblBorders>
           <w:tblCellMar>
             <w:top w:w="0" w:type="dxa"/>
+            <w:left w:w="10" w:type="dxa"/>
             <w:bottom w:w="0" w:type="dxa"/>
+            <w:right w:w="10" w:type="dxa"/>
           </w:tblCellMar>
         </w:tblPrEx>
         <w:tc>
           <w:tcPr>
             <w:tcW w:w="720" w:type="dxa"/>
             <w:tcBorders>
-              <w:top w:val="single" w:sz="1" w:space="0" w:color="CCCCCC"/>
-              <w:left w:val="single" w:sz="1" w:space="0" w:color="CCCCCC"/>
-              <w:bottom w:val="single" w:sz="1" w:space="0" w:color="CCCCCC"/>
-              <w:right w:val="single" w:sz="1" w:space="0" w:color="CCCCCC"/>
+              <w:top w:val="single" w:color="CCCCCC" w:sz="0" w:space="0"/>
+              <w:left w:val="single" w:color="CCCCCC" w:sz="0" w:space="0"/>
+              <w:bottom w:val="single" w:color="CCCCCC" w:sz="0" w:space="0"/>
+              <w:right w:val="single" w:color="CCCCCC" w:sz="0" w:space="0"/>
             </w:tcBorders>
             <w:shd w:val="clear" w:color="auto" w:fill="E8EAF6"/>
             <w:tcMar>
@@ -556,10 +592,10 @@
           <w:tcPr>
             <w:tcW w:w="3600" w:type="dxa"/>
             <w:tcBorders>
-              <w:top w:val="single" w:sz="1" w:space="0" w:color="CCCCCC"/>
-              <w:left w:val="single" w:sz="1" w:space="0" w:color="CCCCCC"/>
-              <w:bottom w:val="single" w:sz="1" w:space="0" w:color="CCCCCC"/>
-              <w:right w:val="single" w:sz="1" w:space="0" w:color="CCCCCC"/>
+              <w:top w:val="single" w:color="CCCCCC" w:sz="0" w:space="0"/>
+              <w:left w:val="single" w:color="CCCCCC" w:sz="0" w:space="0"/>
+              <w:bottom w:val="single" w:color="CCCCCC" w:sz="0" w:space="0"/>
+              <w:right w:val="single" w:color="CCCCCC" w:sz="0" w:space="0"/>
             </w:tcBorders>
             <w:shd w:val="clear" w:color="auto" w:fill="E8EAF6"/>
             <w:tcMar>
@@ -585,10 +621,10 @@
           <w:tcPr>
             <w:tcW w:w="1440" w:type="dxa"/>
             <w:tcBorders>
-              <w:top w:val="single" w:sz="1" w:space="0" w:color="CCCCCC"/>
-              <w:left w:val="single" w:sz="1" w:space="0" w:color="CCCCCC"/>
-              <w:bottom w:val="single" w:sz="1" w:space="0" w:color="CCCCCC"/>
-              <w:right w:val="single" w:sz="1" w:space="0" w:color="CCCCCC"/>
+              <w:top w:val="single" w:color="CCCCCC" w:sz="0" w:space="0"/>
+              <w:left w:val="single" w:color="CCCCCC" w:sz="0" w:space="0"/>
+              <w:bottom w:val="single" w:color="CCCCCC" w:sz="0" w:space="0"/>
+              <w:right w:val="single" w:color="CCCCCC" w:sz="0" w:space="0"/>
             </w:tcBorders>
             <w:shd w:val="clear" w:color="auto" w:fill="E8EAF6"/>
             <w:tcMar>
@@ -617,10 +653,10 @@
           <w:tcPr>
             <w:tcW w:w="1800" w:type="dxa"/>
             <w:tcBorders>
-              <w:top w:val="single" w:sz="1" w:space="0" w:color="CCCCCC"/>
-              <w:left w:val="single" w:sz="1" w:space="0" w:color="CCCCCC"/>
-              <w:bottom w:val="single" w:sz="1" w:space="0" w:color="CCCCCC"/>
-              <w:right w:val="single" w:sz="1" w:space="0" w:color="CCCCCC"/>
+              <w:top w:val="single" w:color="CCCCCC" w:sz="0" w:space="0"/>
+              <w:left w:val="single" w:color="CCCCCC" w:sz="0" w:space="0"/>
+              <w:bottom w:val="single" w:color="CCCCCC" w:sz="0" w:space="0"/>
+              <w:right w:val="single" w:color="CCCCCC" w:sz="0" w:space="0"/>
             </w:tcBorders>
             <w:shd w:val="clear" w:color="auto" w:fill="E8EAF6"/>
             <w:tcMar>
@@ -649,10 +685,10 @@
           <w:tcPr>
             <w:tcW w:w="1800" w:type="dxa"/>
             <w:tcBorders>
-              <w:top w:val="single" w:sz="1" w:space="0" w:color="CCCCCC"/>
-              <w:left w:val="single" w:sz="1" w:space="0" w:color="CCCCCC"/>
-              <w:bottom w:val="single" w:sz="1" w:space="0" w:color="CCCCCC"/>
-              <w:right w:val="single" w:sz="1" w:space="0" w:color="CCCCCC"/>
+              <w:top w:val="single" w:color="CCCCCC" w:sz="0" w:space="0"/>
+              <w:left w:val="single" w:color="CCCCCC" w:sz="0" w:space="0"/>
+              <w:bottom w:val="single" w:color="CCCCCC" w:sz="0" w:space="0"/>
+              <w:right w:val="single" w:color="CCCCCC" w:sz="0" w:space="0"/>
             </w:tcBorders>
             <w:shd w:val="clear" w:color="auto" w:fill="E8EAF6"/>
             <w:tcMar>
@@ -680,19 +716,29 @@
       </w:tr>
       <w:tr>
         <w:tblPrEx>
+          <w:tblBorders>
+            <w:top w:val="single" w:color="auto" w:sz="4" w:space="0"/>
+            <w:left w:val="single" w:color="auto" w:sz="4" w:space="0"/>
+            <w:bottom w:val="single" w:color="auto" w:sz="4" w:space="0"/>
+            <w:right w:val="single" w:color="auto" w:sz="4" w:space="0"/>
+            <w:insideH w:val="single" w:color="auto" w:sz="4" w:space="0"/>
+            <w:insideV w:val="single" w:color="auto" w:sz="4" w:space="0"/>
+          </w:tblBorders>
           <w:tblCellMar>
             <w:top w:w="0" w:type="dxa"/>
+            <w:left w:w="10" w:type="dxa"/>
             <w:bottom w:w="0" w:type="dxa"/>
+            <w:right w:w="10" w:type="dxa"/>
           </w:tblCellMar>
         </w:tblPrEx>
         <w:tc>
           <w:tcPr>
             <w:tcW w:w="720" w:type="dxa"/>
             <w:tcBorders>
-              <w:top w:val="single" w:sz="1" w:space="0" w:color="CCCCCC"/>
-              <w:left w:val="single" w:sz="1" w:space="0" w:color="CCCCCC"/>
-              <w:bottom w:val="single" w:sz="1" w:space="0" w:color="CCCCCC"/>
-              <w:right w:val="single" w:sz="1" w:space="0" w:color="CCCCCC"/>
+              <w:top w:val="single" w:color="CCCCCC" w:sz="0" w:space="0"/>
+              <w:left w:val="single" w:color="CCCCCC" w:sz="0" w:space="0"/>
+              <w:bottom w:val="single" w:color="CCCCCC" w:sz="0" w:space="0"/>
+              <w:right w:val="single" w:color="CCCCCC" w:sz="0" w:space="0"/>
             </w:tcBorders>
             <w:tcMar>
               <w:top w:w="80" w:type="dxa"/>
@@ -715,10 +761,10 @@
           <w:tcPr>
             <w:tcW w:w="3600" w:type="dxa"/>
             <w:tcBorders>
-              <w:top w:val="single" w:sz="1" w:space="0" w:color="CCCCCC"/>
-              <w:left w:val="single" w:sz="1" w:space="0" w:color="CCCCCC"/>
-              <w:bottom w:val="single" w:sz="1" w:space="0" w:color="CCCCCC"/>
-              <w:right w:val="single" w:sz="1" w:space="0" w:color="CCCCCC"/>
+              <w:top w:val="single" w:color="CCCCCC" w:sz="0" w:space="0"/>
+              <w:left w:val="single" w:color="CCCCCC" w:sz="0" w:space="0"/>
+              <w:bottom w:val="single" w:color="CCCCCC" w:sz="0" w:space="0"/>
+              <w:right w:val="single" w:color="CCCCCC" w:sz="0" w:space="0"/>
             </w:tcBorders>
             <w:tcMar>
               <w:top w:w="80" w:type="dxa"/>
@@ -741,10 +787,10 @@
           <w:tcPr>
             <w:tcW w:w="1440" w:type="dxa"/>
             <w:tcBorders>
-              <w:top w:val="single" w:sz="1" w:space="0" w:color="CCCCCC"/>
-              <w:left w:val="single" w:sz="1" w:space="0" w:color="CCCCCC"/>
-              <w:bottom w:val="single" w:sz="1" w:space="0" w:color="CCCCCC"/>
-              <w:right w:val="single" w:sz="1" w:space="0" w:color="CCCCCC"/>
+              <w:top w:val="single" w:color="CCCCCC" w:sz="0" w:space="0"/>
+              <w:left w:val="single" w:color="CCCCCC" w:sz="0" w:space="0"/>
+              <w:bottom w:val="single" w:color="CCCCCC" w:sz="0" w:space="0"/>
+              <w:right w:val="single" w:color="CCCCCC" w:sz="0" w:space="0"/>
             </w:tcBorders>
             <w:tcMar>
               <w:top w:w="80" w:type="dxa"/>
@@ -770,10 +816,10 @@
           <w:tcPr>
             <w:tcW w:w="1800" w:type="dxa"/>
             <w:tcBorders>
-              <w:top w:val="single" w:sz="1" w:space="0" w:color="CCCCCC"/>
-              <w:left w:val="single" w:sz="1" w:space="0" w:color="CCCCCC"/>
-              <w:bottom w:val="single" w:sz="1" w:space="0" w:color="CCCCCC"/>
-              <w:right w:val="single" w:sz="1" w:space="0" w:color="CCCCCC"/>
+              <w:top w:val="single" w:color="CCCCCC" w:sz="0" w:space="0"/>
+              <w:left w:val="single" w:color="CCCCCC" w:sz="0" w:space="0"/>
+              <w:bottom w:val="single" w:color="CCCCCC" w:sz="0" w:space="0"/>
+              <w:right w:val="single" w:color="CCCCCC" w:sz="0" w:space="0"/>
             </w:tcBorders>
             <w:tcMar>
               <w:top w:w="80" w:type="dxa"/>
@@ -788,10 +834,10 @@
           <w:tcPr>
             <w:tcW w:w="1800" w:type="dxa"/>
             <w:tcBorders>
-              <w:top w:val="single" w:sz="1" w:space="0" w:color="CCCCCC"/>
-              <w:left w:val="single" w:sz="1" w:space="0" w:color="CCCCCC"/>
-              <w:bottom w:val="single" w:sz="1" w:space="0" w:color="CCCCCC"/>
-              <w:right w:val="single" w:sz="1" w:space="0" w:color="CCCCCC"/>
+              <w:top w:val="single" w:color="CCCCCC" w:sz="0" w:space="0"/>
+              <w:left w:val="single" w:color="CCCCCC" w:sz="0" w:space="0"/>
+              <w:bottom w:val="single" w:color="CCCCCC" w:sz="0" w:space="0"/>
+              <w:right w:val="single" w:color="CCCCCC" w:sz="0" w:space="0"/>
             </w:tcBorders>
             <w:tcMar>
               <w:top w:w="80" w:type="dxa"/>
@@ -805,19 +851,29 @@
       </w:tr>
       <w:tr>
         <w:tblPrEx>
+          <w:tblBorders>
+            <w:top w:val="single" w:color="auto" w:sz="4" w:space="0"/>
+            <w:left w:val="single" w:color="auto" w:sz="4" w:space="0"/>
+            <w:bottom w:val="single" w:color="auto" w:sz="4" w:space="0"/>
+            <w:right w:val="single" w:color="auto" w:sz="4" w:space="0"/>
+            <w:insideH w:val="single" w:color="auto" w:sz="4" w:space="0"/>
+            <w:insideV w:val="single" w:color="auto" w:sz="4" w:space="0"/>
+          </w:tblBorders>
           <w:tblCellMar>
             <w:top w:w="0" w:type="dxa"/>
+            <w:left w:w="10" w:type="dxa"/>
             <w:bottom w:w="0" w:type="dxa"/>
+            <w:right w:w="10" w:type="dxa"/>
           </w:tblCellMar>
         </w:tblPrEx>
         <w:tc>
           <w:tcPr>
             <w:tcW w:w="720" w:type="dxa"/>
             <w:tcBorders>
-              <w:top w:val="single" w:sz="1" w:space="0" w:color="CCCCCC"/>
-              <w:left w:val="single" w:sz="1" w:space="0" w:color="CCCCCC"/>
-              <w:bottom w:val="single" w:sz="1" w:space="0" w:color="CCCCCC"/>
-              <w:right w:val="single" w:sz="1" w:space="0" w:color="CCCCCC"/>
+              <w:top w:val="single" w:color="CCCCCC" w:sz="0" w:space="0"/>
+              <w:left w:val="single" w:color="CCCCCC" w:sz="0" w:space="0"/>
+              <w:bottom w:val="single" w:color="CCCCCC" w:sz="0" w:space="0"/>
+              <w:right w:val="single" w:color="CCCCCC" w:sz="0" w:space="0"/>
             </w:tcBorders>
             <w:tcMar>
               <w:top w:w="80" w:type="dxa"/>
@@ -840,10 +896,10 @@
           <w:tcPr>
             <w:tcW w:w="3600" w:type="dxa"/>
             <w:tcBorders>
-              <w:top w:val="single" w:sz="1" w:space="0" w:color="CCCCCC"/>
-              <w:left w:val="single" w:sz="1" w:space="0" w:color="CCCCCC"/>
-              <w:bottom w:val="single" w:sz="1" w:space="0" w:color="CCCCCC"/>
-              <w:right w:val="single" w:sz="1" w:space="0" w:color="CCCCCC"/>
+              <w:top w:val="single" w:color="CCCCCC" w:sz="0" w:space="0"/>
+              <w:left w:val="single" w:color="CCCCCC" w:sz="0" w:space="0"/>
+              <w:bottom w:val="single" w:color="CCCCCC" w:sz="0" w:space="0"/>
+              <w:right w:val="single" w:color="CCCCCC" w:sz="0" w:space="0"/>
             </w:tcBorders>
             <w:tcMar>
               <w:top w:w="80" w:type="dxa"/>
@@ -866,10 +922,10 @@
           <w:tcPr>
             <w:tcW w:w="1440" w:type="dxa"/>
             <w:tcBorders>
-              <w:top w:val="single" w:sz="1" w:space="0" w:color="CCCCCC"/>
-              <w:left w:val="single" w:sz="1" w:space="0" w:color="CCCCCC"/>
-              <w:bottom w:val="single" w:sz="1" w:space="0" w:color="CCCCCC"/>
-              <w:right w:val="single" w:sz="1" w:space="0" w:color="CCCCCC"/>
+              <w:top w:val="single" w:color="CCCCCC" w:sz="0" w:space="0"/>
+              <w:left w:val="single" w:color="CCCCCC" w:sz="0" w:space="0"/>
+              <w:bottom w:val="single" w:color="CCCCCC" w:sz="0" w:space="0"/>
+              <w:right w:val="single" w:color="CCCCCC" w:sz="0" w:space="0"/>
             </w:tcBorders>
             <w:tcMar>
               <w:top w:w="80" w:type="dxa"/>
@@ -895,10 +951,10 @@
           <w:tcPr>
             <w:tcW w:w="1800" w:type="dxa"/>
             <w:tcBorders>
-              <w:top w:val="single" w:sz="1" w:space="0" w:color="CCCCCC"/>
-              <w:left w:val="single" w:sz="1" w:space="0" w:color="CCCCCC"/>
-              <w:bottom w:val="single" w:sz="1" w:space="0" w:color="CCCCCC"/>
-              <w:right w:val="single" w:sz="1" w:space="0" w:color="CCCCCC"/>
+              <w:top w:val="single" w:color="CCCCCC" w:sz="0" w:space="0"/>
+              <w:left w:val="single" w:color="CCCCCC" w:sz="0" w:space="0"/>
+              <w:bottom w:val="single" w:color="CCCCCC" w:sz="0" w:space="0"/>
+              <w:right w:val="single" w:color="CCCCCC" w:sz="0" w:space="0"/>
             </w:tcBorders>
             <w:tcMar>
               <w:top w:w="80" w:type="dxa"/>
@@ -913,10 +969,10 @@
           <w:tcPr>
             <w:tcW w:w="1800" w:type="dxa"/>
             <w:tcBorders>
-              <w:top w:val="single" w:sz="1" w:space="0" w:color="CCCCCC"/>
-              <w:left w:val="single" w:sz="1" w:space="0" w:color="CCCCCC"/>
-              <w:bottom w:val="single" w:sz="1" w:space="0" w:color="CCCCCC"/>
-              <w:right w:val="single" w:sz="1" w:space="0" w:color="CCCCCC"/>
+              <w:top w:val="single" w:color="CCCCCC" w:sz="0" w:space="0"/>
+              <w:left w:val="single" w:color="CCCCCC" w:sz="0" w:space="0"/>
+              <w:bottom w:val="single" w:color="CCCCCC" w:sz="0" w:space="0"/>
+              <w:right w:val="single" w:color="CCCCCC" w:sz="0" w:space="0"/>
             </w:tcBorders>
             <w:tcMar>
               <w:top w:w="80" w:type="dxa"/>
@@ -930,19 +986,29 @@
       </w:tr>
       <w:tr>
         <w:tblPrEx>
+          <w:tblBorders>
+            <w:top w:val="single" w:color="auto" w:sz="4" w:space="0"/>
+            <w:left w:val="single" w:color="auto" w:sz="4" w:space="0"/>
+            <w:bottom w:val="single" w:color="auto" w:sz="4" w:space="0"/>
+            <w:right w:val="single" w:color="auto" w:sz="4" w:space="0"/>
+            <w:insideH w:val="single" w:color="auto" w:sz="4" w:space="0"/>
+            <w:insideV w:val="single" w:color="auto" w:sz="4" w:space="0"/>
+          </w:tblBorders>
           <w:tblCellMar>
             <w:top w:w="0" w:type="dxa"/>
+            <w:left w:w="10" w:type="dxa"/>
             <w:bottom w:w="0" w:type="dxa"/>
+            <w:right w:w="10" w:type="dxa"/>
           </w:tblCellMar>
         </w:tblPrEx>
         <w:tc>
           <w:tcPr>
             <w:tcW w:w="720" w:type="dxa"/>
             <w:tcBorders>
-              <w:top w:val="single" w:sz="1" w:space="0" w:color="CCCCCC"/>
-              <w:left w:val="single" w:sz="1" w:space="0" w:color="CCCCCC"/>
-              <w:bottom w:val="single" w:sz="1" w:space="0" w:color="CCCCCC"/>
-              <w:right w:val="single" w:sz="1" w:space="0" w:color="CCCCCC"/>
+              <w:top w:val="single" w:color="CCCCCC" w:sz="0" w:space="0"/>
+              <w:left w:val="single" w:color="CCCCCC" w:sz="0" w:space="0"/>
+              <w:bottom w:val="single" w:color="CCCCCC" w:sz="0" w:space="0"/>
+              <w:right w:val="single" w:color="CCCCCC" w:sz="0" w:space="0"/>
             </w:tcBorders>
             <w:tcMar>
               <w:top w:w="80" w:type="dxa"/>
@@ -965,10 +1031,10 @@
           <w:tcPr>
             <w:tcW w:w="3600" w:type="dxa"/>
             <w:tcBorders>
-              <w:top w:val="single" w:sz="1" w:space="0" w:color="CCCCCC"/>
-              <w:left w:val="single" w:sz="1" w:space="0" w:color="CCCCCC"/>
-              <w:bottom w:val="single" w:sz="1" w:space="0" w:color="CCCCCC"/>
-              <w:right w:val="single" w:sz="1" w:space="0" w:color="CCCCCC"/>
+              <w:top w:val="single" w:color="CCCCCC" w:sz="0" w:space="0"/>
+              <w:left w:val="single" w:color="CCCCCC" w:sz="0" w:space="0"/>
+              <w:bottom w:val="single" w:color="CCCCCC" w:sz="0" w:space="0"/>
+              <w:right w:val="single" w:color="CCCCCC" w:sz="0" w:space="0"/>
             </w:tcBorders>
             <w:tcMar>
               <w:top w:w="80" w:type="dxa"/>
@@ -991,10 +1057,10 @@
           <w:tcPr>
             <w:tcW w:w="1440" w:type="dxa"/>
             <w:tcBorders>
-              <w:top w:val="single" w:sz="1" w:space="0" w:color="CCCCCC"/>
-              <w:left w:val="single" w:sz="1" w:space="0" w:color="CCCCCC"/>
-              <w:bottom w:val="single" w:sz="1" w:space="0" w:color="CCCCCC"/>
-              <w:right w:val="single" w:sz="1" w:space="0" w:color="CCCCCC"/>
+              <w:top w:val="single" w:color="CCCCCC" w:sz="0" w:space="0"/>
+              <w:left w:val="single" w:color="CCCCCC" w:sz="0" w:space="0"/>
+              <w:bottom w:val="single" w:color="CCCCCC" w:sz="0" w:space="0"/>
+              <w:right w:val="single" w:color="CCCCCC" w:sz="0" w:space="0"/>
             </w:tcBorders>
             <w:tcMar>
               <w:top w:w="80" w:type="dxa"/>
@@ -1020,10 +1086,10 @@
           <w:tcPr>
             <w:tcW w:w="1800" w:type="dxa"/>
             <w:tcBorders>
-              <w:top w:val="single" w:sz="1" w:space="0" w:color="CCCCCC"/>
-              <w:left w:val="single" w:sz="1" w:space="0" w:color="CCCCCC"/>
-              <w:bottom w:val="single" w:sz="1" w:space="0" w:color="CCCCCC"/>
-              <w:right w:val="single" w:sz="1" w:space="0" w:color="CCCCCC"/>
+              <w:top w:val="single" w:color="CCCCCC" w:sz="0" w:space="0"/>
+              <w:left w:val="single" w:color="CCCCCC" w:sz="0" w:space="0"/>
+              <w:bottom w:val="single" w:color="CCCCCC" w:sz="0" w:space="0"/>
+              <w:right w:val="single" w:color="CCCCCC" w:sz="0" w:space="0"/>
             </w:tcBorders>
             <w:tcMar>
               <w:top w:w="80" w:type="dxa"/>
@@ -1038,10 +1104,10 @@
           <w:tcPr>
             <w:tcW w:w="1800" w:type="dxa"/>
             <w:tcBorders>
-              <w:top w:val="single" w:sz="1" w:space="0" w:color="CCCCCC"/>
-              <w:left w:val="single" w:sz="1" w:space="0" w:color="CCCCCC"/>
-              <w:bottom w:val="single" w:sz="1" w:space="0" w:color="CCCCCC"/>
-              <w:right w:val="single" w:sz="1" w:space="0" w:color="CCCCCC"/>
+              <w:top w:val="single" w:color="CCCCCC" w:sz="0" w:space="0"/>
+              <w:left w:val="single" w:color="CCCCCC" w:sz="0" w:space="0"/>
+              <w:bottom w:val="single" w:color="CCCCCC" w:sz="0" w:space="0"/>
+              <w:right w:val="single" w:color="CCCCCC" w:sz="0" w:space="0"/>
             </w:tcBorders>
             <w:tcMar>
               <w:top w:w="80" w:type="dxa"/>
@@ -1055,19 +1121,29 @@
       </w:tr>
       <w:tr>
         <w:tblPrEx>
+          <w:tblBorders>
+            <w:top w:val="single" w:color="auto" w:sz="4" w:space="0"/>
+            <w:left w:val="single" w:color="auto" w:sz="4" w:space="0"/>
+            <w:bottom w:val="single" w:color="auto" w:sz="4" w:space="0"/>
+            <w:right w:val="single" w:color="auto" w:sz="4" w:space="0"/>
+            <w:insideH w:val="single" w:color="auto" w:sz="4" w:space="0"/>
+            <w:insideV w:val="single" w:color="auto" w:sz="4" w:space="0"/>
+          </w:tblBorders>
           <w:tblCellMar>
             <w:top w:w="0" w:type="dxa"/>
+            <w:left w:w="10" w:type="dxa"/>
             <w:bottom w:w="0" w:type="dxa"/>
+            <w:right w:w="10" w:type="dxa"/>
           </w:tblCellMar>
         </w:tblPrEx>
         <w:tc>
           <w:tcPr>
             <w:tcW w:w="720" w:type="dxa"/>
             <w:tcBorders>
-              <w:top w:val="single" w:sz="1" w:space="0" w:color="CCCCCC"/>
-              <w:left w:val="single" w:sz="1" w:space="0" w:color="CCCCCC"/>
-              <w:bottom w:val="single" w:sz="1" w:space="0" w:color="CCCCCC"/>
-              <w:right w:val="single" w:sz="1" w:space="0" w:color="CCCCCC"/>
+              <w:top w:val="single" w:color="CCCCCC" w:sz="0" w:space="0"/>
+              <w:left w:val="single" w:color="CCCCCC" w:sz="0" w:space="0"/>
+              <w:bottom w:val="single" w:color="CCCCCC" w:sz="0" w:space="0"/>
+              <w:right w:val="single" w:color="CCCCCC" w:sz="0" w:space="0"/>
             </w:tcBorders>
             <w:tcMar>
               <w:top w:w="80" w:type="dxa"/>
@@ -1090,10 +1166,10 @@
           <w:tcPr>
             <w:tcW w:w="3600" w:type="dxa"/>
             <w:tcBorders>
-              <w:top w:val="single" w:sz="1" w:space="0" w:color="CCCCCC"/>
-              <w:left w:val="single" w:sz="1" w:space="0" w:color="CCCCCC"/>
-              <w:bottom w:val="single" w:sz="1" w:space="0" w:color="CCCCCC"/>
-              <w:right w:val="single" w:sz="1" w:space="0" w:color="CCCCCC"/>
+              <w:top w:val="single" w:color="CCCCCC" w:sz="0" w:space="0"/>
+              <w:left w:val="single" w:color="CCCCCC" w:sz="0" w:space="0"/>
+              <w:bottom w:val="single" w:color="CCCCCC" w:sz="0" w:space="0"/>
+              <w:right w:val="single" w:color="CCCCCC" w:sz="0" w:space="0"/>
             </w:tcBorders>
             <w:tcMar>
               <w:top w:w="80" w:type="dxa"/>
@@ -1116,10 +1192,10 @@
           <w:tcPr>
             <w:tcW w:w="1440" w:type="dxa"/>
             <w:tcBorders>
-              <w:top w:val="single" w:sz="1" w:space="0" w:color="CCCCCC"/>
-              <w:left w:val="single" w:sz="1" w:space="0" w:color="CCCCCC"/>
-              <w:bottom w:val="single" w:sz="1" w:space="0" w:color="CCCCCC"/>
-              <w:right w:val="single" w:sz="1" w:space="0" w:color="CCCCCC"/>
+              <w:top w:val="single" w:color="CCCCCC" w:sz="0" w:space="0"/>
+              <w:left w:val="single" w:color="CCCCCC" w:sz="0" w:space="0"/>
+              <w:bottom w:val="single" w:color="CCCCCC" w:sz="0" w:space="0"/>
+              <w:right w:val="single" w:color="CCCCCC" w:sz="0" w:space="0"/>
             </w:tcBorders>
             <w:tcMar>
               <w:top w:w="80" w:type="dxa"/>
@@ -1145,10 +1221,10 @@
           <w:tcPr>
             <w:tcW w:w="1800" w:type="dxa"/>
             <w:tcBorders>
-              <w:top w:val="single" w:sz="1" w:space="0" w:color="CCCCCC"/>
-              <w:left w:val="single" w:sz="1" w:space="0" w:color="CCCCCC"/>
-              <w:bottom w:val="single" w:sz="1" w:space="0" w:color="CCCCCC"/>
-              <w:right w:val="single" w:sz="1" w:space="0" w:color="CCCCCC"/>
+              <w:top w:val="single" w:color="CCCCCC" w:sz="0" w:space="0"/>
+              <w:left w:val="single" w:color="CCCCCC" w:sz="0" w:space="0"/>
+              <w:bottom w:val="single" w:color="CCCCCC" w:sz="0" w:space="0"/>
+              <w:right w:val="single" w:color="CCCCCC" w:sz="0" w:space="0"/>
             </w:tcBorders>
             <w:tcMar>
               <w:top w:w="80" w:type="dxa"/>
@@ -1163,10 +1239,10 @@
           <w:tcPr>
             <w:tcW w:w="1800" w:type="dxa"/>
             <w:tcBorders>
-              <w:top w:val="single" w:sz="1" w:space="0" w:color="CCCCCC"/>
-              <w:left w:val="single" w:sz="1" w:space="0" w:color="CCCCCC"/>
-              <w:bottom w:val="single" w:sz="1" w:space="0" w:color="CCCCCC"/>
-              <w:right w:val="single" w:sz="1" w:space="0" w:color="CCCCCC"/>
+              <w:top w:val="single" w:color="CCCCCC" w:sz="0" w:space="0"/>
+              <w:left w:val="single" w:color="CCCCCC" w:sz="0" w:space="0"/>
+              <w:bottom w:val="single" w:color="CCCCCC" w:sz="0" w:space="0"/>
+              <w:right w:val="single" w:color="CCCCCC" w:sz="0" w:space="0"/>
             </w:tcBorders>
             <w:tcMar>
               <w:top w:w="80" w:type="dxa"/>
@@ -1180,9 +1256,19 @@
       </w:tr>
       <w:tr>
         <w:tblPrEx>
+          <w:tblBorders>
+            <w:top w:val="single" w:color="auto" w:sz="4" w:space="0"/>
+            <w:left w:val="single" w:color="auto" w:sz="4" w:space="0"/>
+            <w:bottom w:val="single" w:color="auto" w:sz="4" w:space="0"/>
+            <w:right w:val="single" w:color="auto" w:sz="4" w:space="0"/>
+            <w:insideH w:val="single" w:color="auto" w:sz="4" w:space="0"/>
+            <w:insideV w:val="single" w:color="auto" w:sz="4" w:space="0"/>
+          </w:tblBorders>
           <w:tblCellMar>
             <w:top w:w="0" w:type="dxa"/>
+            <w:left w:w="10" w:type="dxa"/>
             <w:bottom w:w="0" w:type="dxa"/>
+            <w:right w:w="10" w:type="dxa"/>
           </w:tblCellMar>
         </w:tblPrEx>
         <w:tc>
@@ -1190,10 +1276,10 @@
             <w:tcW w:w="4320" w:type="dxa"/>
             <w:gridSpan w:val="2"/>
             <w:tcBorders>
-              <w:top w:val="single" w:sz="1" w:space="0" w:color="CCCCCC"/>
-              <w:left w:val="single" w:sz="1" w:space="0" w:color="CCCCCC"/>
-              <w:bottom w:val="single" w:sz="1" w:space="0" w:color="CCCCCC"/>
-              <w:right w:val="single" w:sz="1" w:space="0" w:color="CCCCCC"/>
+              <w:top w:val="single" w:color="CCCCCC" w:sz="0" w:space="0"/>
+              <w:left w:val="single" w:color="CCCCCC" w:sz="0" w:space="0"/>
+              <w:bottom w:val="single" w:color="CCCCCC" w:sz="0" w:space="0"/>
+              <w:right w:val="single" w:color="CCCCCC" w:sz="0" w:space="0"/>
             </w:tcBorders>
             <w:shd w:val="clear" w:color="auto" w:fill="E8EAF6"/>
             <w:tcMar>
@@ -1219,10 +1305,10 @@
           <w:tcPr>
             <w:tcW w:w="1440" w:type="dxa"/>
             <w:tcBorders>
-              <w:top w:val="single" w:sz="1" w:space="0" w:color="CCCCCC"/>
-              <w:left w:val="single" w:sz="1" w:space="0" w:color="CCCCCC"/>
-              <w:bottom w:val="single" w:sz="1" w:space="0" w:color="CCCCCC"/>
-              <w:right w:val="single" w:sz="1" w:space="0" w:color="CCCCCC"/>
+              <w:top w:val="single" w:color="CCCCCC" w:sz="0" w:space="0"/>
+              <w:left w:val="single" w:color="CCCCCC" w:sz="0" w:space="0"/>
+              <w:bottom w:val="single" w:color="CCCCCC" w:sz="0" w:space="0"/>
+              <w:right w:val="single" w:color="CCCCCC" w:sz="0" w:space="0"/>
             </w:tcBorders>
             <w:shd w:val="clear" w:color="auto" w:fill="E8EAF6"/>
             <w:tcMar>
@@ -1251,10 +1337,10 @@
           <w:tcPr>
             <w:tcW w:w="1800" w:type="dxa"/>
             <w:tcBorders>
-              <w:top w:val="single" w:sz="1" w:space="0" w:color="CCCCCC"/>
-              <w:left w:val="single" w:sz="1" w:space="0" w:color="CCCCCC"/>
-              <w:bottom w:val="single" w:sz="1" w:space="0" w:color="CCCCCC"/>
-              <w:right w:val="single" w:sz="1" w:space="0" w:color="CCCCCC"/>
+              <w:top w:val="single" w:color="CCCCCC" w:sz="0" w:space="0"/>
+              <w:left w:val="single" w:color="CCCCCC" w:sz="0" w:space="0"/>
+              <w:bottom w:val="single" w:color="CCCCCC" w:sz="0" w:space="0"/>
+              <w:right w:val="single" w:color="CCCCCC" w:sz="0" w:space="0"/>
             </w:tcBorders>
             <w:tcMar>
               <w:top w:w="80" w:type="dxa"/>
@@ -1269,10 +1355,10 @@
           <w:tcPr>
             <w:tcW w:w="1800" w:type="dxa"/>
             <w:tcBorders>
-              <w:top w:val="single" w:sz="1" w:space="0" w:color="CCCCCC"/>
-              <w:left w:val="single" w:sz="1" w:space="0" w:color="CCCCCC"/>
-              <w:bottom w:val="single" w:sz="1" w:space="0" w:color="CCCCCC"/>
-              <w:right w:val="single" w:sz="1" w:space="0" w:color="CCCCCC"/>
+              <w:top w:val="single" w:color="CCCCCC" w:sz="0" w:space="0"/>
+              <w:left w:val="single" w:color="CCCCCC" w:sz="0" w:space="0"/>
+              <w:bottom w:val="single" w:color="CCCCCC" w:sz="0" w:space="0"/>
+              <w:right w:val="single" w:color="CCCCCC" w:sz="0" w:space="0"/>
             </w:tcBorders>
             <w:tcMar>
               <w:top w:w="80" w:type="dxa"/>
@@ -1301,7 +1387,7 @@
     <w:p>
       <w:pPr>
         <w:pBdr>
-          <w:bottom w:val="single" w:sz="4" w:space="4" w:color="2E3A87"/>
+          <w:bottom w:val="single" w:color="2E3A87" w:sz="4" w:space="4"/>
         </w:pBdr>
         <w:spacing w:before="180" w:after="80"/>
       </w:pPr>
@@ -1311,7 +1397,6 @@
           <w:bCs/>
           <w:color w:val="2E3A87"/>
         </w:rPr>
-        <w:lastRenderedPageBreak/>
         <w:t>Abstract</w:t>
       </w:r>
     </w:p>
@@ -1357,7 +1442,7 @@
     <w:p>
       <w:pPr>
         <w:pBdr>
-          <w:bottom w:val="single" w:sz="4" w:space="4" w:color="2E3A87"/>
+          <w:bottom w:val="single" w:color="2E3A87" w:sz="4" w:space="4"/>
         </w:pBdr>
         <w:spacing w:before="180" w:after="80"/>
       </w:pPr>
@@ -1367,7 +1452,6 @@
           <w:bCs/>
           <w:color w:val="2E3A87"/>
         </w:rPr>
-        <w:lastRenderedPageBreak/>
         <w:t>1.  Introduction</w:t>
       </w:r>
     </w:p>
@@ -1386,7 +1470,7 @@
     </w:p>
     <w:p>
       <w:pPr>
-        <w:pStyle w:val="Heading2"/>
+        <w:pStyle w:val="3"/>
         <w:spacing w:before="240" w:after="120"/>
       </w:pPr>
       <w:r>
@@ -1413,10 +1497,10 @@
     </w:p>
     <w:p>
       <w:pPr>
-        <w:pStyle w:val="ListParagraph"/>
-        <w:numPr>
-          <w:ilvl w:val="0"/>
-          <w:numId w:val="2"/>
+        <w:pStyle w:val="17"/>
+        <w:numPr>
+          <w:ilvl w:val="0"/>
+          <w:numId w:val="1"/>
         </w:numPr>
         <w:spacing w:before="40" w:after="40"/>
       </w:pPr>
@@ -1426,10 +1510,10 @@
     </w:p>
     <w:p>
       <w:pPr>
-        <w:pStyle w:val="ListParagraph"/>
-        <w:numPr>
-          <w:ilvl w:val="0"/>
-          <w:numId w:val="2"/>
+        <w:pStyle w:val="17"/>
+        <w:numPr>
+          <w:ilvl w:val="0"/>
+          <w:numId w:val="1"/>
         </w:numPr>
         <w:spacing w:before="40" w:after="40"/>
       </w:pPr>
@@ -1439,10 +1523,10 @@
     </w:p>
     <w:p>
       <w:pPr>
-        <w:pStyle w:val="ListParagraph"/>
-        <w:numPr>
-          <w:ilvl w:val="0"/>
-          <w:numId w:val="2"/>
+        <w:pStyle w:val="17"/>
+        <w:numPr>
+          <w:ilvl w:val="0"/>
+          <w:numId w:val="1"/>
         </w:numPr>
         <w:spacing w:before="40" w:after="40"/>
       </w:pPr>
@@ -1452,10 +1536,10 @@
     </w:p>
     <w:p>
       <w:pPr>
-        <w:pStyle w:val="ListParagraph"/>
-        <w:numPr>
-          <w:ilvl w:val="0"/>
-          <w:numId w:val="2"/>
+        <w:pStyle w:val="17"/>
+        <w:numPr>
+          <w:ilvl w:val="0"/>
+          <w:numId w:val="1"/>
         </w:numPr>
         <w:spacing w:before="40" w:after="40"/>
       </w:pPr>
@@ -1465,10 +1549,10 @@
     </w:p>
     <w:p>
       <w:pPr>
-        <w:pStyle w:val="ListParagraph"/>
-        <w:numPr>
-          <w:ilvl w:val="0"/>
-          <w:numId w:val="2"/>
+        <w:pStyle w:val="17"/>
+        <w:numPr>
+          <w:ilvl w:val="0"/>
+          <w:numId w:val="1"/>
         </w:numPr>
         <w:spacing w:before="40" w:after="40"/>
       </w:pPr>
@@ -1484,7 +1568,7 @@
     <w:p>
       <w:pPr>
         <w:pBdr>
-          <w:bottom w:val="single" w:sz="4" w:space="4" w:color="2E3A87"/>
+          <w:bottom w:val="single" w:color="2E3A87" w:sz="4" w:space="4"/>
         </w:pBdr>
         <w:spacing w:before="180" w:after="80"/>
       </w:pPr>
@@ -1494,7 +1578,6 @@
           <w:bCs/>
           <w:color w:val="2E3A87"/>
         </w:rPr>
-        <w:lastRenderedPageBreak/>
         <w:t>2.  Objectives</w:t>
       </w:r>
     </w:p>
@@ -1510,7 +1593,7 @@
     </w:p>
     <w:p>
       <w:pPr>
-        <w:pStyle w:val="Heading2"/>
+        <w:pStyle w:val="3"/>
         <w:spacing w:before="240" w:after="120"/>
       </w:pPr>
       <w:r>
@@ -1519,10 +1602,10 @@
     </w:p>
     <w:p>
       <w:pPr>
-        <w:pStyle w:val="ListParagraph"/>
-        <w:numPr>
-          <w:ilvl w:val="0"/>
-          <w:numId w:val="3"/>
+        <w:pStyle w:val="17"/>
+        <w:numPr>
+          <w:ilvl w:val="0"/>
+          <w:numId w:val="2"/>
         </w:numPr>
         <w:spacing w:before="30" w:after="30"/>
       </w:pPr>
@@ -1532,10 +1615,10 @@
     </w:p>
     <w:p>
       <w:pPr>
-        <w:pStyle w:val="ListParagraph"/>
-        <w:numPr>
-          <w:ilvl w:val="0"/>
-          <w:numId w:val="3"/>
+        <w:pStyle w:val="17"/>
+        <w:numPr>
+          <w:ilvl w:val="0"/>
+          <w:numId w:val="2"/>
         </w:numPr>
         <w:spacing w:before="30" w:after="30"/>
       </w:pPr>
@@ -1545,10 +1628,10 @@
     </w:p>
     <w:p>
       <w:pPr>
-        <w:pStyle w:val="ListParagraph"/>
-        <w:numPr>
-          <w:ilvl w:val="0"/>
-          <w:numId w:val="3"/>
+        <w:pStyle w:val="17"/>
+        <w:numPr>
+          <w:ilvl w:val="0"/>
+          <w:numId w:val="2"/>
         </w:numPr>
         <w:spacing w:before="30" w:after="30"/>
       </w:pPr>
@@ -1558,7 +1641,7 @@
     </w:p>
     <w:p>
       <w:pPr>
-        <w:pStyle w:val="Heading2"/>
+        <w:pStyle w:val="3"/>
         <w:spacing w:before="240" w:after="120"/>
       </w:pPr>
       <w:r>
@@ -1567,10 +1650,10 @@
     </w:p>
     <w:p>
       <w:pPr>
-        <w:pStyle w:val="ListParagraph"/>
-        <w:numPr>
-          <w:ilvl w:val="0"/>
-          <w:numId w:val="3"/>
+        <w:pStyle w:val="17"/>
+        <w:numPr>
+          <w:ilvl w:val="0"/>
+          <w:numId w:val="2"/>
         </w:numPr>
         <w:spacing w:before="30" w:after="30"/>
       </w:pPr>
@@ -1580,10 +1663,10 @@
     </w:p>
     <w:p>
       <w:pPr>
-        <w:pStyle w:val="ListParagraph"/>
-        <w:numPr>
-          <w:ilvl w:val="0"/>
-          <w:numId w:val="3"/>
+        <w:pStyle w:val="17"/>
+        <w:numPr>
+          <w:ilvl w:val="0"/>
+          <w:numId w:val="2"/>
         </w:numPr>
         <w:spacing w:before="30" w:after="30"/>
       </w:pPr>
@@ -1593,10 +1676,10 @@
     </w:p>
     <w:p>
       <w:pPr>
-        <w:pStyle w:val="ListParagraph"/>
-        <w:numPr>
-          <w:ilvl w:val="0"/>
-          <w:numId w:val="3"/>
+        <w:pStyle w:val="17"/>
+        <w:numPr>
+          <w:ilvl w:val="0"/>
+          <w:numId w:val="2"/>
         </w:numPr>
         <w:spacing w:before="30" w:after="30"/>
       </w:pPr>
@@ -1606,7 +1689,7 @@
     </w:p>
     <w:p>
       <w:pPr>
-        <w:pStyle w:val="Heading2"/>
+        <w:pStyle w:val="3"/>
         <w:spacing w:before="240" w:after="120"/>
       </w:pPr>
       <w:r>
@@ -1615,10 +1698,10 @@
     </w:p>
     <w:p>
       <w:pPr>
-        <w:pStyle w:val="ListParagraph"/>
-        <w:numPr>
-          <w:ilvl w:val="0"/>
-          <w:numId w:val="3"/>
+        <w:pStyle w:val="17"/>
+        <w:numPr>
+          <w:ilvl w:val="0"/>
+          <w:numId w:val="2"/>
         </w:numPr>
         <w:spacing w:before="30" w:after="30"/>
       </w:pPr>
@@ -1628,10 +1711,10 @@
     </w:p>
     <w:p>
       <w:pPr>
-        <w:pStyle w:val="ListParagraph"/>
-        <w:numPr>
-          <w:ilvl w:val="0"/>
-          <w:numId w:val="3"/>
+        <w:pStyle w:val="17"/>
+        <w:numPr>
+          <w:ilvl w:val="0"/>
+          <w:numId w:val="2"/>
         </w:numPr>
         <w:spacing w:before="30" w:after="30"/>
       </w:pPr>
@@ -1641,10 +1724,10 @@
     </w:p>
     <w:p>
       <w:pPr>
-        <w:pStyle w:val="ListParagraph"/>
-        <w:numPr>
-          <w:ilvl w:val="0"/>
-          <w:numId w:val="3"/>
+        <w:pStyle w:val="17"/>
+        <w:numPr>
+          <w:ilvl w:val="0"/>
+          <w:numId w:val="2"/>
         </w:numPr>
         <w:spacing w:before="30" w:after="30"/>
       </w:pPr>
@@ -1654,10 +1737,10 @@
     </w:p>
     <w:p>
       <w:pPr>
-        <w:pStyle w:val="ListParagraph"/>
-        <w:numPr>
-          <w:ilvl w:val="0"/>
-          <w:numId w:val="3"/>
+        <w:pStyle w:val="17"/>
+        <w:numPr>
+          <w:ilvl w:val="0"/>
+          <w:numId w:val="2"/>
         </w:numPr>
         <w:spacing w:before="30" w:after="30"/>
       </w:pPr>
@@ -1667,7 +1750,7 @@
     </w:p>
     <w:p>
       <w:pPr>
-        <w:pStyle w:val="Heading2"/>
+        <w:pStyle w:val="3"/>
         <w:spacing w:before="240" w:after="120"/>
       </w:pPr>
       <w:r>
@@ -1676,10 +1759,10 @@
     </w:p>
     <w:p>
       <w:pPr>
-        <w:pStyle w:val="ListParagraph"/>
-        <w:numPr>
-          <w:ilvl w:val="0"/>
-          <w:numId w:val="3"/>
+        <w:pStyle w:val="17"/>
+        <w:numPr>
+          <w:ilvl w:val="0"/>
+          <w:numId w:val="2"/>
         </w:numPr>
         <w:spacing w:before="30" w:after="30"/>
       </w:pPr>
@@ -1689,10 +1772,10 @@
     </w:p>
     <w:p>
       <w:pPr>
-        <w:pStyle w:val="ListParagraph"/>
-        <w:numPr>
-          <w:ilvl w:val="0"/>
-          <w:numId w:val="3"/>
+        <w:pStyle w:val="17"/>
+        <w:numPr>
+          <w:ilvl w:val="0"/>
+          <w:numId w:val="2"/>
         </w:numPr>
         <w:spacing w:before="30" w:after="30"/>
       </w:pPr>
@@ -1702,10 +1785,10 @@
     </w:p>
     <w:p>
       <w:pPr>
-        <w:pStyle w:val="ListParagraph"/>
-        <w:numPr>
-          <w:ilvl w:val="0"/>
-          <w:numId w:val="3"/>
+        <w:pStyle w:val="17"/>
+        <w:numPr>
+          <w:ilvl w:val="0"/>
+          <w:numId w:val="2"/>
         </w:numPr>
         <w:spacing w:before="30" w:after="30"/>
       </w:pPr>
@@ -1715,10 +1798,10 @@
     </w:p>
     <w:p>
       <w:pPr>
-        <w:pStyle w:val="ListParagraph"/>
-        <w:numPr>
-          <w:ilvl w:val="0"/>
-          <w:numId w:val="3"/>
+        <w:pStyle w:val="17"/>
+        <w:numPr>
+          <w:ilvl w:val="0"/>
+          <w:numId w:val="2"/>
         </w:numPr>
         <w:spacing w:before="30" w:after="30"/>
       </w:pPr>
@@ -1728,7 +1811,7 @@
     </w:p>
     <w:p>
       <w:pPr>
-        <w:pStyle w:val="Heading2"/>
+        <w:pStyle w:val="3"/>
         <w:spacing w:before="240" w:after="120"/>
       </w:pPr>
       <w:r>
@@ -1737,10 +1820,10 @@
     </w:p>
     <w:p>
       <w:pPr>
-        <w:pStyle w:val="ListParagraph"/>
-        <w:numPr>
-          <w:ilvl w:val="0"/>
-          <w:numId w:val="3"/>
+        <w:pStyle w:val="17"/>
+        <w:numPr>
+          <w:ilvl w:val="0"/>
+          <w:numId w:val="2"/>
         </w:numPr>
         <w:spacing w:before="30" w:after="30"/>
       </w:pPr>
@@ -1750,10 +1833,10 @@
     </w:p>
     <w:p>
       <w:pPr>
-        <w:pStyle w:val="ListParagraph"/>
-        <w:numPr>
-          <w:ilvl w:val="0"/>
-          <w:numId w:val="3"/>
+        <w:pStyle w:val="17"/>
+        <w:numPr>
+          <w:ilvl w:val="0"/>
+          <w:numId w:val="2"/>
         </w:numPr>
         <w:spacing w:before="30" w:after="30"/>
       </w:pPr>
@@ -1763,10 +1846,10 @@
     </w:p>
     <w:p>
       <w:pPr>
-        <w:pStyle w:val="ListParagraph"/>
-        <w:numPr>
-          <w:ilvl w:val="0"/>
-          <w:numId w:val="3"/>
+        <w:pStyle w:val="17"/>
+        <w:numPr>
+          <w:ilvl w:val="0"/>
+          <w:numId w:val="2"/>
         </w:numPr>
         <w:spacing w:before="30" w:after="30"/>
       </w:pPr>
@@ -1776,10 +1859,10 @@
     </w:p>
     <w:p>
       <w:pPr>
-        <w:pStyle w:val="ListParagraph"/>
-        <w:numPr>
-          <w:ilvl w:val="0"/>
-          <w:numId w:val="3"/>
+        <w:pStyle w:val="17"/>
+        <w:numPr>
+          <w:ilvl w:val="0"/>
+          <w:numId w:val="2"/>
         </w:numPr>
         <w:spacing w:before="30" w:after="30"/>
       </w:pPr>
@@ -1789,7 +1872,7 @@
     </w:p>
     <w:p>
       <w:pPr>
-        <w:pStyle w:val="Heading2"/>
+        <w:pStyle w:val="3"/>
         <w:spacing w:before="240" w:after="120"/>
       </w:pPr>
       <w:r>
@@ -1798,10 +1881,10 @@
     </w:p>
     <w:p>
       <w:pPr>
-        <w:pStyle w:val="ListParagraph"/>
-        <w:numPr>
-          <w:ilvl w:val="0"/>
-          <w:numId w:val="3"/>
+        <w:pStyle w:val="17"/>
+        <w:numPr>
+          <w:ilvl w:val="0"/>
+          <w:numId w:val="2"/>
         </w:numPr>
         <w:spacing w:before="30" w:after="30"/>
       </w:pPr>
@@ -1811,10 +1894,10 @@
     </w:p>
     <w:p>
       <w:pPr>
-        <w:pStyle w:val="ListParagraph"/>
-        <w:numPr>
-          <w:ilvl w:val="0"/>
-          <w:numId w:val="3"/>
+        <w:pStyle w:val="17"/>
+        <w:numPr>
+          <w:ilvl w:val="0"/>
+          <w:numId w:val="2"/>
         </w:numPr>
         <w:spacing w:before="30" w:after="30"/>
       </w:pPr>
@@ -1824,7 +1907,7 @@
     </w:p>
     <w:p>
       <w:pPr>
-        <w:pStyle w:val="Heading2"/>
+        <w:pStyle w:val="3"/>
         <w:spacing w:before="240" w:after="120"/>
       </w:pPr>
       <w:r>
@@ -1833,10 +1916,10 @@
     </w:p>
     <w:p>
       <w:pPr>
-        <w:pStyle w:val="ListParagraph"/>
-        <w:numPr>
-          <w:ilvl w:val="0"/>
-          <w:numId w:val="3"/>
+        <w:pStyle w:val="17"/>
+        <w:numPr>
+          <w:ilvl w:val="0"/>
+          <w:numId w:val="2"/>
         </w:numPr>
         <w:spacing w:before="30" w:after="30"/>
       </w:pPr>
@@ -1846,10 +1929,10 @@
     </w:p>
     <w:p>
       <w:pPr>
-        <w:pStyle w:val="ListParagraph"/>
-        <w:numPr>
-          <w:ilvl w:val="0"/>
-          <w:numId w:val="3"/>
+        <w:pStyle w:val="17"/>
+        <w:numPr>
+          <w:ilvl w:val="0"/>
+          <w:numId w:val="2"/>
         </w:numPr>
         <w:spacing w:before="30" w:after="30"/>
       </w:pPr>
@@ -1859,10 +1942,10 @@
     </w:p>
     <w:p>
       <w:pPr>
-        <w:pStyle w:val="ListParagraph"/>
-        <w:numPr>
-          <w:ilvl w:val="0"/>
-          <w:numId w:val="3"/>
+        <w:pStyle w:val="17"/>
+        <w:numPr>
+          <w:ilvl w:val="0"/>
+          <w:numId w:val="2"/>
         </w:numPr>
         <w:spacing w:before="30" w:after="30"/>
       </w:pPr>
@@ -1872,10 +1955,10 @@
     </w:p>
     <w:p>
       <w:pPr>
-        <w:pStyle w:val="ListParagraph"/>
-        <w:numPr>
-          <w:ilvl w:val="0"/>
-          <w:numId w:val="3"/>
+        <w:pStyle w:val="17"/>
+        <w:numPr>
+          <w:ilvl w:val="0"/>
+          <w:numId w:val="2"/>
         </w:numPr>
         <w:spacing w:before="30" w:after="30"/>
       </w:pPr>
@@ -1885,7 +1968,7 @@
     </w:p>
     <w:p>
       <w:pPr>
-        <w:pStyle w:val="Heading2"/>
+        <w:pStyle w:val="3"/>
         <w:spacing w:before="240" w:after="120"/>
       </w:pPr>
       <w:r>
@@ -1894,10 +1977,10 @@
     </w:p>
     <w:p>
       <w:pPr>
-        <w:pStyle w:val="ListParagraph"/>
-        <w:numPr>
-          <w:ilvl w:val="0"/>
-          <w:numId w:val="3"/>
+        <w:pStyle w:val="17"/>
+        <w:numPr>
+          <w:ilvl w:val="0"/>
+          <w:numId w:val="2"/>
         </w:numPr>
         <w:spacing w:before="30" w:after="30"/>
       </w:pPr>
@@ -1907,24 +1990,23 @@
     </w:p>
     <w:p>
       <w:pPr>
-        <w:pStyle w:val="ListParagraph"/>
-        <w:numPr>
-          <w:ilvl w:val="0"/>
-          <w:numId w:val="3"/>
+        <w:pStyle w:val="17"/>
+        <w:numPr>
+          <w:ilvl w:val="0"/>
+          <w:numId w:val="2"/>
         </w:numPr>
         <w:spacing w:before="30" w:after="30"/>
       </w:pPr>
       <w:r>
-        <w:lastRenderedPageBreak/>
         <w:t>Live activity feed showing last 10 status changes</w:t>
       </w:r>
     </w:p>
     <w:p>
       <w:pPr>
-        <w:pStyle w:val="ListParagraph"/>
-        <w:numPr>
-          <w:ilvl w:val="0"/>
-          <w:numId w:val="3"/>
+        <w:pStyle w:val="17"/>
+        <w:numPr>
+          <w:ilvl w:val="0"/>
+          <w:numId w:val="2"/>
         </w:numPr>
         <w:spacing w:before="30" w:after="30"/>
       </w:pPr>
@@ -1934,10 +2016,10 @@
     </w:p>
     <w:p>
       <w:pPr>
-        <w:pStyle w:val="ListParagraph"/>
-        <w:numPr>
-          <w:ilvl w:val="0"/>
-          <w:numId w:val="3"/>
+        <w:pStyle w:val="17"/>
+        <w:numPr>
+          <w:ilvl w:val="0"/>
+          <w:numId w:val="2"/>
         </w:numPr>
         <w:spacing w:before="30" w:after="30"/>
       </w:pPr>
@@ -1947,10 +2029,10 @@
     </w:p>
     <w:p>
       <w:pPr>
-        <w:pStyle w:val="ListParagraph"/>
-        <w:numPr>
-          <w:ilvl w:val="0"/>
-          <w:numId w:val="3"/>
+        <w:pStyle w:val="17"/>
+        <w:numPr>
+          <w:ilvl w:val="0"/>
+          <w:numId w:val="2"/>
         </w:numPr>
         <w:spacing w:before="30" w:after="30"/>
       </w:pPr>
@@ -1960,7 +2042,7 @@
     </w:p>
     <w:p>
       <w:pPr>
-        <w:pStyle w:val="Heading2"/>
+        <w:pStyle w:val="3"/>
         <w:spacing w:before="240" w:after="120"/>
       </w:pPr>
       <w:r>
@@ -1969,10 +2051,10 @@
     </w:p>
     <w:p>
       <w:pPr>
-        <w:pStyle w:val="ListParagraph"/>
-        <w:numPr>
-          <w:ilvl w:val="0"/>
-          <w:numId w:val="3"/>
+        <w:pStyle w:val="17"/>
+        <w:numPr>
+          <w:ilvl w:val="0"/>
+          <w:numId w:val="2"/>
         </w:numPr>
         <w:spacing w:before="30" w:after="30"/>
       </w:pPr>
@@ -1982,10 +2064,10 @@
     </w:p>
     <w:p>
       <w:pPr>
-        <w:pStyle w:val="ListParagraph"/>
-        <w:numPr>
-          <w:ilvl w:val="0"/>
-          <w:numId w:val="3"/>
+        <w:pStyle w:val="17"/>
+        <w:numPr>
+          <w:ilvl w:val="0"/>
+          <w:numId w:val="2"/>
         </w:numPr>
         <w:spacing w:before="30" w:after="30"/>
       </w:pPr>
@@ -1995,10 +2077,10 @@
     </w:p>
     <w:p>
       <w:pPr>
-        <w:pStyle w:val="ListParagraph"/>
-        <w:numPr>
-          <w:ilvl w:val="0"/>
-          <w:numId w:val="3"/>
+        <w:pStyle w:val="17"/>
+        <w:numPr>
+          <w:ilvl w:val="0"/>
+          <w:numId w:val="2"/>
         </w:numPr>
         <w:spacing w:before="30" w:after="30"/>
       </w:pPr>
@@ -2014,7 +2096,7 @@
     <w:p>
       <w:pPr>
         <w:pBdr>
-          <w:bottom w:val="single" w:sz="4" w:space="4" w:color="2E3A87"/>
+          <w:bottom w:val="single" w:color="2E3A87" w:sz="4" w:space="4"/>
         </w:pBdr>
         <w:spacing w:before="180" w:after="80"/>
       </w:pPr>
@@ -2024,7 +2106,6 @@
           <w:bCs/>
           <w:color w:val="2E3A87"/>
         </w:rPr>
-        <w:lastRenderedPageBreak/>
         <w:t>3.  Database Design</w:t>
       </w:r>
     </w:p>
@@ -2040,20 +2121,24 @@
     </w:p>
     <w:tbl>
       <w:tblPr>
+        <w:tblStyle w:val="9"/>
         <w:tblW w:w="9360" w:type="dxa"/>
+        <w:tblInd w:w="0" w:type="dxa"/>
         <w:tblBorders>
-          <w:top w:val="single" w:sz="4" w:space="0" w:color="auto"/>
-          <w:left w:val="single" w:sz="4" w:space="0" w:color="auto"/>
-          <w:bottom w:val="single" w:sz="4" w:space="0" w:color="auto"/>
-          <w:right w:val="single" w:sz="4" w:space="0" w:color="auto"/>
-          <w:insideH w:val="single" w:sz="4" w:space="0" w:color="auto"/>
-          <w:insideV w:val="single" w:sz="4" w:space="0" w:color="auto"/>
+          <w:top w:val="single" w:color="auto" w:sz="4" w:space="0"/>
+          <w:left w:val="single" w:color="auto" w:sz="4" w:space="0"/>
+          <w:bottom w:val="single" w:color="auto" w:sz="4" w:space="0"/>
+          <w:right w:val="single" w:color="auto" w:sz="4" w:space="0"/>
+          <w:insideH w:val="single" w:color="auto" w:sz="4" w:space="0"/>
+          <w:insideV w:val="single" w:color="auto" w:sz="4" w:space="0"/>
         </w:tblBorders>
+        <w:tblLayout w:type="autofit"/>
         <w:tblCellMar>
+          <w:top w:w="0" w:type="dxa"/>
           <w:left w:w="10" w:type="dxa"/>
+          <w:bottom w:w="0" w:type="dxa"/>
           <w:right w:w="10" w:type="dxa"/>
         </w:tblCellMar>
-        <w:tblLook w:val="04A0" w:firstRow="1" w:lastRow="0" w:firstColumn="1" w:lastColumn="0" w:noHBand="0" w:noVBand="1"/>
       </w:tblPr>
       <w:tblGrid>
         <w:gridCol w:w="2000"/>
@@ -2062,19 +2147,29 @@
       </w:tblGrid>
       <w:tr>
         <w:tblPrEx>
+          <w:tblBorders>
+            <w:top w:val="single" w:color="auto" w:sz="4" w:space="0"/>
+            <w:left w:val="single" w:color="auto" w:sz="4" w:space="0"/>
+            <w:bottom w:val="single" w:color="auto" w:sz="4" w:space="0"/>
+            <w:right w:val="single" w:color="auto" w:sz="4" w:space="0"/>
+            <w:insideH w:val="single" w:color="auto" w:sz="4" w:space="0"/>
+            <w:insideV w:val="single" w:color="auto" w:sz="4" w:space="0"/>
+          </w:tblBorders>
           <w:tblCellMar>
             <w:top w:w="0" w:type="dxa"/>
+            <w:left w:w="10" w:type="dxa"/>
             <w:bottom w:w="0" w:type="dxa"/>
+            <w:right w:w="10" w:type="dxa"/>
           </w:tblCellMar>
         </w:tblPrEx>
         <w:tc>
           <w:tcPr>
             <w:tcW w:w="2000" w:type="dxa"/>
             <w:tcBorders>
-              <w:top w:val="single" w:sz="1" w:space="0" w:color="CCCCCC"/>
-              <w:left w:val="single" w:sz="1" w:space="0" w:color="CCCCCC"/>
-              <w:bottom w:val="single" w:sz="1" w:space="0" w:color="CCCCCC"/>
-              <w:right w:val="single" w:sz="1" w:space="0" w:color="CCCCCC"/>
+              <w:top w:val="single" w:color="CCCCCC" w:sz="0" w:space="0"/>
+              <w:left w:val="single" w:color="CCCCCC" w:sz="0" w:space="0"/>
+              <w:bottom w:val="single" w:color="CCCCCC" w:sz="0" w:space="0"/>
+              <w:right w:val="single" w:color="CCCCCC" w:sz="0" w:space="0"/>
             </w:tcBorders>
             <w:shd w:val="clear" w:color="auto" w:fill="E8EAF6"/>
             <w:tcMar>
@@ -2100,10 +2195,10 @@
           <w:tcPr>
             <w:tcW w:w="3000" w:type="dxa"/>
             <w:tcBorders>
-              <w:top w:val="single" w:sz="1" w:space="0" w:color="CCCCCC"/>
-              <w:left w:val="single" w:sz="1" w:space="0" w:color="CCCCCC"/>
-              <w:bottom w:val="single" w:sz="1" w:space="0" w:color="CCCCCC"/>
-              <w:right w:val="single" w:sz="1" w:space="0" w:color="CCCCCC"/>
+              <w:top w:val="single" w:color="CCCCCC" w:sz="0" w:space="0"/>
+              <w:left w:val="single" w:color="CCCCCC" w:sz="0" w:space="0"/>
+              <w:bottom w:val="single" w:color="CCCCCC" w:sz="0" w:space="0"/>
+              <w:right w:val="single" w:color="CCCCCC" w:sz="0" w:space="0"/>
             </w:tcBorders>
             <w:shd w:val="clear" w:color="auto" w:fill="E8EAF6"/>
             <w:tcMar>
@@ -2129,10 +2224,10 @@
           <w:tcPr>
             <w:tcW w:w="4360" w:type="dxa"/>
             <w:tcBorders>
-              <w:top w:val="single" w:sz="1" w:space="0" w:color="CCCCCC"/>
-              <w:left w:val="single" w:sz="1" w:space="0" w:color="CCCCCC"/>
-              <w:bottom w:val="single" w:sz="1" w:space="0" w:color="CCCCCC"/>
-              <w:right w:val="single" w:sz="1" w:space="0" w:color="CCCCCC"/>
+              <w:top w:val="single" w:color="CCCCCC" w:sz="0" w:space="0"/>
+              <w:left w:val="single" w:color="CCCCCC" w:sz="0" w:space="0"/>
+              <w:bottom w:val="single" w:color="CCCCCC" w:sz="0" w:space="0"/>
+              <w:right w:val="single" w:color="CCCCCC" w:sz="0" w:space="0"/>
             </w:tcBorders>
             <w:shd w:val="clear" w:color="auto" w:fill="E8EAF6"/>
             <w:tcMar>
@@ -2157,19 +2252,29 @@
       </w:tr>
       <w:tr>
         <w:tblPrEx>
+          <w:tblBorders>
+            <w:top w:val="single" w:color="auto" w:sz="4" w:space="0"/>
+            <w:left w:val="single" w:color="auto" w:sz="4" w:space="0"/>
+            <w:bottom w:val="single" w:color="auto" w:sz="4" w:space="0"/>
+            <w:right w:val="single" w:color="auto" w:sz="4" w:space="0"/>
+            <w:insideH w:val="single" w:color="auto" w:sz="4" w:space="0"/>
+            <w:insideV w:val="single" w:color="auto" w:sz="4" w:space="0"/>
+          </w:tblBorders>
           <w:tblCellMar>
             <w:top w:w="0" w:type="dxa"/>
+            <w:left w:w="10" w:type="dxa"/>
             <w:bottom w:w="0" w:type="dxa"/>
+            <w:right w:w="10" w:type="dxa"/>
           </w:tblCellMar>
         </w:tblPrEx>
         <w:tc>
           <w:tcPr>
             <w:tcW w:w="2000" w:type="dxa"/>
             <w:tcBorders>
-              <w:top w:val="single" w:sz="1" w:space="0" w:color="CCCCCC"/>
-              <w:left w:val="single" w:sz="1" w:space="0" w:color="CCCCCC"/>
-              <w:bottom w:val="single" w:sz="1" w:space="0" w:color="CCCCCC"/>
-              <w:right w:val="single" w:sz="1" w:space="0" w:color="CCCCCC"/>
+              <w:top w:val="single" w:color="CCCCCC" w:sz="0" w:space="0"/>
+              <w:left w:val="single" w:color="CCCCCC" w:sz="0" w:space="0"/>
+              <w:bottom w:val="single" w:color="CCCCCC" w:sz="0" w:space="0"/>
+              <w:right w:val="single" w:color="CCCCCC" w:sz="0" w:space="0"/>
             </w:tcBorders>
             <w:tcMar>
               <w:top w:w="80" w:type="dxa"/>
@@ -2195,10 +2300,10 @@
           <w:tcPr>
             <w:tcW w:w="3000" w:type="dxa"/>
             <w:tcBorders>
-              <w:top w:val="single" w:sz="1" w:space="0" w:color="CCCCCC"/>
-              <w:left w:val="single" w:sz="1" w:space="0" w:color="CCCCCC"/>
-              <w:bottom w:val="single" w:sz="1" w:space="0" w:color="CCCCCC"/>
-              <w:right w:val="single" w:sz="1" w:space="0" w:color="CCCCCC"/>
+              <w:top w:val="single" w:color="CCCCCC" w:sz="0" w:space="0"/>
+              <w:left w:val="single" w:color="CCCCCC" w:sz="0" w:space="0"/>
+              <w:bottom w:val="single" w:color="CCCCCC" w:sz="0" w:space="0"/>
+              <w:right w:val="single" w:color="CCCCCC" w:sz="0" w:space="0"/>
             </w:tcBorders>
             <w:tcMar>
               <w:top w:w="80" w:type="dxa"/>
@@ -2221,10 +2326,10 @@
           <w:tcPr>
             <w:tcW w:w="4360" w:type="dxa"/>
             <w:tcBorders>
-              <w:top w:val="single" w:sz="1" w:space="0" w:color="CCCCCC"/>
-              <w:left w:val="single" w:sz="1" w:space="0" w:color="CCCCCC"/>
-              <w:bottom w:val="single" w:sz="1" w:space="0" w:color="CCCCCC"/>
-              <w:right w:val="single" w:sz="1" w:space="0" w:color="CCCCCC"/>
+              <w:top w:val="single" w:color="CCCCCC" w:sz="0" w:space="0"/>
+              <w:left w:val="single" w:color="CCCCCC" w:sz="0" w:space="0"/>
+              <w:bottom w:val="single" w:color="CCCCCC" w:sz="0" w:space="0"/>
+              <w:right w:val="single" w:color="CCCCCC" w:sz="0" w:space="0"/>
             </w:tcBorders>
             <w:tcMar>
               <w:top w:w="80" w:type="dxa"/>
@@ -2246,19 +2351,29 @@
       </w:tr>
       <w:tr>
         <w:tblPrEx>
+          <w:tblBorders>
+            <w:top w:val="single" w:color="auto" w:sz="4" w:space="0"/>
+            <w:left w:val="single" w:color="auto" w:sz="4" w:space="0"/>
+            <w:bottom w:val="single" w:color="auto" w:sz="4" w:space="0"/>
+            <w:right w:val="single" w:color="auto" w:sz="4" w:space="0"/>
+            <w:insideH w:val="single" w:color="auto" w:sz="4" w:space="0"/>
+            <w:insideV w:val="single" w:color="auto" w:sz="4" w:space="0"/>
+          </w:tblBorders>
           <w:tblCellMar>
             <w:top w:w="0" w:type="dxa"/>
+            <w:left w:w="10" w:type="dxa"/>
             <w:bottom w:w="0" w:type="dxa"/>
+            <w:right w:w="10" w:type="dxa"/>
           </w:tblCellMar>
         </w:tblPrEx>
         <w:tc>
           <w:tcPr>
             <w:tcW w:w="2000" w:type="dxa"/>
             <w:tcBorders>
-              <w:top w:val="single" w:sz="1" w:space="0" w:color="CCCCCC"/>
-              <w:left w:val="single" w:sz="1" w:space="0" w:color="CCCCCC"/>
-              <w:bottom w:val="single" w:sz="1" w:space="0" w:color="CCCCCC"/>
-              <w:right w:val="single" w:sz="1" w:space="0" w:color="CCCCCC"/>
+              <w:top w:val="single" w:color="CCCCCC" w:sz="0" w:space="0"/>
+              <w:left w:val="single" w:color="CCCCCC" w:sz="0" w:space="0"/>
+              <w:bottom w:val="single" w:color="CCCCCC" w:sz="0" w:space="0"/>
+              <w:right w:val="single" w:color="CCCCCC" w:sz="0" w:space="0"/>
             </w:tcBorders>
             <w:tcMar>
               <w:top w:w="80" w:type="dxa"/>
@@ -2284,10 +2399,10 @@
           <w:tcPr>
             <w:tcW w:w="3000" w:type="dxa"/>
             <w:tcBorders>
-              <w:top w:val="single" w:sz="1" w:space="0" w:color="CCCCCC"/>
-              <w:left w:val="single" w:sz="1" w:space="0" w:color="CCCCCC"/>
-              <w:bottom w:val="single" w:sz="1" w:space="0" w:color="CCCCCC"/>
-              <w:right w:val="single" w:sz="1" w:space="0" w:color="CCCCCC"/>
+              <w:top w:val="single" w:color="CCCCCC" w:sz="0" w:space="0"/>
+              <w:left w:val="single" w:color="CCCCCC" w:sz="0" w:space="0"/>
+              <w:bottom w:val="single" w:color="CCCCCC" w:sz="0" w:space="0"/>
+              <w:right w:val="single" w:color="CCCCCC" w:sz="0" w:space="0"/>
             </w:tcBorders>
             <w:tcMar>
               <w:top w:w="80" w:type="dxa"/>
@@ -2310,10 +2425,10 @@
           <w:tcPr>
             <w:tcW w:w="4360" w:type="dxa"/>
             <w:tcBorders>
-              <w:top w:val="single" w:sz="1" w:space="0" w:color="CCCCCC"/>
-              <w:left w:val="single" w:sz="1" w:space="0" w:color="CCCCCC"/>
-              <w:bottom w:val="single" w:sz="1" w:space="0" w:color="CCCCCC"/>
-              <w:right w:val="single" w:sz="1" w:space="0" w:color="CCCCCC"/>
+              <w:top w:val="single" w:color="CCCCCC" w:sz="0" w:space="0"/>
+              <w:left w:val="single" w:color="CCCCCC" w:sz="0" w:space="0"/>
+              <w:bottom w:val="single" w:color="CCCCCC" w:sz="0" w:space="0"/>
+              <w:right w:val="single" w:color="CCCCCC" w:sz="0" w:space="0"/>
             </w:tcBorders>
             <w:tcMar>
               <w:top w:w="80" w:type="dxa"/>
@@ -2335,19 +2450,29 @@
       </w:tr>
       <w:tr>
         <w:tblPrEx>
+          <w:tblBorders>
+            <w:top w:val="single" w:color="auto" w:sz="4" w:space="0"/>
+            <w:left w:val="single" w:color="auto" w:sz="4" w:space="0"/>
+            <w:bottom w:val="single" w:color="auto" w:sz="4" w:space="0"/>
+            <w:right w:val="single" w:color="auto" w:sz="4" w:space="0"/>
+            <w:insideH w:val="single" w:color="auto" w:sz="4" w:space="0"/>
+            <w:insideV w:val="single" w:color="auto" w:sz="4" w:space="0"/>
+          </w:tblBorders>
           <w:tblCellMar>
             <w:top w:w="0" w:type="dxa"/>
+            <w:left w:w="10" w:type="dxa"/>
             <w:bottom w:w="0" w:type="dxa"/>
+            <w:right w:w="10" w:type="dxa"/>
           </w:tblCellMar>
         </w:tblPrEx>
         <w:tc>
           <w:tcPr>
             <w:tcW w:w="2000" w:type="dxa"/>
             <w:tcBorders>
-              <w:top w:val="single" w:sz="1" w:space="0" w:color="CCCCCC"/>
-              <w:left w:val="single" w:sz="1" w:space="0" w:color="CCCCCC"/>
-              <w:bottom w:val="single" w:sz="1" w:space="0" w:color="CCCCCC"/>
-              <w:right w:val="single" w:sz="1" w:space="0" w:color="CCCCCC"/>
+              <w:top w:val="single" w:color="CCCCCC" w:sz="0" w:space="0"/>
+              <w:left w:val="single" w:color="CCCCCC" w:sz="0" w:space="0"/>
+              <w:bottom w:val="single" w:color="CCCCCC" w:sz="0" w:space="0"/>
+              <w:right w:val="single" w:color="CCCCCC" w:sz="0" w:space="0"/>
             </w:tcBorders>
             <w:tcMar>
               <w:top w:w="80" w:type="dxa"/>
@@ -2373,10 +2498,10 @@
           <w:tcPr>
             <w:tcW w:w="3000" w:type="dxa"/>
             <w:tcBorders>
-              <w:top w:val="single" w:sz="1" w:space="0" w:color="CCCCCC"/>
-              <w:left w:val="single" w:sz="1" w:space="0" w:color="CCCCCC"/>
-              <w:bottom w:val="single" w:sz="1" w:space="0" w:color="CCCCCC"/>
-              <w:right w:val="single" w:sz="1" w:space="0" w:color="CCCCCC"/>
+              <w:top w:val="single" w:color="CCCCCC" w:sz="0" w:space="0"/>
+              <w:left w:val="single" w:color="CCCCCC" w:sz="0" w:space="0"/>
+              <w:bottom w:val="single" w:color="CCCCCC" w:sz="0" w:space="0"/>
+              <w:right w:val="single" w:color="CCCCCC" w:sz="0" w:space="0"/>
             </w:tcBorders>
             <w:tcMar>
               <w:top w:w="80" w:type="dxa"/>
@@ -2399,10 +2524,10 @@
           <w:tcPr>
             <w:tcW w:w="4360" w:type="dxa"/>
             <w:tcBorders>
-              <w:top w:val="single" w:sz="1" w:space="0" w:color="CCCCCC"/>
-              <w:left w:val="single" w:sz="1" w:space="0" w:color="CCCCCC"/>
-              <w:bottom w:val="single" w:sz="1" w:space="0" w:color="CCCCCC"/>
-              <w:right w:val="single" w:sz="1" w:space="0" w:color="CCCCCC"/>
+              <w:top w:val="single" w:color="CCCCCC" w:sz="0" w:space="0"/>
+              <w:left w:val="single" w:color="CCCCCC" w:sz="0" w:space="0"/>
+              <w:bottom w:val="single" w:color="CCCCCC" w:sz="0" w:space="0"/>
+              <w:right w:val="single" w:color="CCCCCC" w:sz="0" w:space="0"/>
             </w:tcBorders>
             <w:tcMar>
               <w:top w:w="80" w:type="dxa"/>
@@ -2424,19 +2549,29 @@
       </w:tr>
       <w:tr>
         <w:tblPrEx>
+          <w:tblBorders>
+            <w:top w:val="single" w:color="auto" w:sz="4" w:space="0"/>
+            <w:left w:val="single" w:color="auto" w:sz="4" w:space="0"/>
+            <w:bottom w:val="single" w:color="auto" w:sz="4" w:space="0"/>
+            <w:right w:val="single" w:color="auto" w:sz="4" w:space="0"/>
+            <w:insideH w:val="single" w:color="auto" w:sz="4" w:space="0"/>
+            <w:insideV w:val="single" w:color="auto" w:sz="4" w:space="0"/>
+          </w:tblBorders>
           <w:tblCellMar>
             <w:top w:w="0" w:type="dxa"/>
+            <w:left w:w="10" w:type="dxa"/>
             <w:bottom w:w="0" w:type="dxa"/>
+            <w:right w:w="10" w:type="dxa"/>
           </w:tblCellMar>
         </w:tblPrEx>
         <w:tc>
           <w:tcPr>
             <w:tcW w:w="2000" w:type="dxa"/>
             <w:tcBorders>
-              <w:top w:val="single" w:sz="1" w:space="0" w:color="CCCCCC"/>
-              <w:left w:val="single" w:sz="1" w:space="0" w:color="CCCCCC"/>
-              <w:bottom w:val="single" w:sz="1" w:space="0" w:color="CCCCCC"/>
-              <w:right w:val="single" w:sz="1" w:space="0" w:color="CCCCCC"/>
+              <w:top w:val="single" w:color="CCCCCC" w:sz="0" w:space="0"/>
+              <w:left w:val="single" w:color="CCCCCC" w:sz="0" w:space="0"/>
+              <w:bottom w:val="single" w:color="CCCCCC" w:sz="0" w:space="0"/>
+              <w:right w:val="single" w:color="CCCCCC" w:sz="0" w:space="0"/>
             </w:tcBorders>
             <w:tcMar>
               <w:top w:w="80" w:type="dxa"/>
@@ -2462,10 +2597,10 @@
           <w:tcPr>
             <w:tcW w:w="3000" w:type="dxa"/>
             <w:tcBorders>
-              <w:top w:val="single" w:sz="1" w:space="0" w:color="CCCCCC"/>
-              <w:left w:val="single" w:sz="1" w:space="0" w:color="CCCCCC"/>
-              <w:bottom w:val="single" w:sz="1" w:space="0" w:color="CCCCCC"/>
-              <w:right w:val="single" w:sz="1" w:space="0" w:color="CCCCCC"/>
+              <w:top w:val="single" w:color="CCCCCC" w:sz="0" w:space="0"/>
+              <w:left w:val="single" w:color="CCCCCC" w:sz="0" w:space="0"/>
+              <w:bottom w:val="single" w:color="CCCCCC" w:sz="0" w:space="0"/>
+              <w:right w:val="single" w:color="CCCCCC" w:sz="0" w:space="0"/>
             </w:tcBorders>
             <w:tcMar>
               <w:top w:w="80" w:type="dxa"/>
@@ -2488,10 +2623,10 @@
           <w:tcPr>
             <w:tcW w:w="4360" w:type="dxa"/>
             <w:tcBorders>
-              <w:top w:val="single" w:sz="1" w:space="0" w:color="CCCCCC"/>
-              <w:left w:val="single" w:sz="1" w:space="0" w:color="CCCCCC"/>
-              <w:bottom w:val="single" w:sz="1" w:space="0" w:color="CCCCCC"/>
-              <w:right w:val="single" w:sz="1" w:space="0" w:color="CCCCCC"/>
+              <w:top w:val="single" w:color="CCCCCC" w:sz="0" w:space="0"/>
+              <w:left w:val="single" w:color="CCCCCC" w:sz="0" w:space="0"/>
+              <w:bottom w:val="single" w:color="CCCCCC" w:sz="0" w:space="0"/>
+              <w:right w:val="single" w:color="CCCCCC" w:sz="0" w:space="0"/>
             </w:tcBorders>
             <w:tcMar>
               <w:top w:w="80" w:type="dxa"/>
@@ -2513,19 +2648,29 @@
       </w:tr>
       <w:tr>
         <w:tblPrEx>
+          <w:tblBorders>
+            <w:top w:val="single" w:color="auto" w:sz="4" w:space="0"/>
+            <w:left w:val="single" w:color="auto" w:sz="4" w:space="0"/>
+            <w:bottom w:val="single" w:color="auto" w:sz="4" w:space="0"/>
+            <w:right w:val="single" w:color="auto" w:sz="4" w:space="0"/>
+            <w:insideH w:val="single" w:color="auto" w:sz="4" w:space="0"/>
+            <w:insideV w:val="single" w:color="auto" w:sz="4" w:space="0"/>
+          </w:tblBorders>
           <w:tblCellMar>
             <w:top w:w="0" w:type="dxa"/>
+            <w:left w:w="10" w:type="dxa"/>
             <w:bottom w:w="0" w:type="dxa"/>
+            <w:right w:w="10" w:type="dxa"/>
           </w:tblCellMar>
         </w:tblPrEx>
         <w:tc>
           <w:tcPr>
             <w:tcW w:w="2000" w:type="dxa"/>
             <w:tcBorders>
-              <w:top w:val="single" w:sz="1" w:space="0" w:color="CCCCCC"/>
-              <w:left w:val="single" w:sz="1" w:space="0" w:color="CCCCCC"/>
-              <w:bottom w:val="single" w:sz="1" w:space="0" w:color="CCCCCC"/>
-              <w:right w:val="single" w:sz="1" w:space="0" w:color="CCCCCC"/>
+              <w:top w:val="single" w:color="CCCCCC" w:sz="0" w:space="0"/>
+              <w:left w:val="single" w:color="CCCCCC" w:sz="0" w:space="0"/>
+              <w:bottom w:val="single" w:color="CCCCCC" w:sz="0" w:space="0"/>
+              <w:right w:val="single" w:color="CCCCCC" w:sz="0" w:space="0"/>
             </w:tcBorders>
             <w:tcMar>
               <w:top w:w="80" w:type="dxa"/>
@@ -2551,10 +2696,10 @@
           <w:tcPr>
             <w:tcW w:w="3000" w:type="dxa"/>
             <w:tcBorders>
-              <w:top w:val="single" w:sz="1" w:space="0" w:color="CCCCCC"/>
-              <w:left w:val="single" w:sz="1" w:space="0" w:color="CCCCCC"/>
-              <w:bottom w:val="single" w:sz="1" w:space="0" w:color="CCCCCC"/>
-              <w:right w:val="single" w:sz="1" w:space="0" w:color="CCCCCC"/>
+              <w:top w:val="single" w:color="CCCCCC" w:sz="0" w:space="0"/>
+              <w:left w:val="single" w:color="CCCCCC" w:sz="0" w:space="0"/>
+              <w:bottom w:val="single" w:color="CCCCCC" w:sz="0" w:space="0"/>
+              <w:right w:val="single" w:color="CCCCCC" w:sz="0" w:space="0"/>
             </w:tcBorders>
             <w:tcMar>
               <w:top w:w="80" w:type="dxa"/>
@@ -2577,10 +2722,10 @@
           <w:tcPr>
             <w:tcW w:w="4360" w:type="dxa"/>
             <w:tcBorders>
-              <w:top w:val="single" w:sz="1" w:space="0" w:color="CCCCCC"/>
-              <w:left w:val="single" w:sz="1" w:space="0" w:color="CCCCCC"/>
-              <w:bottom w:val="single" w:sz="1" w:space="0" w:color="CCCCCC"/>
-              <w:right w:val="single" w:sz="1" w:space="0" w:color="CCCCCC"/>
+              <w:top w:val="single" w:color="CCCCCC" w:sz="0" w:space="0"/>
+              <w:left w:val="single" w:color="CCCCCC" w:sz="0" w:space="0"/>
+              <w:bottom w:val="single" w:color="CCCCCC" w:sz="0" w:space="0"/>
+              <w:right w:val="single" w:color="CCCCCC" w:sz="0" w:space="0"/>
             </w:tcBorders>
             <w:tcMar>
               <w:top w:w="80" w:type="dxa"/>
@@ -2602,19 +2747,29 @@
       </w:tr>
       <w:tr>
         <w:tblPrEx>
+          <w:tblBorders>
+            <w:top w:val="single" w:color="auto" w:sz="4" w:space="0"/>
+            <w:left w:val="single" w:color="auto" w:sz="4" w:space="0"/>
+            <w:bottom w:val="single" w:color="auto" w:sz="4" w:space="0"/>
+            <w:right w:val="single" w:color="auto" w:sz="4" w:space="0"/>
+            <w:insideH w:val="single" w:color="auto" w:sz="4" w:space="0"/>
+            <w:insideV w:val="single" w:color="auto" w:sz="4" w:space="0"/>
+          </w:tblBorders>
           <w:tblCellMar>
             <w:top w:w="0" w:type="dxa"/>
+            <w:left w:w="10" w:type="dxa"/>
             <w:bottom w:w="0" w:type="dxa"/>
+            <w:right w:w="10" w:type="dxa"/>
           </w:tblCellMar>
         </w:tblPrEx>
         <w:tc>
           <w:tcPr>
             <w:tcW w:w="2000" w:type="dxa"/>
             <w:tcBorders>
-              <w:top w:val="single" w:sz="1" w:space="0" w:color="CCCCCC"/>
-              <w:left w:val="single" w:sz="1" w:space="0" w:color="CCCCCC"/>
-              <w:bottom w:val="single" w:sz="1" w:space="0" w:color="CCCCCC"/>
-              <w:right w:val="single" w:sz="1" w:space="0" w:color="CCCCCC"/>
+              <w:top w:val="single" w:color="CCCCCC" w:sz="0" w:space="0"/>
+              <w:left w:val="single" w:color="CCCCCC" w:sz="0" w:space="0"/>
+              <w:bottom w:val="single" w:color="CCCCCC" w:sz="0" w:space="0"/>
+              <w:right w:val="single" w:color="CCCCCC" w:sz="0" w:space="0"/>
             </w:tcBorders>
             <w:tcMar>
               <w:top w:w="80" w:type="dxa"/>
@@ -2640,10 +2795,10 @@
           <w:tcPr>
             <w:tcW w:w="3000" w:type="dxa"/>
             <w:tcBorders>
-              <w:top w:val="single" w:sz="1" w:space="0" w:color="CCCCCC"/>
-              <w:left w:val="single" w:sz="1" w:space="0" w:color="CCCCCC"/>
-              <w:bottom w:val="single" w:sz="1" w:space="0" w:color="CCCCCC"/>
-              <w:right w:val="single" w:sz="1" w:space="0" w:color="CCCCCC"/>
+              <w:top w:val="single" w:color="CCCCCC" w:sz="0" w:space="0"/>
+              <w:left w:val="single" w:color="CCCCCC" w:sz="0" w:space="0"/>
+              <w:bottom w:val="single" w:color="CCCCCC" w:sz="0" w:space="0"/>
+              <w:right w:val="single" w:color="CCCCCC" w:sz="0" w:space="0"/>
             </w:tcBorders>
             <w:tcMar>
               <w:top w:w="80" w:type="dxa"/>
@@ -2666,10 +2821,10 @@
           <w:tcPr>
             <w:tcW w:w="4360" w:type="dxa"/>
             <w:tcBorders>
-              <w:top w:val="single" w:sz="1" w:space="0" w:color="CCCCCC"/>
-              <w:left w:val="single" w:sz="1" w:space="0" w:color="CCCCCC"/>
-              <w:bottom w:val="single" w:sz="1" w:space="0" w:color="CCCCCC"/>
-              <w:right w:val="single" w:sz="1" w:space="0" w:color="CCCCCC"/>
+              <w:top w:val="single" w:color="CCCCCC" w:sz="0" w:space="0"/>
+              <w:left w:val="single" w:color="CCCCCC" w:sz="0" w:space="0"/>
+              <w:bottom w:val="single" w:color="CCCCCC" w:sz="0" w:space="0"/>
+              <w:right w:val="single" w:color="CCCCCC" w:sz="0" w:space="0"/>
             </w:tcBorders>
             <w:tcMar>
               <w:top w:w="80" w:type="dxa"/>
@@ -2697,7 +2852,7 @@
     </w:p>
     <w:p>
       <w:pPr>
-        <w:pStyle w:val="Heading2"/>
+        <w:pStyle w:val="3"/>
         <w:spacing w:before="240" w:after="120"/>
       </w:pPr>
       <w:r>
@@ -2706,10 +2861,10 @@
     </w:p>
     <w:p>
       <w:pPr>
-        <w:pStyle w:val="ListParagraph"/>
-        <w:numPr>
-          <w:ilvl w:val="0"/>
-          <w:numId w:val="2"/>
+        <w:pStyle w:val="17"/>
+        <w:numPr>
+          <w:ilvl w:val="0"/>
+          <w:numId w:val="1"/>
         </w:numPr>
         <w:spacing w:before="40" w:after="40"/>
       </w:pPr>
@@ -2719,10 +2874,10 @@
     </w:p>
     <w:p>
       <w:pPr>
-        <w:pStyle w:val="ListParagraph"/>
-        <w:numPr>
-          <w:ilvl w:val="0"/>
-          <w:numId w:val="2"/>
+        <w:pStyle w:val="17"/>
+        <w:numPr>
+          <w:ilvl w:val="0"/>
+          <w:numId w:val="1"/>
         </w:numPr>
         <w:spacing w:before="40" w:after="40"/>
       </w:pPr>
@@ -2732,10 +2887,10 @@
     </w:p>
     <w:p>
       <w:pPr>
-        <w:pStyle w:val="ListParagraph"/>
-        <w:numPr>
-          <w:ilvl w:val="0"/>
-          <w:numId w:val="2"/>
+        <w:pStyle w:val="17"/>
+        <w:numPr>
+          <w:ilvl w:val="0"/>
+          <w:numId w:val="1"/>
         </w:numPr>
         <w:spacing w:before="40" w:after="40"/>
       </w:pPr>
@@ -2745,10 +2900,10 @@
     </w:p>
     <w:p>
       <w:pPr>
-        <w:pStyle w:val="ListParagraph"/>
-        <w:numPr>
-          <w:ilvl w:val="0"/>
-          <w:numId w:val="2"/>
+        <w:pStyle w:val="17"/>
+        <w:numPr>
+          <w:ilvl w:val="0"/>
+          <w:numId w:val="1"/>
         </w:numPr>
         <w:spacing w:before="40" w:after="40"/>
       </w:pPr>
@@ -2758,10 +2913,10 @@
     </w:p>
     <w:p>
       <w:pPr>
-        <w:pStyle w:val="ListParagraph"/>
-        <w:numPr>
-          <w:ilvl w:val="0"/>
-          <w:numId w:val="2"/>
+        <w:pStyle w:val="17"/>
+        <w:numPr>
+          <w:ilvl w:val="0"/>
+          <w:numId w:val="1"/>
         </w:numPr>
         <w:spacing w:before="40" w:after="40"/>
       </w:pPr>
@@ -2771,10 +2926,10 @@
     </w:p>
     <w:p>
       <w:pPr>
-        <w:pStyle w:val="ListParagraph"/>
-        <w:numPr>
-          <w:ilvl w:val="0"/>
-          <w:numId w:val="2"/>
+        <w:pStyle w:val="17"/>
+        <w:numPr>
+          <w:ilvl w:val="0"/>
+          <w:numId w:val="1"/>
         </w:numPr>
         <w:spacing w:before="40" w:after="40"/>
       </w:pPr>
@@ -2784,10 +2939,10 @@
     </w:p>
     <w:p>
       <w:pPr>
-        <w:pStyle w:val="ListParagraph"/>
-        <w:numPr>
-          <w:ilvl w:val="0"/>
-          <w:numId w:val="2"/>
+        <w:pStyle w:val="17"/>
+        <w:numPr>
+          <w:ilvl w:val="0"/>
+          <w:numId w:val="1"/>
         </w:numPr>
         <w:spacing w:before="40" w:after="40"/>
       </w:pPr>
@@ -2803,7 +2958,7 @@
     <w:p>
       <w:pPr>
         <w:pBdr>
-          <w:bottom w:val="single" w:sz="4" w:space="4" w:color="2E3A87"/>
+          <w:bottom w:val="single" w:color="2E3A87" w:sz="4" w:space="4"/>
         </w:pBdr>
         <w:spacing w:before="180" w:after="80"/>
       </w:pPr>
@@ -2813,7 +2968,6 @@
           <w:bCs/>
           <w:color w:val="2E3A87"/>
         </w:rPr>
-        <w:lastRenderedPageBreak/>
         <w:t>4.  System Features &amp; Pages</w:t>
       </w:r>
     </w:p>
@@ -2829,20 +2983,24 @@
     </w:p>
     <w:tbl>
       <w:tblPr>
+        <w:tblStyle w:val="9"/>
         <w:tblW w:w="9360" w:type="dxa"/>
+        <w:tblInd w:w="0" w:type="dxa"/>
         <w:tblBorders>
-          <w:top w:val="single" w:sz="4" w:space="0" w:color="auto"/>
-          <w:left w:val="single" w:sz="4" w:space="0" w:color="auto"/>
-          <w:bottom w:val="single" w:sz="4" w:space="0" w:color="auto"/>
-          <w:right w:val="single" w:sz="4" w:space="0" w:color="auto"/>
-          <w:insideH w:val="single" w:sz="4" w:space="0" w:color="auto"/>
-          <w:insideV w:val="single" w:sz="4" w:space="0" w:color="auto"/>
+          <w:top w:val="single" w:color="auto" w:sz="4" w:space="0"/>
+          <w:left w:val="single" w:color="auto" w:sz="4" w:space="0"/>
+          <w:bottom w:val="single" w:color="auto" w:sz="4" w:space="0"/>
+          <w:right w:val="single" w:color="auto" w:sz="4" w:space="0"/>
+          <w:insideH w:val="single" w:color="auto" w:sz="4" w:space="0"/>
+          <w:insideV w:val="single" w:color="auto" w:sz="4" w:space="0"/>
         </w:tblBorders>
+        <w:tblLayout w:type="autofit"/>
         <w:tblCellMar>
+          <w:top w:w="0" w:type="dxa"/>
           <w:left w:w="10" w:type="dxa"/>
+          <w:bottom w:w="0" w:type="dxa"/>
           <w:right w:w="10" w:type="dxa"/>
         </w:tblCellMar>
-        <w:tblLook w:val="04A0" w:firstRow="1" w:lastRow="0" w:firstColumn="1" w:lastColumn="0" w:noHBand="0" w:noVBand="1"/>
       </w:tblPr>
       <w:tblGrid>
         <w:gridCol w:w="2400"/>
@@ -2851,19 +3009,29 @@
       </w:tblGrid>
       <w:tr>
         <w:tblPrEx>
+          <w:tblBorders>
+            <w:top w:val="single" w:color="auto" w:sz="4" w:space="0"/>
+            <w:left w:val="single" w:color="auto" w:sz="4" w:space="0"/>
+            <w:bottom w:val="single" w:color="auto" w:sz="4" w:space="0"/>
+            <w:right w:val="single" w:color="auto" w:sz="4" w:space="0"/>
+            <w:insideH w:val="single" w:color="auto" w:sz="4" w:space="0"/>
+            <w:insideV w:val="single" w:color="auto" w:sz="4" w:space="0"/>
+          </w:tblBorders>
           <w:tblCellMar>
             <w:top w:w="0" w:type="dxa"/>
+            <w:left w:w="10" w:type="dxa"/>
             <w:bottom w:w="0" w:type="dxa"/>
+            <w:right w:w="10" w:type="dxa"/>
           </w:tblCellMar>
         </w:tblPrEx>
         <w:tc>
           <w:tcPr>
             <w:tcW w:w="2400" w:type="dxa"/>
             <w:tcBorders>
-              <w:top w:val="single" w:sz="1" w:space="0" w:color="CCCCCC"/>
-              <w:left w:val="single" w:sz="1" w:space="0" w:color="CCCCCC"/>
-              <w:bottom w:val="single" w:sz="1" w:space="0" w:color="CCCCCC"/>
-              <w:right w:val="single" w:sz="1" w:space="0" w:color="CCCCCC"/>
+              <w:top w:val="single" w:color="CCCCCC" w:sz="0" w:space="0"/>
+              <w:left w:val="single" w:color="CCCCCC" w:sz="0" w:space="0"/>
+              <w:bottom w:val="single" w:color="CCCCCC" w:sz="0" w:space="0"/>
+              <w:right w:val="single" w:color="CCCCCC" w:sz="0" w:space="0"/>
             </w:tcBorders>
             <w:shd w:val="clear" w:color="auto" w:fill="E8EAF6"/>
             <w:tcMar>
@@ -2889,10 +3057,10 @@
           <w:tcPr>
             <w:tcW w:w="2160" w:type="dxa"/>
             <w:tcBorders>
-              <w:top w:val="single" w:sz="1" w:space="0" w:color="CCCCCC"/>
-              <w:left w:val="single" w:sz="1" w:space="0" w:color="CCCCCC"/>
-              <w:bottom w:val="single" w:sz="1" w:space="0" w:color="CCCCCC"/>
-              <w:right w:val="single" w:sz="1" w:space="0" w:color="CCCCCC"/>
+              <w:top w:val="single" w:color="CCCCCC" w:sz="0" w:space="0"/>
+              <w:left w:val="single" w:color="CCCCCC" w:sz="0" w:space="0"/>
+              <w:bottom w:val="single" w:color="CCCCCC" w:sz="0" w:space="0"/>
+              <w:right w:val="single" w:color="CCCCCC" w:sz="0" w:space="0"/>
             </w:tcBorders>
             <w:shd w:val="clear" w:color="auto" w:fill="E8EAF6"/>
             <w:tcMar>
@@ -2918,10 +3086,10 @@
           <w:tcPr>
             <w:tcW w:w="4800" w:type="dxa"/>
             <w:tcBorders>
-              <w:top w:val="single" w:sz="1" w:space="0" w:color="CCCCCC"/>
-              <w:left w:val="single" w:sz="1" w:space="0" w:color="CCCCCC"/>
-              <w:bottom w:val="single" w:sz="1" w:space="0" w:color="CCCCCC"/>
-              <w:right w:val="single" w:sz="1" w:space="0" w:color="CCCCCC"/>
+              <w:top w:val="single" w:color="CCCCCC" w:sz="0" w:space="0"/>
+              <w:left w:val="single" w:color="CCCCCC" w:sz="0" w:space="0"/>
+              <w:bottom w:val="single" w:color="CCCCCC" w:sz="0" w:space="0"/>
+              <w:right w:val="single" w:color="CCCCCC" w:sz="0" w:space="0"/>
             </w:tcBorders>
             <w:shd w:val="clear" w:color="auto" w:fill="E8EAF6"/>
             <w:tcMar>
@@ -2946,19 +3114,29 @@
       </w:tr>
       <w:tr>
         <w:tblPrEx>
+          <w:tblBorders>
+            <w:top w:val="single" w:color="auto" w:sz="4" w:space="0"/>
+            <w:left w:val="single" w:color="auto" w:sz="4" w:space="0"/>
+            <w:bottom w:val="single" w:color="auto" w:sz="4" w:space="0"/>
+            <w:right w:val="single" w:color="auto" w:sz="4" w:space="0"/>
+            <w:insideH w:val="single" w:color="auto" w:sz="4" w:space="0"/>
+            <w:insideV w:val="single" w:color="auto" w:sz="4" w:space="0"/>
+          </w:tblBorders>
           <w:tblCellMar>
             <w:top w:w="0" w:type="dxa"/>
+            <w:left w:w="10" w:type="dxa"/>
             <w:bottom w:w="0" w:type="dxa"/>
+            <w:right w:w="10" w:type="dxa"/>
           </w:tblCellMar>
         </w:tblPrEx>
         <w:tc>
           <w:tcPr>
             <w:tcW w:w="2400" w:type="dxa"/>
             <w:tcBorders>
-              <w:top w:val="single" w:sz="1" w:space="0" w:color="CCCCCC"/>
-              <w:left w:val="single" w:sz="1" w:space="0" w:color="CCCCCC"/>
-              <w:bottom w:val="single" w:sz="1" w:space="0" w:color="CCCCCC"/>
-              <w:right w:val="single" w:sz="1" w:space="0" w:color="CCCCCC"/>
+              <w:top w:val="single" w:color="CCCCCC" w:sz="0" w:space="0"/>
+              <w:left w:val="single" w:color="CCCCCC" w:sz="0" w:space="0"/>
+              <w:bottom w:val="single" w:color="CCCCCC" w:sz="0" w:space="0"/>
+              <w:right w:val="single" w:color="CCCCCC" w:sz="0" w:space="0"/>
             </w:tcBorders>
             <w:tcMar>
               <w:top w:w="80" w:type="dxa"/>
@@ -2984,10 +3162,10 @@
           <w:tcPr>
             <w:tcW w:w="2160" w:type="dxa"/>
             <w:tcBorders>
-              <w:top w:val="single" w:sz="1" w:space="0" w:color="CCCCCC"/>
-              <w:left w:val="single" w:sz="1" w:space="0" w:color="CCCCCC"/>
-              <w:bottom w:val="single" w:sz="1" w:space="0" w:color="CCCCCC"/>
-              <w:right w:val="single" w:sz="1" w:space="0" w:color="CCCCCC"/>
+              <w:top w:val="single" w:color="CCCCCC" w:sz="0" w:space="0"/>
+              <w:left w:val="single" w:color="CCCCCC" w:sz="0" w:space="0"/>
+              <w:bottom w:val="single" w:color="CCCCCC" w:sz="0" w:space="0"/>
+              <w:right w:val="single" w:color="CCCCCC" w:sz="0" w:space="0"/>
             </w:tcBorders>
             <w:tcMar>
               <w:top w:w="80" w:type="dxa"/>
@@ -3010,10 +3188,10 @@
           <w:tcPr>
             <w:tcW w:w="4800" w:type="dxa"/>
             <w:tcBorders>
-              <w:top w:val="single" w:sz="1" w:space="0" w:color="CCCCCC"/>
-              <w:left w:val="single" w:sz="1" w:space="0" w:color="CCCCCC"/>
-              <w:bottom w:val="single" w:sz="1" w:space="0" w:color="CCCCCC"/>
-              <w:right w:val="single" w:sz="1" w:space="0" w:color="CCCCCC"/>
+              <w:top w:val="single" w:color="CCCCCC" w:sz="0" w:space="0"/>
+              <w:left w:val="single" w:color="CCCCCC" w:sz="0" w:space="0"/>
+              <w:bottom w:val="single" w:color="CCCCCC" w:sz="0" w:space="0"/>
+              <w:right w:val="single" w:color="CCCCCC" w:sz="0" w:space="0"/>
             </w:tcBorders>
             <w:tcMar>
               <w:top w:w="80" w:type="dxa"/>
@@ -3035,19 +3213,29 @@
       </w:tr>
       <w:tr>
         <w:tblPrEx>
+          <w:tblBorders>
+            <w:top w:val="single" w:color="auto" w:sz="4" w:space="0"/>
+            <w:left w:val="single" w:color="auto" w:sz="4" w:space="0"/>
+            <w:bottom w:val="single" w:color="auto" w:sz="4" w:space="0"/>
+            <w:right w:val="single" w:color="auto" w:sz="4" w:space="0"/>
+            <w:insideH w:val="single" w:color="auto" w:sz="4" w:space="0"/>
+            <w:insideV w:val="single" w:color="auto" w:sz="4" w:space="0"/>
+          </w:tblBorders>
           <w:tblCellMar>
             <w:top w:w="0" w:type="dxa"/>
+            <w:left w:w="10" w:type="dxa"/>
             <w:bottom w:w="0" w:type="dxa"/>
+            <w:right w:w="10" w:type="dxa"/>
           </w:tblCellMar>
         </w:tblPrEx>
         <w:tc>
           <w:tcPr>
             <w:tcW w:w="2400" w:type="dxa"/>
             <w:tcBorders>
-              <w:top w:val="single" w:sz="1" w:space="0" w:color="CCCCCC"/>
-              <w:left w:val="single" w:sz="1" w:space="0" w:color="CCCCCC"/>
-              <w:bottom w:val="single" w:sz="1" w:space="0" w:color="CCCCCC"/>
-              <w:right w:val="single" w:sz="1" w:space="0" w:color="CCCCCC"/>
+              <w:top w:val="single" w:color="CCCCCC" w:sz="0" w:space="0"/>
+              <w:left w:val="single" w:color="CCCCCC" w:sz="0" w:space="0"/>
+              <w:bottom w:val="single" w:color="CCCCCC" w:sz="0" w:space="0"/>
+              <w:right w:val="single" w:color="CCCCCC" w:sz="0" w:space="0"/>
             </w:tcBorders>
             <w:tcMar>
               <w:top w:w="80" w:type="dxa"/>
@@ -3073,10 +3261,10 @@
           <w:tcPr>
             <w:tcW w:w="2160" w:type="dxa"/>
             <w:tcBorders>
-              <w:top w:val="single" w:sz="1" w:space="0" w:color="CCCCCC"/>
-              <w:left w:val="single" w:sz="1" w:space="0" w:color="CCCCCC"/>
-              <w:bottom w:val="single" w:sz="1" w:space="0" w:color="CCCCCC"/>
-              <w:right w:val="single" w:sz="1" w:space="0" w:color="CCCCCC"/>
+              <w:top w:val="single" w:color="CCCCCC" w:sz="0" w:space="0"/>
+              <w:left w:val="single" w:color="CCCCCC" w:sz="0" w:space="0"/>
+              <w:bottom w:val="single" w:color="CCCCCC" w:sz="0" w:space="0"/>
+              <w:right w:val="single" w:color="CCCCCC" w:sz="0" w:space="0"/>
             </w:tcBorders>
             <w:tcMar>
               <w:top w:w="80" w:type="dxa"/>
@@ -3099,10 +3287,10 @@
           <w:tcPr>
             <w:tcW w:w="4800" w:type="dxa"/>
             <w:tcBorders>
-              <w:top w:val="single" w:sz="1" w:space="0" w:color="CCCCCC"/>
-              <w:left w:val="single" w:sz="1" w:space="0" w:color="CCCCCC"/>
-              <w:bottom w:val="single" w:sz="1" w:space="0" w:color="CCCCCC"/>
-              <w:right w:val="single" w:sz="1" w:space="0" w:color="CCCCCC"/>
+              <w:top w:val="single" w:color="CCCCCC" w:sz="0" w:space="0"/>
+              <w:left w:val="single" w:color="CCCCCC" w:sz="0" w:space="0"/>
+              <w:bottom w:val="single" w:color="CCCCCC" w:sz="0" w:space="0"/>
+              <w:right w:val="single" w:color="CCCCCC" w:sz="0" w:space="0"/>
             </w:tcBorders>
             <w:tcMar>
               <w:top w:w="80" w:type="dxa"/>
@@ -3124,19 +3312,29 @@
       </w:tr>
       <w:tr>
         <w:tblPrEx>
+          <w:tblBorders>
+            <w:top w:val="single" w:color="auto" w:sz="4" w:space="0"/>
+            <w:left w:val="single" w:color="auto" w:sz="4" w:space="0"/>
+            <w:bottom w:val="single" w:color="auto" w:sz="4" w:space="0"/>
+            <w:right w:val="single" w:color="auto" w:sz="4" w:space="0"/>
+            <w:insideH w:val="single" w:color="auto" w:sz="4" w:space="0"/>
+            <w:insideV w:val="single" w:color="auto" w:sz="4" w:space="0"/>
+          </w:tblBorders>
           <w:tblCellMar>
             <w:top w:w="0" w:type="dxa"/>
+            <w:left w:w="10" w:type="dxa"/>
             <w:bottom w:w="0" w:type="dxa"/>
+            <w:right w:w="10" w:type="dxa"/>
           </w:tblCellMar>
         </w:tblPrEx>
         <w:tc>
           <w:tcPr>
             <w:tcW w:w="2400" w:type="dxa"/>
             <w:tcBorders>
-              <w:top w:val="single" w:sz="1" w:space="0" w:color="CCCCCC"/>
-              <w:left w:val="single" w:sz="1" w:space="0" w:color="CCCCCC"/>
-              <w:bottom w:val="single" w:sz="1" w:space="0" w:color="CCCCCC"/>
-              <w:right w:val="single" w:sz="1" w:space="0" w:color="CCCCCC"/>
+              <w:top w:val="single" w:color="CCCCCC" w:sz="0" w:space="0"/>
+              <w:left w:val="single" w:color="CCCCCC" w:sz="0" w:space="0"/>
+              <w:bottom w:val="single" w:color="CCCCCC" w:sz="0" w:space="0"/>
+              <w:right w:val="single" w:color="CCCCCC" w:sz="0" w:space="0"/>
             </w:tcBorders>
             <w:tcMar>
               <w:top w:w="80" w:type="dxa"/>
@@ -3162,10 +3360,10 @@
           <w:tcPr>
             <w:tcW w:w="2160" w:type="dxa"/>
             <w:tcBorders>
-              <w:top w:val="single" w:sz="1" w:space="0" w:color="CCCCCC"/>
-              <w:left w:val="single" w:sz="1" w:space="0" w:color="CCCCCC"/>
-              <w:bottom w:val="single" w:sz="1" w:space="0" w:color="CCCCCC"/>
-              <w:right w:val="single" w:sz="1" w:space="0" w:color="CCCCCC"/>
+              <w:top w:val="single" w:color="CCCCCC" w:sz="0" w:space="0"/>
+              <w:left w:val="single" w:color="CCCCCC" w:sz="0" w:space="0"/>
+              <w:bottom w:val="single" w:color="CCCCCC" w:sz="0" w:space="0"/>
+              <w:right w:val="single" w:color="CCCCCC" w:sz="0" w:space="0"/>
             </w:tcBorders>
             <w:tcMar>
               <w:top w:w="80" w:type="dxa"/>
@@ -3188,10 +3386,10 @@
           <w:tcPr>
             <w:tcW w:w="4800" w:type="dxa"/>
             <w:tcBorders>
-              <w:top w:val="single" w:sz="1" w:space="0" w:color="CCCCCC"/>
-              <w:left w:val="single" w:sz="1" w:space="0" w:color="CCCCCC"/>
-              <w:bottom w:val="single" w:sz="1" w:space="0" w:color="CCCCCC"/>
-              <w:right w:val="single" w:sz="1" w:space="0" w:color="CCCCCC"/>
+              <w:top w:val="single" w:color="CCCCCC" w:sz="0" w:space="0"/>
+              <w:left w:val="single" w:color="CCCCCC" w:sz="0" w:space="0"/>
+              <w:bottom w:val="single" w:color="CCCCCC" w:sz="0" w:space="0"/>
+              <w:right w:val="single" w:color="CCCCCC" w:sz="0" w:space="0"/>
             </w:tcBorders>
             <w:tcMar>
               <w:top w:w="80" w:type="dxa"/>
@@ -3213,19 +3411,29 @@
       </w:tr>
       <w:tr>
         <w:tblPrEx>
+          <w:tblBorders>
+            <w:top w:val="single" w:color="auto" w:sz="4" w:space="0"/>
+            <w:left w:val="single" w:color="auto" w:sz="4" w:space="0"/>
+            <w:bottom w:val="single" w:color="auto" w:sz="4" w:space="0"/>
+            <w:right w:val="single" w:color="auto" w:sz="4" w:space="0"/>
+            <w:insideH w:val="single" w:color="auto" w:sz="4" w:space="0"/>
+            <w:insideV w:val="single" w:color="auto" w:sz="4" w:space="0"/>
+          </w:tblBorders>
           <w:tblCellMar>
             <w:top w:w="0" w:type="dxa"/>
+            <w:left w:w="10" w:type="dxa"/>
             <w:bottom w:w="0" w:type="dxa"/>
+            <w:right w:w="10" w:type="dxa"/>
           </w:tblCellMar>
         </w:tblPrEx>
         <w:tc>
           <w:tcPr>
             <w:tcW w:w="2400" w:type="dxa"/>
             <w:tcBorders>
-              <w:top w:val="single" w:sz="1" w:space="0" w:color="CCCCCC"/>
-              <w:left w:val="single" w:sz="1" w:space="0" w:color="CCCCCC"/>
-              <w:bottom w:val="single" w:sz="1" w:space="0" w:color="CCCCCC"/>
-              <w:right w:val="single" w:sz="1" w:space="0" w:color="CCCCCC"/>
+              <w:top w:val="single" w:color="CCCCCC" w:sz="0" w:space="0"/>
+              <w:left w:val="single" w:color="CCCCCC" w:sz="0" w:space="0"/>
+              <w:bottom w:val="single" w:color="CCCCCC" w:sz="0" w:space="0"/>
+              <w:right w:val="single" w:color="CCCCCC" w:sz="0" w:space="0"/>
             </w:tcBorders>
             <w:tcMar>
               <w:top w:w="80" w:type="dxa"/>
@@ -3251,10 +3459,10 @@
           <w:tcPr>
             <w:tcW w:w="2160" w:type="dxa"/>
             <w:tcBorders>
-              <w:top w:val="single" w:sz="1" w:space="0" w:color="CCCCCC"/>
-              <w:left w:val="single" w:sz="1" w:space="0" w:color="CCCCCC"/>
-              <w:bottom w:val="single" w:sz="1" w:space="0" w:color="CCCCCC"/>
-              <w:right w:val="single" w:sz="1" w:space="0" w:color="CCCCCC"/>
+              <w:top w:val="single" w:color="CCCCCC" w:sz="0" w:space="0"/>
+              <w:left w:val="single" w:color="CCCCCC" w:sz="0" w:space="0"/>
+              <w:bottom w:val="single" w:color="CCCCCC" w:sz="0" w:space="0"/>
+              <w:right w:val="single" w:color="CCCCCC" w:sz="0" w:space="0"/>
             </w:tcBorders>
             <w:tcMar>
               <w:top w:w="80" w:type="dxa"/>
@@ -3277,10 +3485,10 @@
           <w:tcPr>
             <w:tcW w:w="4800" w:type="dxa"/>
             <w:tcBorders>
-              <w:top w:val="single" w:sz="1" w:space="0" w:color="CCCCCC"/>
-              <w:left w:val="single" w:sz="1" w:space="0" w:color="CCCCCC"/>
-              <w:bottom w:val="single" w:sz="1" w:space="0" w:color="CCCCCC"/>
-              <w:right w:val="single" w:sz="1" w:space="0" w:color="CCCCCC"/>
+              <w:top w:val="single" w:color="CCCCCC" w:sz="0" w:space="0"/>
+              <w:left w:val="single" w:color="CCCCCC" w:sz="0" w:space="0"/>
+              <w:bottom w:val="single" w:color="CCCCCC" w:sz="0" w:space="0"/>
+              <w:right w:val="single" w:color="CCCCCC" w:sz="0" w:space="0"/>
             </w:tcBorders>
             <w:tcMar>
               <w:top w:w="80" w:type="dxa"/>
@@ -3302,19 +3510,29 @@
       </w:tr>
       <w:tr>
         <w:tblPrEx>
+          <w:tblBorders>
+            <w:top w:val="single" w:color="auto" w:sz="4" w:space="0"/>
+            <w:left w:val="single" w:color="auto" w:sz="4" w:space="0"/>
+            <w:bottom w:val="single" w:color="auto" w:sz="4" w:space="0"/>
+            <w:right w:val="single" w:color="auto" w:sz="4" w:space="0"/>
+            <w:insideH w:val="single" w:color="auto" w:sz="4" w:space="0"/>
+            <w:insideV w:val="single" w:color="auto" w:sz="4" w:space="0"/>
+          </w:tblBorders>
           <w:tblCellMar>
             <w:top w:w="0" w:type="dxa"/>
+            <w:left w:w="10" w:type="dxa"/>
             <w:bottom w:w="0" w:type="dxa"/>
+            <w:right w:w="10" w:type="dxa"/>
           </w:tblCellMar>
         </w:tblPrEx>
         <w:tc>
           <w:tcPr>
             <w:tcW w:w="2400" w:type="dxa"/>
             <w:tcBorders>
-              <w:top w:val="single" w:sz="1" w:space="0" w:color="CCCCCC"/>
-              <w:left w:val="single" w:sz="1" w:space="0" w:color="CCCCCC"/>
-              <w:bottom w:val="single" w:sz="1" w:space="0" w:color="CCCCCC"/>
-              <w:right w:val="single" w:sz="1" w:space="0" w:color="CCCCCC"/>
+              <w:top w:val="single" w:color="CCCCCC" w:sz="0" w:space="0"/>
+              <w:left w:val="single" w:color="CCCCCC" w:sz="0" w:space="0"/>
+              <w:bottom w:val="single" w:color="CCCCCC" w:sz="0" w:space="0"/>
+              <w:right w:val="single" w:color="CCCCCC" w:sz="0" w:space="0"/>
             </w:tcBorders>
             <w:tcMar>
               <w:top w:w="80" w:type="dxa"/>
@@ -3340,10 +3558,10 @@
           <w:tcPr>
             <w:tcW w:w="2160" w:type="dxa"/>
             <w:tcBorders>
-              <w:top w:val="single" w:sz="1" w:space="0" w:color="CCCCCC"/>
-              <w:left w:val="single" w:sz="1" w:space="0" w:color="CCCCCC"/>
-              <w:bottom w:val="single" w:sz="1" w:space="0" w:color="CCCCCC"/>
-              <w:right w:val="single" w:sz="1" w:space="0" w:color="CCCCCC"/>
+              <w:top w:val="single" w:color="CCCCCC" w:sz="0" w:space="0"/>
+              <w:left w:val="single" w:color="CCCCCC" w:sz="0" w:space="0"/>
+              <w:bottom w:val="single" w:color="CCCCCC" w:sz="0" w:space="0"/>
+              <w:right w:val="single" w:color="CCCCCC" w:sz="0" w:space="0"/>
             </w:tcBorders>
             <w:tcMar>
               <w:top w:w="80" w:type="dxa"/>
@@ -3366,10 +3584,10 @@
           <w:tcPr>
             <w:tcW w:w="4800" w:type="dxa"/>
             <w:tcBorders>
-              <w:top w:val="single" w:sz="1" w:space="0" w:color="CCCCCC"/>
-              <w:left w:val="single" w:sz="1" w:space="0" w:color="CCCCCC"/>
-              <w:bottom w:val="single" w:sz="1" w:space="0" w:color="CCCCCC"/>
-              <w:right w:val="single" w:sz="1" w:space="0" w:color="CCCCCC"/>
+              <w:top w:val="single" w:color="CCCCCC" w:sz="0" w:space="0"/>
+              <w:left w:val="single" w:color="CCCCCC" w:sz="0" w:space="0"/>
+              <w:bottom w:val="single" w:color="CCCCCC" w:sz="0" w:space="0"/>
+              <w:right w:val="single" w:color="CCCCCC" w:sz="0" w:space="0"/>
             </w:tcBorders>
             <w:tcMar>
               <w:top w:w="80" w:type="dxa"/>
@@ -3391,19 +3609,29 @@
       </w:tr>
       <w:tr>
         <w:tblPrEx>
+          <w:tblBorders>
+            <w:top w:val="single" w:color="auto" w:sz="4" w:space="0"/>
+            <w:left w:val="single" w:color="auto" w:sz="4" w:space="0"/>
+            <w:bottom w:val="single" w:color="auto" w:sz="4" w:space="0"/>
+            <w:right w:val="single" w:color="auto" w:sz="4" w:space="0"/>
+            <w:insideH w:val="single" w:color="auto" w:sz="4" w:space="0"/>
+            <w:insideV w:val="single" w:color="auto" w:sz="4" w:space="0"/>
+          </w:tblBorders>
           <w:tblCellMar>
             <w:top w:w="0" w:type="dxa"/>
+            <w:left w:w="10" w:type="dxa"/>
             <w:bottom w:w="0" w:type="dxa"/>
+            <w:right w:w="10" w:type="dxa"/>
           </w:tblCellMar>
         </w:tblPrEx>
         <w:tc>
           <w:tcPr>
             <w:tcW w:w="2400" w:type="dxa"/>
             <w:tcBorders>
-              <w:top w:val="single" w:sz="1" w:space="0" w:color="CCCCCC"/>
-              <w:left w:val="single" w:sz="1" w:space="0" w:color="CCCCCC"/>
-              <w:bottom w:val="single" w:sz="1" w:space="0" w:color="CCCCCC"/>
-              <w:right w:val="single" w:sz="1" w:space="0" w:color="CCCCCC"/>
+              <w:top w:val="single" w:color="CCCCCC" w:sz="0" w:space="0"/>
+              <w:left w:val="single" w:color="CCCCCC" w:sz="0" w:space="0"/>
+              <w:bottom w:val="single" w:color="CCCCCC" w:sz="0" w:space="0"/>
+              <w:right w:val="single" w:color="CCCCCC" w:sz="0" w:space="0"/>
             </w:tcBorders>
             <w:tcMar>
               <w:top w:w="80" w:type="dxa"/>
@@ -3429,10 +3657,10 @@
           <w:tcPr>
             <w:tcW w:w="2160" w:type="dxa"/>
             <w:tcBorders>
-              <w:top w:val="single" w:sz="1" w:space="0" w:color="CCCCCC"/>
-              <w:left w:val="single" w:sz="1" w:space="0" w:color="CCCCCC"/>
-              <w:bottom w:val="single" w:sz="1" w:space="0" w:color="CCCCCC"/>
-              <w:right w:val="single" w:sz="1" w:space="0" w:color="CCCCCC"/>
+              <w:top w:val="single" w:color="CCCCCC" w:sz="0" w:space="0"/>
+              <w:left w:val="single" w:color="CCCCCC" w:sz="0" w:space="0"/>
+              <w:bottom w:val="single" w:color="CCCCCC" w:sz="0" w:space="0"/>
+              <w:right w:val="single" w:color="CCCCCC" w:sz="0" w:space="0"/>
             </w:tcBorders>
             <w:tcMar>
               <w:top w:w="80" w:type="dxa"/>
@@ -3455,10 +3683,10 @@
           <w:tcPr>
             <w:tcW w:w="4800" w:type="dxa"/>
             <w:tcBorders>
-              <w:top w:val="single" w:sz="1" w:space="0" w:color="CCCCCC"/>
-              <w:left w:val="single" w:sz="1" w:space="0" w:color="CCCCCC"/>
-              <w:bottom w:val="single" w:sz="1" w:space="0" w:color="CCCCCC"/>
-              <w:right w:val="single" w:sz="1" w:space="0" w:color="CCCCCC"/>
+              <w:top w:val="single" w:color="CCCCCC" w:sz="0" w:space="0"/>
+              <w:left w:val="single" w:color="CCCCCC" w:sz="0" w:space="0"/>
+              <w:bottom w:val="single" w:color="CCCCCC" w:sz="0" w:space="0"/>
+              <w:right w:val="single" w:color="CCCCCC" w:sz="0" w:space="0"/>
             </w:tcBorders>
             <w:tcMar>
               <w:top w:w="80" w:type="dxa"/>
@@ -3480,19 +3708,29 @@
       </w:tr>
       <w:tr>
         <w:tblPrEx>
+          <w:tblBorders>
+            <w:top w:val="single" w:color="auto" w:sz="4" w:space="0"/>
+            <w:left w:val="single" w:color="auto" w:sz="4" w:space="0"/>
+            <w:bottom w:val="single" w:color="auto" w:sz="4" w:space="0"/>
+            <w:right w:val="single" w:color="auto" w:sz="4" w:space="0"/>
+            <w:insideH w:val="single" w:color="auto" w:sz="4" w:space="0"/>
+            <w:insideV w:val="single" w:color="auto" w:sz="4" w:space="0"/>
+          </w:tblBorders>
           <w:tblCellMar>
             <w:top w:w="0" w:type="dxa"/>
+            <w:left w:w="10" w:type="dxa"/>
             <w:bottom w:w="0" w:type="dxa"/>
+            <w:right w:w="10" w:type="dxa"/>
           </w:tblCellMar>
         </w:tblPrEx>
         <w:tc>
           <w:tcPr>
             <w:tcW w:w="2400" w:type="dxa"/>
             <w:tcBorders>
-              <w:top w:val="single" w:sz="1" w:space="0" w:color="CCCCCC"/>
-              <w:left w:val="single" w:sz="1" w:space="0" w:color="CCCCCC"/>
-              <w:bottom w:val="single" w:sz="1" w:space="0" w:color="CCCCCC"/>
-              <w:right w:val="single" w:sz="1" w:space="0" w:color="CCCCCC"/>
+              <w:top w:val="single" w:color="CCCCCC" w:sz="0" w:space="0"/>
+              <w:left w:val="single" w:color="CCCCCC" w:sz="0" w:space="0"/>
+              <w:bottom w:val="single" w:color="CCCCCC" w:sz="0" w:space="0"/>
+              <w:right w:val="single" w:color="CCCCCC" w:sz="0" w:space="0"/>
             </w:tcBorders>
             <w:tcMar>
               <w:top w:w="80" w:type="dxa"/>
@@ -3518,10 +3756,10 @@
           <w:tcPr>
             <w:tcW w:w="2160" w:type="dxa"/>
             <w:tcBorders>
-              <w:top w:val="single" w:sz="1" w:space="0" w:color="CCCCCC"/>
-              <w:left w:val="single" w:sz="1" w:space="0" w:color="CCCCCC"/>
-              <w:bottom w:val="single" w:sz="1" w:space="0" w:color="CCCCCC"/>
-              <w:right w:val="single" w:sz="1" w:space="0" w:color="CCCCCC"/>
+              <w:top w:val="single" w:color="CCCCCC" w:sz="0" w:space="0"/>
+              <w:left w:val="single" w:color="CCCCCC" w:sz="0" w:space="0"/>
+              <w:bottom w:val="single" w:color="CCCCCC" w:sz="0" w:space="0"/>
+              <w:right w:val="single" w:color="CCCCCC" w:sz="0" w:space="0"/>
             </w:tcBorders>
             <w:tcMar>
               <w:top w:w="80" w:type="dxa"/>
@@ -3544,10 +3782,10 @@
           <w:tcPr>
             <w:tcW w:w="4800" w:type="dxa"/>
             <w:tcBorders>
-              <w:top w:val="single" w:sz="1" w:space="0" w:color="CCCCCC"/>
-              <w:left w:val="single" w:sz="1" w:space="0" w:color="CCCCCC"/>
-              <w:bottom w:val="single" w:sz="1" w:space="0" w:color="CCCCCC"/>
-              <w:right w:val="single" w:sz="1" w:space="0" w:color="CCCCCC"/>
+              <w:top w:val="single" w:color="CCCCCC" w:sz="0" w:space="0"/>
+              <w:left w:val="single" w:color="CCCCCC" w:sz="0" w:space="0"/>
+              <w:bottom w:val="single" w:color="CCCCCC" w:sz="0" w:space="0"/>
+              <w:right w:val="single" w:color="CCCCCC" w:sz="0" w:space="0"/>
             </w:tcBorders>
             <w:tcMar>
               <w:top w:w="80" w:type="dxa"/>
@@ -3569,19 +3807,29 @@
       </w:tr>
       <w:tr>
         <w:tblPrEx>
+          <w:tblBorders>
+            <w:top w:val="single" w:color="auto" w:sz="4" w:space="0"/>
+            <w:left w:val="single" w:color="auto" w:sz="4" w:space="0"/>
+            <w:bottom w:val="single" w:color="auto" w:sz="4" w:space="0"/>
+            <w:right w:val="single" w:color="auto" w:sz="4" w:space="0"/>
+            <w:insideH w:val="single" w:color="auto" w:sz="4" w:space="0"/>
+            <w:insideV w:val="single" w:color="auto" w:sz="4" w:space="0"/>
+          </w:tblBorders>
           <w:tblCellMar>
             <w:top w:w="0" w:type="dxa"/>
+            <w:left w:w="10" w:type="dxa"/>
             <w:bottom w:w="0" w:type="dxa"/>
+            <w:right w:w="10" w:type="dxa"/>
           </w:tblCellMar>
         </w:tblPrEx>
         <w:tc>
           <w:tcPr>
             <w:tcW w:w="2400" w:type="dxa"/>
             <w:tcBorders>
-              <w:top w:val="single" w:sz="1" w:space="0" w:color="CCCCCC"/>
-              <w:left w:val="single" w:sz="1" w:space="0" w:color="CCCCCC"/>
-              <w:bottom w:val="single" w:sz="1" w:space="0" w:color="CCCCCC"/>
-              <w:right w:val="single" w:sz="1" w:space="0" w:color="CCCCCC"/>
+              <w:top w:val="single" w:color="CCCCCC" w:sz="0" w:space="0"/>
+              <w:left w:val="single" w:color="CCCCCC" w:sz="0" w:space="0"/>
+              <w:bottom w:val="single" w:color="CCCCCC" w:sz="0" w:space="0"/>
+              <w:right w:val="single" w:color="CCCCCC" w:sz="0" w:space="0"/>
             </w:tcBorders>
             <w:tcMar>
               <w:top w:w="80" w:type="dxa"/>
@@ -3607,10 +3855,10 @@
           <w:tcPr>
             <w:tcW w:w="2160" w:type="dxa"/>
             <w:tcBorders>
-              <w:top w:val="single" w:sz="1" w:space="0" w:color="CCCCCC"/>
-              <w:left w:val="single" w:sz="1" w:space="0" w:color="CCCCCC"/>
-              <w:bottom w:val="single" w:sz="1" w:space="0" w:color="CCCCCC"/>
-              <w:right w:val="single" w:sz="1" w:space="0" w:color="CCCCCC"/>
+              <w:top w:val="single" w:color="CCCCCC" w:sz="0" w:space="0"/>
+              <w:left w:val="single" w:color="CCCCCC" w:sz="0" w:space="0"/>
+              <w:bottom w:val="single" w:color="CCCCCC" w:sz="0" w:space="0"/>
+              <w:right w:val="single" w:color="CCCCCC" w:sz="0" w:space="0"/>
             </w:tcBorders>
             <w:tcMar>
               <w:top w:w="80" w:type="dxa"/>
@@ -3633,10 +3881,10 @@
           <w:tcPr>
             <w:tcW w:w="4800" w:type="dxa"/>
             <w:tcBorders>
-              <w:top w:val="single" w:sz="1" w:space="0" w:color="CCCCCC"/>
-              <w:left w:val="single" w:sz="1" w:space="0" w:color="CCCCCC"/>
-              <w:bottom w:val="single" w:sz="1" w:space="0" w:color="CCCCCC"/>
-              <w:right w:val="single" w:sz="1" w:space="0" w:color="CCCCCC"/>
+              <w:top w:val="single" w:color="CCCCCC" w:sz="0" w:space="0"/>
+              <w:left w:val="single" w:color="CCCCCC" w:sz="0" w:space="0"/>
+              <w:bottom w:val="single" w:color="CCCCCC" w:sz="0" w:space="0"/>
+              <w:right w:val="single" w:color="CCCCCC" w:sz="0" w:space="0"/>
             </w:tcBorders>
             <w:tcMar>
               <w:top w:w="80" w:type="dxa"/>
@@ -3658,19 +3906,29 @@
       </w:tr>
       <w:tr>
         <w:tblPrEx>
+          <w:tblBorders>
+            <w:top w:val="single" w:color="auto" w:sz="4" w:space="0"/>
+            <w:left w:val="single" w:color="auto" w:sz="4" w:space="0"/>
+            <w:bottom w:val="single" w:color="auto" w:sz="4" w:space="0"/>
+            <w:right w:val="single" w:color="auto" w:sz="4" w:space="0"/>
+            <w:insideH w:val="single" w:color="auto" w:sz="4" w:space="0"/>
+            <w:insideV w:val="single" w:color="auto" w:sz="4" w:space="0"/>
+          </w:tblBorders>
           <w:tblCellMar>
             <w:top w:w="0" w:type="dxa"/>
+            <w:left w:w="10" w:type="dxa"/>
             <w:bottom w:w="0" w:type="dxa"/>
+            <w:right w:w="10" w:type="dxa"/>
           </w:tblCellMar>
         </w:tblPrEx>
         <w:tc>
           <w:tcPr>
             <w:tcW w:w="2400" w:type="dxa"/>
             <w:tcBorders>
-              <w:top w:val="single" w:sz="1" w:space="0" w:color="CCCCCC"/>
-              <w:left w:val="single" w:sz="1" w:space="0" w:color="CCCCCC"/>
-              <w:bottom w:val="single" w:sz="1" w:space="0" w:color="CCCCCC"/>
-              <w:right w:val="single" w:sz="1" w:space="0" w:color="CCCCCC"/>
+              <w:top w:val="single" w:color="CCCCCC" w:sz="0" w:space="0"/>
+              <w:left w:val="single" w:color="CCCCCC" w:sz="0" w:space="0"/>
+              <w:bottom w:val="single" w:color="CCCCCC" w:sz="0" w:space="0"/>
+              <w:right w:val="single" w:color="CCCCCC" w:sz="0" w:space="0"/>
             </w:tcBorders>
             <w:tcMar>
               <w:top w:w="80" w:type="dxa"/>
@@ -3696,10 +3954,10 @@
           <w:tcPr>
             <w:tcW w:w="2160" w:type="dxa"/>
             <w:tcBorders>
-              <w:top w:val="single" w:sz="1" w:space="0" w:color="CCCCCC"/>
-              <w:left w:val="single" w:sz="1" w:space="0" w:color="CCCCCC"/>
-              <w:bottom w:val="single" w:sz="1" w:space="0" w:color="CCCCCC"/>
-              <w:right w:val="single" w:sz="1" w:space="0" w:color="CCCCCC"/>
+              <w:top w:val="single" w:color="CCCCCC" w:sz="0" w:space="0"/>
+              <w:left w:val="single" w:color="CCCCCC" w:sz="0" w:space="0"/>
+              <w:bottom w:val="single" w:color="CCCCCC" w:sz="0" w:space="0"/>
+              <w:right w:val="single" w:color="CCCCCC" w:sz="0" w:space="0"/>
             </w:tcBorders>
             <w:tcMar>
               <w:top w:w="80" w:type="dxa"/>
@@ -3722,10 +3980,10 @@
           <w:tcPr>
             <w:tcW w:w="4800" w:type="dxa"/>
             <w:tcBorders>
-              <w:top w:val="single" w:sz="1" w:space="0" w:color="CCCCCC"/>
-              <w:left w:val="single" w:sz="1" w:space="0" w:color="CCCCCC"/>
-              <w:bottom w:val="single" w:sz="1" w:space="0" w:color="CCCCCC"/>
-              <w:right w:val="single" w:sz="1" w:space="0" w:color="CCCCCC"/>
+              <w:top w:val="single" w:color="CCCCCC" w:sz="0" w:space="0"/>
+              <w:left w:val="single" w:color="CCCCCC" w:sz="0" w:space="0"/>
+              <w:bottom w:val="single" w:color="CCCCCC" w:sz="0" w:space="0"/>
+              <w:right w:val="single" w:color="CCCCCC" w:sz="0" w:space="0"/>
             </w:tcBorders>
             <w:tcMar>
               <w:top w:w="80" w:type="dxa"/>
@@ -3747,19 +4005,29 @@
       </w:tr>
       <w:tr>
         <w:tblPrEx>
+          <w:tblBorders>
+            <w:top w:val="single" w:color="auto" w:sz="4" w:space="0"/>
+            <w:left w:val="single" w:color="auto" w:sz="4" w:space="0"/>
+            <w:bottom w:val="single" w:color="auto" w:sz="4" w:space="0"/>
+            <w:right w:val="single" w:color="auto" w:sz="4" w:space="0"/>
+            <w:insideH w:val="single" w:color="auto" w:sz="4" w:space="0"/>
+            <w:insideV w:val="single" w:color="auto" w:sz="4" w:space="0"/>
+          </w:tblBorders>
           <w:tblCellMar>
             <w:top w:w="0" w:type="dxa"/>
+            <w:left w:w="10" w:type="dxa"/>
             <w:bottom w:w="0" w:type="dxa"/>
+            <w:right w:w="10" w:type="dxa"/>
           </w:tblCellMar>
         </w:tblPrEx>
         <w:tc>
           <w:tcPr>
             <w:tcW w:w="2400" w:type="dxa"/>
             <w:tcBorders>
-              <w:top w:val="single" w:sz="1" w:space="0" w:color="CCCCCC"/>
-              <w:left w:val="single" w:sz="1" w:space="0" w:color="CCCCCC"/>
-              <w:bottom w:val="single" w:sz="1" w:space="0" w:color="CCCCCC"/>
-              <w:right w:val="single" w:sz="1" w:space="0" w:color="CCCCCC"/>
+              <w:top w:val="single" w:color="CCCCCC" w:sz="0" w:space="0"/>
+              <w:left w:val="single" w:color="CCCCCC" w:sz="0" w:space="0"/>
+              <w:bottom w:val="single" w:color="CCCCCC" w:sz="0" w:space="0"/>
+              <w:right w:val="single" w:color="CCCCCC" w:sz="0" w:space="0"/>
             </w:tcBorders>
             <w:tcMar>
               <w:top w:w="80" w:type="dxa"/>
@@ -3785,10 +4053,10 @@
           <w:tcPr>
             <w:tcW w:w="2160" w:type="dxa"/>
             <w:tcBorders>
-              <w:top w:val="single" w:sz="1" w:space="0" w:color="CCCCCC"/>
-              <w:left w:val="single" w:sz="1" w:space="0" w:color="CCCCCC"/>
-              <w:bottom w:val="single" w:sz="1" w:space="0" w:color="CCCCCC"/>
-              <w:right w:val="single" w:sz="1" w:space="0" w:color="CCCCCC"/>
+              <w:top w:val="single" w:color="CCCCCC" w:sz="0" w:space="0"/>
+              <w:left w:val="single" w:color="CCCCCC" w:sz="0" w:space="0"/>
+              <w:bottom w:val="single" w:color="CCCCCC" w:sz="0" w:space="0"/>
+              <w:right w:val="single" w:color="CCCCCC" w:sz="0" w:space="0"/>
             </w:tcBorders>
             <w:tcMar>
               <w:top w:w="80" w:type="dxa"/>
@@ -3811,10 +4079,10 @@
           <w:tcPr>
             <w:tcW w:w="4800" w:type="dxa"/>
             <w:tcBorders>
-              <w:top w:val="single" w:sz="1" w:space="0" w:color="CCCCCC"/>
-              <w:left w:val="single" w:sz="1" w:space="0" w:color="CCCCCC"/>
-              <w:bottom w:val="single" w:sz="1" w:space="0" w:color="CCCCCC"/>
-              <w:right w:val="single" w:sz="1" w:space="0" w:color="CCCCCC"/>
+              <w:top w:val="single" w:color="CCCCCC" w:sz="0" w:space="0"/>
+              <w:left w:val="single" w:color="CCCCCC" w:sz="0" w:space="0"/>
+              <w:bottom w:val="single" w:color="CCCCCC" w:sz="0" w:space="0"/>
+              <w:right w:val="single" w:color="CCCCCC" w:sz="0" w:space="0"/>
             </w:tcBorders>
             <w:tcMar>
               <w:top w:w="80" w:type="dxa"/>
@@ -3843,7 +4111,7 @@
     <w:p>
       <w:pPr>
         <w:pBdr>
-          <w:bottom w:val="single" w:sz="4" w:space="4" w:color="2E3A87"/>
+          <w:bottom w:val="single" w:color="2E3A87" w:sz="4" w:space="4"/>
         </w:pBdr>
         <w:spacing w:before="180" w:after="80"/>
       </w:pPr>
@@ -3853,7 +4121,6 @@
           <w:bCs/>
           <w:color w:val="2E3A87"/>
         </w:rPr>
-        <w:lastRenderedPageBreak/>
         <w:t>5.  Technologies Used</w:t>
       </w:r>
     </w:p>
@@ -3864,7 +4131,7 @@
     </w:p>
     <w:p>
       <w:pPr>
-        <w:pStyle w:val="Heading2"/>
+        <w:pStyle w:val="3"/>
         <w:spacing w:before="240" w:after="120"/>
       </w:pPr>
       <w:r>
@@ -3873,10 +4140,10 @@
     </w:p>
     <w:p>
       <w:pPr>
-        <w:pStyle w:val="ListParagraph"/>
-        <w:numPr>
-          <w:ilvl w:val="0"/>
-          <w:numId w:val="2"/>
+        <w:pStyle w:val="17"/>
+        <w:numPr>
+          <w:ilvl w:val="0"/>
+          <w:numId w:val="1"/>
         </w:numPr>
         <w:spacing w:before="40" w:after="40"/>
       </w:pPr>
@@ -3886,10 +4153,10 @@
     </w:p>
     <w:p>
       <w:pPr>
-        <w:pStyle w:val="ListParagraph"/>
-        <w:numPr>
-          <w:ilvl w:val="0"/>
-          <w:numId w:val="2"/>
+        <w:pStyle w:val="17"/>
+        <w:numPr>
+          <w:ilvl w:val="0"/>
+          <w:numId w:val="1"/>
         </w:numPr>
         <w:spacing w:before="40" w:after="40"/>
       </w:pPr>
@@ -3899,10 +4166,10 @@
     </w:p>
     <w:p>
       <w:pPr>
-        <w:pStyle w:val="ListParagraph"/>
-        <w:numPr>
-          <w:ilvl w:val="0"/>
-          <w:numId w:val="2"/>
+        <w:pStyle w:val="17"/>
+        <w:numPr>
+          <w:ilvl w:val="0"/>
+          <w:numId w:val="1"/>
         </w:numPr>
         <w:spacing w:before="40" w:after="40"/>
       </w:pPr>
@@ -3912,10 +4179,10 @@
     </w:p>
     <w:p>
       <w:pPr>
-        <w:pStyle w:val="ListParagraph"/>
-        <w:numPr>
-          <w:ilvl w:val="0"/>
-          <w:numId w:val="2"/>
+        <w:pStyle w:val="17"/>
+        <w:numPr>
+          <w:ilvl w:val="0"/>
+          <w:numId w:val="1"/>
         </w:numPr>
         <w:spacing w:before="40" w:after="40"/>
       </w:pPr>
@@ -3925,10 +4192,10 @@
     </w:p>
     <w:p>
       <w:pPr>
-        <w:pStyle w:val="ListParagraph"/>
-        <w:numPr>
-          <w:ilvl w:val="0"/>
-          <w:numId w:val="2"/>
+        <w:pStyle w:val="17"/>
+        <w:numPr>
+          <w:ilvl w:val="0"/>
+          <w:numId w:val="1"/>
         </w:numPr>
         <w:spacing w:before="40" w:after="40"/>
       </w:pPr>
@@ -3938,10 +4205,10 @@
     </w:p>
     <w:p>
       <w:pPr>
-        <w:pStyle w:val="ListParagraph"/>
-        <w:numPr>
-          <w:ilvl w:val="0"/>
-          <w:numId w:val="2"/>
+        <w:pStyle w:val="17"/>
+        <w:numPr>
+          <w:ilvl w:val="0"/>
+          <w:numId w:val="1"/>
         </w:numPr>
         <w:spacing w:before="40" w:after="40"/>
       </w:pPr>
@@ -3951,10 +4218,10 @@
     </w:p>
     <w:p>
       <w:pPr>
-        <w:pStyle w:val="ListParagraph"/>
-        <w:numPr>
-          <w:ilvl w:val="0"/>
-          <w:numId w:val="2"/>
+        <w:pStyle w:val="17"/>
+        <w:numPr>
+          <w:ilvl w:val="0"/>
+          <w:numId w:val="1"/>
         </w:numPr>
         <w:spacing w:before="40" w:after="40"/>
       </w:pPr>
@@ -3964,10 +4231,10 @@
     </w:p>
     <w:p>
       <w:pPr>
-        <w:pStyle w:val="ListParagraph"/>
-        <w:numPr>
-          <w:ilvl w:val="0"/>
-          <w:numId w:val="2"/>
+        <w:pStyle w:val="17"/>
+        <w:numPr>
+          <w:ilvl w:val="0"/>
+          <w:numId w:val="1"/>
         </w:numPr>
         <w:spacing w:before="40" w:after="40"/>
       </w:pPr>
@@ -3977,10 +4244,10 @@
     </w:p>
     <w:p>
       <w:pPr>
-        <w:pStyle w:val="ListParagraph"/>
-        <w:numPr>
-          <w:ilvl w:val="0"/>
-          <w:numId w:val="2"/>
+        <w:pStyle w:val="17"/>
+        <w:numPr>
+          <w:ilvl w:val="0"/>
+          <w:numId w:val="1"/>
         </w:numPr>
         <w:spacing w:before="40" w:after="40"/>
       </w:pPr>
@@ -3990,10 +4257,10 @@
     </w:p>
     <w:p>
       <w:pPr>
-        <w:pStyle w:val="ListParagraph"/>
-        <w:numPr>
-          <w:ilvl w:val="0"/>
-          <w:numId w:val="2"/>
+        <w:pStyle w:val="17"/>
+        <w:numPr>
+          <w:ilvl w:val="0"/>
+          <w:numId w:val="1"/>
         </w:numPr>
         <w:spacing w:before="40" w:after="40"/>
       </w:pPr>
@@ -4003,10 +4270,10 @@
     </w:p>
     <w:p>
       <w:pPr>
-        <w:pStyle w:val="ListParagraph"/>
-        <w:numPr>
-          <w:ilvl w:val="0"/>
-          <w:numId w:val="2"/>
+        <w:pStyle w:val="17"/>
+        <w:numPr>
+          <w:ilvl w:val="0"/>
+          <w:numId w:val="1"/>
         </w:numPr>
         <w:spacing w:before="40" w:after="40"/>
       </w:pPr>
@@ -4021,7 +4288,7 @@
     </w:p>
     <w:p>
       <w:pPr>
-        <w:pStyle w:val="Heading2"/>
+        <w:pStyle w:val="3"/>
         <w:spacing w:before="240" w:after="120"/>
       </w:pPr>
       <w:r>
@@ -4030,10 +4297,10 @@
     </w:p>
     <w:p>
       <w:pPr>
-        <w:pStyle w:val="ListParagraph"/>
-        <w:numPr>
-          <w:ilvl w:val="0"/>
-          <w:numId w:val="2"/>
+        <w:pStyle w:val="17"/>
+        <w:numPr>
+          <w:ilvl w:val="0"/>
+          <w:numId w:val="1"/>
         </w:numPr>
         <w:spacing w:before="40" w:after="40"/>
       </w:pPr>
@@ -4043,10 +4310,10 @@
     </w:p>
     <w:p>
       <w:pPr>
-        <w:pStyle w:val="ListParagraph"/>
-        <w:numPr>
-          <w:ilvl w:val="0"/>
-          <w:numId w:val="2"/>
+        <w:pStyle w:val="17"/>
+        <w:numPr>
+          <w:ilvl w:val="0"/>
+          <w:numId w:val="1"/>
         </w:numPr>
         <w:spacing w:before="40" w:after="40"/>
       </w:pPr>
@@ -4056,10 +4323,10 @@
     </w:p>
     <w:p>
       <w:pPr>
-        <w:pStyle w:val="ListParagraph"/>
-        <w:numPr>
-          <w:ilvl w:val="0"/>
-          <w:numId w:val="2"/>
+        <w:pStyle w:val="17"/>
+        <w:numPr>
+          <w:ilvl w:val="0"/>
+          <w:numId w:val="1"/>
         </w:numPr>
         <w:spacing w:before="40" w:after="40"/>
       </w:pPr>
@@ -4069,10 +4336,10 @@
     </w:p>
     <w:p>
       <w:pPr>
-        <w:pStyle w:val="ListParagraph"/>
-        <w:numPr>
-          <w:ilvl w:val="0"/>
-          <w:numId w:val="2"/>
+        <w:pStyle w:val="17"/>
+        <w:numPr>
+          <w:ilvl w:val="0"/>
+          <w:numId w:val="1"/>
         </w:numPr>
         <w:spacing w:before="40" w:after="40"/>
       </w:pPr>
@@ -4082,10 +4349,10 @@
     </w:p>
     <w:p>
       <w:pPr>
-        <w:pStyle w:val="ListParagraph"/>
-        <w:numPr>
-          <w:ilvl w:val="0"/>
-          <w:numId w:val="2"/>
+        <w:pStyle w:val="17"/>
+        <w:numPr>
+          <w:ilvl w:val="0"/>
+          <w:numId w:val="1"/>
         </w:numPr>
         <w:spacing w:before="40" w:after="40"/>
       </w:pPr>
@@ -4095,10 +4362,10 @@
     </w:p>
     <w:p>
       <w:pPr>
-        <w:pStyle w:val="ListParagraph"/>
-        <w:numPr>
-          <w:ilvl w:val="0"/>
-          <w:numId w:val="2"/>
+        <w:pStyle w:val="17"/>
+        <w:numPr>
+          <w:ilvl w:val="0"/>
+          <w:numId w:val="1"/>
         </w:numPr>
         <w:spacing w:before="40" w:after="40"/>
       </w:pPr>
@@ -4113,7 +4380,7 @@
     </w:p>
     <w:p>
       <w:pPr>
-        <w:pStyle w:val="Heading2"/>
+        <w:pStyle w:val="3"/>
         <w:spacing w:before="240" w:after="120"/>
       </w:pPr>
       <w:r>
@@ -4122,10 +4389,10 @@
     </w:p>
     <w:p>
       <w:pPr>
-        <w:pStyle w:val="ListParagraph"/>
-        <w:numPr>
-          <w:ilvl w:val="0"/>
-          <w:numId w:val="2"/>
+        <w:pStyle w:val="17"/>
+        <w:numPr>
+          <w:ilvl w:val="0"/>
+          <w:numId w:val="1"/>
         </w:numPr>
         <w:spacing w:before="40" w:after="40"/>
       </w:pPr>
@@ -4135,10 +4402,10 @@
     </w:p>
     <w:p>
       <w:pPr>
-        <w:pStyle w:val="ListParagraph"/>
-        <w:numPr>
-          <w:ilvl w:val="0"/>
-          <w:numId w:val="2"/>
+        <w:pStyle w:val="17"/>
+        <w:numPr>
+          <w:ilvl w:val="0"/>
+          <w:numId w:val="1"/>
         </w:numPr>
         <w:spacing w:before="40" w:after="40"/>
       </w:pPr>
@@ -4148,10 +4415,10 @@
     </w:p>
     <w:p>
       <w:pPr>
-        <w:pStyle w:val="ListParagraph"/>
-        <w:numPr>
-          <w:ilvl w:val="0"/>
-          <w:numId w:val="2"/>
+        <w:pStyle w:val="17"/>
+        <w:numPr>
+          <w:ilvl w:val="0"/>
+          <w:numId w:val="1"/>
         </w:numPr>
         <w:spacing w:before="40" w:after="40"/>
       </w:pPr>
@@ -4161,10 +4428,10 @@
     </w:p>
     <w:p>
       <w:pPr>
-        <w:pStyle w:val="ListParagraph"/>
-        <w:numPr>
-          <w:ilvl w:val="0"/>
-          <w:numId w:val="2"/>
+        <w:pStyle w:val="17"/>
+        <w:numPr>
+          <w:ilvl w:val="0"/>
+          <w:numId w:val="1"/>
         </w:numPr>
         <w:spacing w:before="40" w:after="40"/>
       </w:pPr>
@@ -4174,10 +4441,10 @@
     </w:p>
     <w:p>
       <w:pPr>
-        <w:pStyle w:val="ListParagraph"/>
-        <w:numPr>
-          <w:ilvl w:val="0"/>
-          <w:numId w:val="2"/>
+        <w:pStyle w:val="17"/>
+        <w:numPr>
+          <w:ilvl w:val="0"/>
+          <w:numId w:val="1"/>
         </w:numPr>
         <w:spacing w:before="40" w:after="40"/>
       </w:pPr>
@@ -4187,10 +4454,10 @@
     </w:p>
     <w:p>
       <w:pPr>
-        <w:pStyle w:val="ListParagraph"/>
-        <w:numPr>
-          <w:ilvl w:val="0"/>
-          <w:numId w:val="2"/>
+        <w:pStyle w:val="17"/>
+        <w:numPr>
+          <w:ilvl w:val="0"/>
+          <w:numId w:val="1"/>
         </w:numPr>
         <w:spacing w:before="40" w:after="40"/>
       </w:pPr>
@@ -4200,10 +4467,10 @@
     </w:p>
     <w:p>
       <w:pPr>
-        <w:pStyle w:val="ListParagraph"/>
-        <w:numPr>
-          <w:ilvl w:val="0"/>
-          <w:numId w:val="2"/>
+        <w:pStyle w:val="17"/>
+        <w:numPr>
+          <w:ilvl w:val="0"/>
+          <w:numId w:val="1"/>
         </w:numPr>
         <w:spacing w:before="40" w:after="40"/>
       </w:pPr>
@@ -4213,10 +4480,10 @@
     </w:p>
     <w:p>
       <w:pPr>
-        <w:pStyle w:val="ListParagraph"/>
-        <w:numPr>
-          <w:ilvl w:val="0"/>
-          <w:numId w:val="2"/>
+        <w:pStyle w:val="17"/>
+        <w:numPr>
+          <w:ilvl w:val="0"/>
+          <w:numId w:val="1"/>
         </w:numPr>
         <w:spacing w:before="40" w:after="40"/>
       </w:pPr>
@@ -4227,106 +4494,20 @@
     <w:sectPr>
       <w:pgSz w:w="12240" w:h="15840"/>
       <w:pgMar w:top="1440" w:right="1440" w:bottom="1440" w:left="1440" w:header="708" w:footer="708" w:gutter="0"/>
-      <w:cols w:space="720"/>
-      <w:docGrid w:linePitch="360"/>
+      <w:cols w:space="720" w:num="1"/>
+      <w:docGrid w:linePitch="360" w:charSpace="0"/>
     </w:sectPr>
   </w:body>
 </w:document>
 </file>
 
 <file path=word/numbering.xml><?xml version="1.0" encoding="utf-8"?>
-<w:numbering xmlns:wpc="http://schemas.microsoft.com/office/word/2010/wordprocessingCanvas" xmlns:cx="http://schemas.microsoft.com/office/drawing/2014/chartex" xmlns:cx1="http://schemas.microsoft.com/office/drawing/2015/9/8/chartex" xmlns:cx2="http://schemas.microsoft.com/office/drawing/2015/10/21/chartex" xmlns:cx3="http://schemas.microsoft.com/office/drawing/2016/5/9/chartex" xmlns:cx4="http://schemas.microsoft.com/office/drawing/2016/5/10/chartex" xmlns:cx5="http://schemas.microsoft.com/office/drawing/2016/5/11/chartex" xmlns:cx6="http://schemas.microsoft.com/office/drawing/2016/5/12/chartex" xmlns:cx7="http://schemas.microsoft.com/office/drawing/2016/5/13/chartex" xmlns:cx8="http://schemas.microsoft.com/office/drawing/2016/5/14/chartex" xmlns:mc="http://schemas.openxmlformats.org/markup-compatibility/2006" xmlns:aink="http://schemas.microsoft.com/office/drawing/2016/ink" xmlns:am3d="http://schemas.microsoft.com/office/drawing/2017/model3d" xmlns:o="urn:schemas-microsoft-com:office:office" xmlns:oel="http://schemas.microsoft.com/office/2019/extlst" xmlns:r="http://schemas.openxmlformats.org/officeDocument/2006/relationships" xmlns:m="http://schemas.openxmlformats.org/officeDocument/2006/math" xmlns:v="urn:schemas-microsoft-com:vml" xmlns:wp14="http://schemas.microsoft.com/office/word/2010/wordprocessingDrawing" xmlns:wp="http://schemas.openxmlformats.org/drawingml/2006/wordprocessingDrawing" xmlns:w10="urn:schemas-microsoft-com:office:word" xmlns:w="http://schemas.openxmlformats.org/wordprocessingml/2006/main" xmlns:w14="http://schemas.microsoft.com/office/word/2010/wordml" xmlns:w15="http://schemas.microsoft.com/office/word/2012/wordml" xmlns:w16cex="http://schemas.microsoft.com/office/word/2018/wordml/cex" xmlns:w16cid="http://schemas.microsoft.com/office/word/2016/wordml/cid" xmlns:w16="http://schemas.microsoft.com/office/word/2018/wordml" xmlns:w16du="http://schemas.microsoft.com/office/word/2023/wordml/word16du" xmlns:w16sdtdh="http://schemas.microsoft.com/office/word/2020/wordml/sdtdatahash" xmlns:w16sdtfl="http://schemas.microsoft.com/office/word/2024/wordml/sdtformatlock" xmlns:w16se="http://schemas.microsoft.com/office/word/2015/wordml/symex" xmlns:wpg="http://schemas.microsoft.com/office/word/2010/wordprocessingGroup" xmlns:wpi="http://schemas.microsoft.com/office/word/2010/wordprocessingInk" xmlns:wne="http://schemas.microsoft.com/office/word/2006/wordml" xmlns:wps="http://schemas.microsoft.com/office/word/2010/wordprocessingShape" mc:Ignorable="w14 w15 w16se w16cid w16 w16cex w16sdtdh w16sdtfl w16du wp14">
-  <w:abstractNum w:abstractNumId="0" w15:restartNumberingAfterBreak="0">
-    <w:nsid w:val="03062CA4"/>
-    <w:multiLevelType w:val="hybridMultilevel"/>
-    <w:tmpl w:val="818EA0F0"/>
-    <w:lvl w:ilvl="0" w:tplc="BEBEFAFC">
-      <w:start w:val="1"/>
-      <w:numFmt w:val="bullet"/>
-      <w:lvlText w:val="●"/>
-      <w:lvlJc w:val="left"/>
-      <w:pPr>
-        <w:ind w:left="720" w:hanging="360"/>
-      </w:pPr>
-    </w:lvl>
-    <w:lvl w:ilvl="1" w:tplc="52D882BC">
-      <w:start w:val="1"/>
-      <w:numFmt w:val="bullet"/>
-      <w:lvlText w:val="○"/>
-      <w:lvlJc w:val="left"/>
-      <w:pPr>
-        <w:ind w:left="1440" w:hanging="360"/>
-      </w:pPr>
-    </w:lvl>
-    <w:lvl w:ilvl="2" w:tplc="DBB65C40">
-      <w:start w:val="1"/>
-      <w:numFmt w:val="bullet"/>
-      <w:lvlText w:val="■"/>
-      <w:lvlJc w:val="left"/>
-      <w:pPr>
-        <w:ind w:left="2160" w:hanging="360"/>
-      </w:pPr>
-    </w:lvl>
-    <w:lvl w:ilvl="3" w:tplc="5BCADC2E">
-      <w:start w:val="1"/>
-      <w:numFmt w:val="bullet"/>
-      <w:lvlText w:val="●"/>
-      <w:lvlJc w:val="left"/>
-      <w:pPr>
-        <w:ind w:left="2880" w:hanging="360"/>
-      </w:pPr>
-    </w:lvl>
-    <w:lvl w:ilvl="4" w:tplc="6D6E93A8">
-      <w:start w:val="1"/>
-      <w:numFmt w:val="bullet"/>
-      <w:lvlText w:val="○"/>
-      <w:lvlJc w:val="left"/>
-      <w:pPr>
-        <w:ind w:left="3600" w:hanging="360"/>
-      </w:pPr>
-    </w:lvl>
-    <w:lvl w:ilvl="5" w:tplc="3FA06192">
-      <w:start w:val="1"/>
-      <w:numFmt w:val="bullet"/>
-      <w:lvlText w:val="■"/>
-      <w:lvlJc w:val="left"/>
-      <w:pPr>
-        <w:ind w:left="4320" w:hanging="360"/>
-      </w:pPr>
-    </w:lvl>
-    <w:lvl w:ilvl="6" w:tplc="B2A4BD02">
-      <w:start w:val="1"/>
-      <w:numFmt w:val="bullet"/>
-      <w:lvlText w:val="●"/>
-      <w:lvlJc w:val="left"/>
-      <w:pPr>
-        <w:ind w:left="5040" w:hanging="360"/>
-      </w:pPr>
-    </w:lvl>
-    <w:lvl w:ilvl="7" w:tplc="AE28B680">
-      <w:start w:val="1"/>
-      <w:numFmt w:val="bullet"/>
-      <w:lvlText w:val="●"/>
-      <w:lvlJc w:val="left"/>
-      <w:pPr>
-        <w:ind w:left="5760" w:hanging="360"/>
-      </w:pPr>
-    </w:lvl>
-    <w:lvl w:ilvl="8" w:tplc="CD92DF9A">
-      <w:start w:val="1"/>
-      <w:numFmt w:val="bullet"/>
-      <w:lvlText w:val="●"/>
-      <w:lvlJc w:val="left"/>
-      <w:pPr>
-        <w:ind w:left="6480" w:hanging="360"/>
-      </w:pPr>
-    </w:lvl>
-  </w:abstractNum>
-  <w:abstractNum w:abstractNumId="1" w15:restartNumberingAfterBreak="0">
+<w:numbering xmlns:wpc="http://schemas.microsoft.com/office/word/2010/wordprocessingCanvas" xmlns:mc="http://schemas.openxmlformats.org/markup-compatibility/2006" xmlns:o="urn:schemas-microsoft-com:office:office" xmlns:r="http://schemas.openxmlformats.org/officeDocument/2006/relationships" xmlns:m="http://schemas.openxmlformats.org/officeDocument/2006/math" xmlns:v="urn:schemas-microsoft-com:vml" xmlns:wp14="http://schemas.microsoft.com/office/word/2010/wordprocessingDrawing" xmlns:wp="http://schemas.openxmlformats.org/drawingml/2006/wordprocessingDrawing" xmlns:w10="urn:schemas-microsoft-com:office:word" xmlns:w="http://schemas.openxmlformats.org/wordprocessingml/2006/main" xmlns:w14="http://schemas.microsoft.com/office/word/2010/wordml" xmlns:wpg="http://schemas.microsoft.com/office/word/2010/wordprocessingGroup" xmlns:wpi="http://schemas.microsoft.com/office/word/2010/wordprocessingInk" xmlns:wne="http://schemas.microsoft.com/office/word/2006/wordml" xmlns:wps="http://schemas.microsoft.com/office/word/2010/wordprocessingShape" xmlns:wpsCustomData="http://www.wps.cn/officeDocument/2013/wpsCustomData" mc:Ignorable="w14 wp14">
+  <w:abstractNum w:abstractNumId="0">
     <w:nsid w:val="1B117F1B"/>
-    <w:multiLevelType w:val="hybridMultilevel"/>
-    <w:tmpl w:val="0154567A"/>
-    <w:lvl w:ilvl="0" w:tplc="ED7E84CA">
+    <w:multiLevelType w:val="multilevel"/>
+    <w:tmpl w:val="1B117F1B"/>
+    <w:lvl w:ilvl="0" w:tentative="0">
       <w:start w:val="1"/>
       <w:numFmt w:val="bullet"/>
       <w:lvlText w:val="-"/>
@@ -4335,52 +4516,60 @@
         <w:ind w:left="1080" w:hanging="360"/>
       </w:pPr>
     </w:lvl>
-    <w:lvl w:ilvl="1" w:tplc="A2C4B102">
+    <w:lvl w:ilvl="1" w:tentative="0">
+      <w:start w:val="0"/>
       <w:numFmt w:val="decimal"/>
       <w:lvlText w:val=""/>
       <w:lvlJc w:val="left"/>
     </w:lvl>
-    <w:lvl w:ilvl="2" w:tplc="05A60698">
+    <w:lvl w:ilvl="2" w:tentative="0">
+      <w:start w:val="0"/>
       <w:numFmt w:val="decimal"/>
       <w:lvlText w:val=""/>
       <w:lvlJc w:val="left"/>
     </w:lvl>
-    <w:lvl w:ilvl="3" w:tplc="40C4EEC6">
+    <w:lvl w:ilvl="3" w:tentative="0">
+      <w:start w:val="0"/>
       <w:numFmt w:val="decimal"/>
       <w:lvlText w:val=""/>
       <w:lvlJc w:val="left"/>
     </w:lvl>
-    <w:lvl w:ilvl="4" w:tplc="E0024CA8">
+    <w:lvl w:ilvl="4" w:tentative="0">
+      <w:start w:val="0"/>
       <w:numFmt w:val="decimal"/>
       <w:lvlText w:val=""/>
       <w:lvlJc w:val="left"/>
     </w:lvl>
-    <w:lvl w:ilvl="5" w:tplc="1E88A98E">
+    <w:lvl w:ilvl="5" w:tentative="0">
+      <w:start w:val="0"/>
       <w:numFmt w:val="decimal"/>
       <w:lvlText w:val=""/>
       <w:lvlJc w:val="left"/>
     </w:lvl>
-    <w:lvl w:ilvl="6" w:tplc="4A007828">
+    <w:lvl w:ilvl="6" w:tentative="0">
+      <w:start w:val="0"/>
       <w:numFmt w:val="decimal"/>
       <w:lvlText w:val=""/>
       <w:lvlJc w:val="left"/>
     </w:lvl>
-    <w:lvl w:ilvl="7" w:tplc="2416B566">
+    <w:lvl w:ilvl="7" w:tentative="0">
+      <w:start w:val="0"/>
       <w:numFmt w:val="decimal"/>
       <w:lvlText w:val=""/>
       <w:lvlJc w:val="left"/>
     </w:lvl>
-    <w:lvl w:ilvl="8" w:tplc="95D8153C">
+    <w:lvl w:ilvl="8" w:tentative="0">
+      <w:start w:val="0"/>
       <w:numFmt w:val="decimal"/>
       <w:lvlText w:val=""/>
       <w:lvlJc w:val="left"/>
     </w:lvl>
   </w:abstractNum>
-  <w:abstractNum w:abstractNumId="2" w15:restartNumberingAfterBreak="0">
+  <w:abstractNum w:abstractNumId="1">
     <w:nsid w:val="52B1289B"/>
-    <w:multiLevelType w:val="hybridMultilevel"/>
-    <w:tmpl w:val="FEDCC088"/>
-    <w:lvl w:ilvl="0" w:tplc="D4FA06BA">
+    <w:multiLevelType w:val="multilevel"/>
+    <w:tmpl w:val="52B1289B"/>
+    <w:lvl w:ilvl="0" w:tentative="0">
       <w:start w:val="1"/>
       <w:numFmt w:val="bullet"/>
       <w:lvlText w:val="•"/>
@@ -4389,115 +4578,63 @@
         <w:ind w:left="720" w:hanging="360"/>
       </w:pPr>
     </w:lvl>
-    <w:lvl w:ilvl="1" w:tplc="79343D1C">
+    <w:lvl w:ilvl="1" w:tentative="0">
+      <w:start w:val="0"/>
       <w:numFmt w:val="decimal"/>
       <w:lvlText w:val=""/>
       <w:lvlJc w:val="left"/>
     </w:lvl>
-    <w:lvl w:ilvl="2" w:tplc="CA468650">
+    <w:lvl w:ilvl="2" w:tentative="0">
+      <w:start w:val="0"/>
       <w:numFmt w:val="decimal"/>
       <w:lvlText w:val=""/>
       <w:lvlJc w:val="left"/>
     </w:lvl>
-    <w:lvl w:ilvl="3" w:tplc="3E4A06BC">
+    <w:lvl w:ilvl="3" w:tentative="0">
+      <w:start w:val="0"/>
       <w:numFmt w:val="decimal"/>
       <w:lvlText w:val=""/>
       <w:lvlJc w:val="left"/>
     </w:lvl>
-    <w:lvl w:ilvl="4" w:tplc="AA0E7DF2">
+    <w:lvl w:ilvl="4" w:tentative="0">
+      <w:start w:val="0"/>
       <w:numFmt w:val="decimal"/>
       <w:lvlText w:val=""/>
       <w:lvlJc w:val="left"/>
     </w:lvl>
-    <w:lvl w:ilvl="5" w:tplc="09321024">
+    <w:lvl w:ilvl="5" w:tentative="0">
+      <w:start w:val="0"/>
       <w:numFmt w:val="decimal"/>
       <w:lvlText w:val=""/>
       <w:lvlJc w:val="left"/>
     </w:lvl>
-    <w:lvl w:ilvl="6" w:tplc="8A903E50">
+    <w:lvl w:ilvl="6" w:tentative="0">
+      <w:start w:val="0"/>
       <w:numFmt w:val="decimal"/>
       <w:lvlText w:val=""/>
       <w:lvlJc w:val="left"/>
     </w:lvl>
-    <w:lvl w:ilvl="7" w:tplc="DB784F2C">
+    <w:lvl w:ilvl="7" w:tentative="0">
+      <w:start w:val="0"/>
       <w:numFmt w:val="decimal"/>
       <w:lvlText w:val=""/>
       <w:lvlJc w:val="left"/>
     </w:lvl>
-    <w:lvl w:ilvl="8" w:tplc="990ABBAE">
+    <w:lvl w:ilvl="8" w:tentative="0">
+      <w:start w:val="0"/>
       <w:numFmt w:val="decimal"/>
       <w:lvlText w:val=""/>
       <w:lvlJc w:val="left"/>
     </w:lvl>
   </w:abstractNum>
-  <w:abstractNum w:abstractNumId="3" w15:restartNumberingAfterBreak="0">
-    <w:nsid w:val="72C541FB"/>
-    <w:multiLevelType w:val="hybridMultilevel"/>
-    <w:tmpl w:val="DAA0DEC4"/>
-    <w:lvl w:ilvl="0" w:tplc="9D322C1E">
-      <w:start w:val="1"/>
-      <w:numFmt w:val="decimal"/>
-      <w:lvlText w:val="%1."/>
-      <w:lvlJc w:val="left"/>
-      <w:pPr>
-        <w:ind w:left="720" w:hanging="360"/>
-      </w:pPr>
-    </w:lvl>
-    <w:lvl w:ilvl="1" w:tplc="CF8A794C">
-      <w:numFmt w:val="decimal"/>
-      <w:lvlText w:val=""/>
-      <w:lvlJc w:val="left"/>
-    </w:lvl>
-    <w:lvl w:ilvl="2" w:tplc="BDFAAACA">
-      <w:numFmt w:val="decimal"/>
-      <w:lvlText w:val=""/>
-      <w:lvlJc w:val="left"/>
-    </w:lvl>
-    <w:lvl w:ilvl="3" w:tplc="A1C0BB9A">
-      <w:numFmt w:val="decimal"/>
-      <w:lvlText w:val=""/>
-      <w:lvlJc w:val="left"/>
-    </w:lvl>
-    <w:lvl w:ilvl="4" w:tplc="9DB82D8E">
-      <w:numFmt w:val="decimal"/>
-      <w:lvlText w:val=""/>
-      <w:lvlJc w:val="left"/>
-    </w:lvl>
-    <w:lvl w:ilvl="5" w:tplc="1054D99C">
-      <w:numFmt w:val="decimal"/>
-      <w:lvlText w:val=""/>
-      <w:lvlJc w:val="left"/>
-    </w:lvl>
-    <w:lvl w:ilvl="6" w:tplc="B65C8448">
-      <w:numFmt w:val="decimal"/>
-      <w:lvlText w:val=""/>
-      <w:lvlJc w:val="left"/>
-    </w:lvl>
-    <w:lvl w:ilvl="7" w:tplc="4890281C">
-      <w:numFmt w:val="decimal"/>
-      <w:lvlText w:val=""/>
-      <w:lvlJc w:val="left"/>
-    </w:lvl>
-    <w:lvl w:ilvl="8" w:tplc="2EC20D44">
-      <w:numFmt w:val="decimal"/>
-      <w:lvlText w:val=""/>
-      <w:lvlJc w:val="left"/>
-    </w:lvl>
-  </w:abstractNum>
-  <w:num w:numId="1" w16cid:durableId="625234396">
-    <w:abstractNumId w:val="0"/>
+  <w:num w:numId="1">
+    <w:abstractNumId w:val="1"/>
     <w:lvlOverride w:ilvl="0">
       <w:startOverride w:val="1"/>
     </w:lvlOverride>
   </w:num>
-  <w:num w:numId="2" w16cid:durableId="1036586551">
-    <w:abstractNumId w:val="2"/>
-    <w:lvlOverride w:ilvl="0">
-      <w:startOverride w:val="1"/>
-    </w:lvlOverride>
-  </w:num>
-  <w:num w:numId="3" w16cid:durableId="1303805252">
-    <w:abstractNumId w:val="1"/>
+  <w:num w:numId="2">
+    <w:abstractNumId w:val="0"/>
     <w:lvlOverride w:ilvl="0">
       <w:startOverride w:val="1"/>
     </w:lvlOverride>
@@ -4506,502 +4643,398 @@
 </file>
 
 <file path=word/styles.xml><?xml version="1.0" encoding="utf-8"?>
-<w:styles xmlns:mc="http://schemas.openxmlformats.org/markup-compatibility/2006" xmlns:r="http://schemas.openxmlformats.org/officeDocument/2006/relationships" xmlns:w="http://schemas.openxmlformats.org/wordprocessingml/2006/main" xmlns:w14="http://schemas.microsoft.com/office/word/2010/wordml" xmlns:w15="http://schemas.microsoft.com/office/word/2012/wordml" xmlns:w16cex="http://schemas.microsoft.com/office/word/2018/wordml/cex" xmlns:w16cid="http://schemas.microsoft.com/office/word/2016/wordml/cid" xmlns:w16="http://schemas.microsoft.com/office/word/2018/wordml" xmlns:w16du="http://schemas.microsoft.com/office/word/2023/wordml/word16du" xmlns:w16sdtdh="http://schemas.microsoft.com/office/word/2020/wordml/sdtdatahash" xmlns:w16sdtfl="http://schemas.microsoft.com/office/word/2024/wordml/sdtformatlock" xmlns:w16se="http://schemas.microsoft.com/office/word/2015/wordml/symex" mc:Ignorable="w14 w15 w16se w16cid w16 w16cex w16sdtdh w16sdtfl w16du">
+<w:styles xmlns:mc="http://schemas.openxmlformats.org/markup-compatibility/2006" xmlns:o="urn:schemas-microsoft-com:office:office" xmlns:r="http://schemas.openxmlformats.org/officeDocument/2006/relationships" xmlns:m="http://schemas.openxmlformats.org/officeDocument/2006/math" xmlns:v="urn:schemas-microsoft-com:vml" xmlns:w="http://schemas.openxmlformats.org/wordprocessingml/2006/main" xmlns:w14="http://schemas.microsoft.com/office/word/2010/wordml" xmlns:w10="urn:schemas-microsoft-com:office:word" xmlns:sl="http://schemas.openxmlformats.org/schemaLibrary/2006/main" xmlns:wpsCustomData="http://www.wps.cn/officeDocument/2013/wpsCustomData" mc:Ignorable="w14">
   <w:docDefaults>
     <w:rPrDefault>
       <w:rPr>
-        <w:rFonts w:ascii="Arial" w:eastAsia="Arial" w:hAnsi="Arial" w:cs="Arial"/>
-        <w:sz w:val="22"/>
-        <w:szCs w:val="22"/>
-        <w:lang w:val="en-US" w:eastAsia="en-US" w:bidi="ar-SA"/>
+        <w:rFonts w:ascii="Arial" w:hAnsi="Arial" w:eastAsia="Arial" w:cs="Arial"/>
       </w:rPr>
     </w:rPrDefault>
     <w:pPrDefault/>
   </w:docDefaults>
-  <w:latentStyles w:defLockedState="0" w:defUIPriority="99" w:defSemiHidden="0" w:defUnhideWhenUsed="0" w:defQFormat="0" w:count="376">
-    <w:lsdException w:name="Normal" w:uiPriority="0" w:qFormat="1"/>
-    <w:lsdException w:name="heading 1" w:uiPriority="9" w:qFormat="1"/>
-    <w:lsdException w:name="heading 2" w:semiHidden="1" w:uiPriority="9" w:unhideWhenUsed="1" w:qFormat="1"/>
-    <w:lsdException w:name="heading 3" w:semiHidden="1" w:uiPriority="9" w:unhideWhenUsed="1" w:qFormat="1"/>
-    <w:lsdException w:name="heading 4" w:semiHidden="1" w:uiPriority="9" w:unhideWhenUsed="1" w:qFormat="1"/>
-    <w:lsdException w:name="heading 5" w:semiHidden="1" w:uiPriority="9" w:unhideWhenUsed="1" w:qFormat="1"/>
-    <w:lsdException w:name="heading 6" w:semiHidden="1" w:uiPriority="9" w:unhideWhenUsed="1" w:qFormat="1"/>
-    <w:lsdException w:name="heading 7" w:semiHidden="1" w:uiPriority="9" w:unhideWhenUsed="1" w:qFormat="1"/>
-    <w:lsdException w:name="heading 8" w:semiHidden="1" w:uiPriority="9" w:unhideWhenUsed="1" w:qFormat="1"/>
-    <w:lsdException w:name="heading 9" w:semiHidden="1" w:uiPriority="9" w:unhideWhenUsed="1" w:qFormat="1"/>
-    <w:lsdException w:name="index 1" w:semiHidden="1" w:unhideWhenUsed="1"/>
-    <w:lsdException w:name="index 2" w:semiHidden="1" w:unhideWhenUsed="1"/>
-    <w:lsdException w:name="index 3" w:semiHidden="1" w:unhideWhenUsed="1"/>
-    <w:lsdException w:name="index 4" w:semiHidden="1" w:unhideWhenUsed="1"/>
-    <w:lsdException w:name="index 5" w:semiHidden="1" w:unhideWhenUsed="1"/>
-    <w:lsdException w:name="index 6" w:semiHidden="1" w:unhideWhenUsed="1"/>
-    <w:lsdException w:name="index 7" w:semiHidden="1" w:unhideWhenUsed="1"/>
-    <w:lsdException w:name="index 8" w:semiHidden="1" w:unhideWhenUsed="1"/>
-    <w:lsdException w:name="index 9" w:semiHidden="1" w:unhideWhenUsed="1"/>
-    <w:lsdException w:name="toc 1" w:semiHidden="1" w:uiPriority="39" w:unhideWhenUsed="1"/>
-    <w:lsdException w:name="toc 2" w:semiHidden="1" w:uiPriority="39" w:unhideWhenUsed="1"/>
-    <w:lsdException w:name="toc 3" w:semiHidden="1" w:uiPriority="39" w:unhideWhenUsed="1"/>
-    <w:lsdException w:name="toc 4" w:semiHidden="1" w:uiPriority="39" w:unhideWhenUsed="1"/>
-    <w:lsdException w:name="toc 5" w:semiHidden="1" w:uiPriority="39" w:unhideWhenUsed="1"/>
-    <w:lsdException w:name="toc 6" w:semiHidden="1" w:uiPriority="39" w:unhideWhenUsed="1"/>
-    <w:lsdException w:name="toc 7" w:semiHidden="1" w:uiPriority="39" w:unhideWhenUsed="1"/>
-    <w:lsdException w:name="toc 8" w:semiHidden="1" w:uiPriority="39" w:unhideWhenUsed="1"/>
-    <w:lsdException w:name="toc 9" w:semiHidden="1" w:uiPriority="39" w:unhideWhenUsed="1"/>
-    <w:lsdException w:name="Normal Indent" w:semiHidden="1" w:unhideWhenUsed="1"/>
-    <w:lsdException w:name="footnote text" w:semiHidden="1" w:unhideWhenUsed="1"/>
-    <w:lsdException w:name="annotation text" w:semiHidden="1" w:unhideWhenUsed="1"/>
-    <w:lsdException w:name="header" w:semiHidden="1" w:unhideWhenUsed="1"/>
-    <w:lsdException w:name="footer" w:semiHidden="1" w:unhideWhenUsed="1"/>
-    <w:lsdException w:name="index heading" w:semiHidden="1" w:unhideWhenUsed="1"/>
-    <w:lsdException w:name="caption" w:semiHidden="1" w:uiPriority="35" w:unhideWhenUsed="1" w:qFormat="1"/>
-    <w:lsdException w:name="table of figures" w:semiHidden="1" w:unhideWhenUsed="1"/>
-    <w:lsdException w:name="envelope address" w:semiHidden="1" w:unhideWhenUsed="1"/>
-    <w:lsdException w:name="envelope return" w:semiHidden="1" w:unhideWhenUsed="1"/>
-    <w:lsdException w:name="footnote reference" w:semiHidden="1" w:unhideWhenUsed="1"/>
-    <w:lsdException w:name="annotation reference" w:semiHidden="1" w:unhideWhenUsed="1"/>
-    <w:lsdException w:name="line number" w:semiHidden="1" w:unhideWhenUsed="1"/>
-    <w:lsdException w:name="page number" w:semiHidden="1" w:unhideWhenUsed="1"/>
-    <w:lsdException w:name="endnote reference" w:semiHidden="1" w:unhideWhenUsed="1"/>
-    <w:lsdException w:name="endnote text" w:semiHidden="1" w:unhideWhenUsed="1"/>
-    <w:lsdException w:name="table of authorities" w:semiHidden="1" w:unhideWhenUsed="1"/>
-    <w:lsdException w:name="macro" w:semiHidden="1" w:unhideWhenUsed="1"/>
-    <w:lsdException w:name="toa heading" w:semiHidden="1" w:unhideWhenUsed="1"/>
-    <w:lsdException w:name="List" w:semiHidden="1" w:unhideWhenUsed="1"/>
-    <w:lsdException w:name="List Bullet" w:semiHidden="1" w:unhideWhenUsed="1"/>
-    <w:lsdException w:name="List Number" w:semiHidden="1" w:unhideWhenUsed="1"/>
-    <w:lsdException w:name="List 2" w:semiHidden="1" w:unhideWhenUsed="1"/>
-    <w:lsdException w:name="List 3" w:semiHidden="1" w:unhideWhenUsed="1"/>
-    <w:lsdException w:name="List 4" w:semiHidden="1" w:unhideWhenUsed="1"/>
-    <w:lsdException w:name="List 5" w:semiHidden="1" w:unhideWhenUsed="1"/>
-    <w:lsdException w:name="List Bullet 2" w:semiHidden="1" w:unhideWhenUsed="1"/>
-    <w:lsdException w:name="List Bullet 3" w:semiHidden="1" w:unhideWhenUsed="1"/>
-    <w:lsdException w:name="List Bullet 4" w:semiHidden="1" w:unhideWhenUsed="1"/>
-    <w:lsdException w:name="List Bullet 5" w:semiHidden="1" w:unhideWhenUsed="1"/>
-    <w:lsdException w:name="List Number 2" w:semiHidden="1" w:unhideWhenUsed="1"/>
-    <w:lsdException w:name="List Number 3" w:semiHidden="1" w:unhideWhenUsed="1"/>
-    <w:lsdException w:name="List Number 4" w:semiHidden="1" w:unhideWhenUsed="1"/>
-    <w:lsdException w:name="List Number 5" w:semiHidden="1" w:unhideWhenUsed="1"/>
-    <w:lsdException w:name="Title" w:uiPriority="10" w:qFormat="1"/>
-    <w:lsdException w:name="Closing" w:semiHidden="1" w:unhideWhenUsed="1"/>
-    <w:lsdException w:name="Signature" w:semiHidden="1" w:unhideWhenUsed="1"/>
-    <w:lsdException w:name="Default Paragraph Font" w:semiHidden="1" w:uiPriority="1" w:unhideWhenUsed="1"/>
-    <w:lsdException w:name="Body Text" w:semiHidden="1" w:unhideWhenUsed="1"/>
-    <w:lsdException w:name="Body Text Indent" w:semiHidden="1" w:unhideWhenUsed="1"/>
-    <w:lsdException w:name="List Continue" w:semiHidden="1" w:unhideWhenUsed="1"/>
-    <w:lsdException w:name="List Continue 2" w:semiHidden="1" w:unhideWhenUsed="1"/>
-    <w:lsdException w:name="List Continue 3" w:semiHidden="1" w:unhideWhenUsed="1"/>
-    <w:lsdException w:name="List Continue 4" w:semiHidden="1" w:unhideWhenUsed="1"/>
-    <w:lsdException w:name="List Continue 5" w:semiHidden="1" w:unhideWhenUsed="1"/>
-    <w:lsdException w:name="Message Header" w:semiHidden="1" w:unhideWhenUsed="1"/>
-    <w:lsdException w:name="Subtitle" w:uiPriority="11" w:qFormat="1"/>
-    <w:lsdException w:name="Salutation" w:semiHidden="1" w:unhideWhenUsed="1"/>
-    <w:lsdException w:name="Date" w:semiHidden="1" w:unhideWhenUsed="1"/>
-    <w:lsdException w:name="Body Text First Indent" w:semiHidden="1" w:unhideWhenUsed="1"/>
-    <w:lsdException w:name="Body Text First Indent 2" w:semiHidden="1" w:unhideWhenUsed="1"/>
-    <w:lsdException w:name="Note Heading" w:semiHidden="1" w:unhideWhenUsed="1"/>
-    <w:lsdException w:name="Body Text 2" w:semiHidden="1" w:unhideWhenUsed="1"/>
-    <w:lsdException w:name="Body Text 3" w:semiHidden="1" w:unhideWhenUsed="1"/>
-    <w:lsdException w:name="Body Text Indent 2" w:semiHidden="1" w:unhideWhenUsed="1"/>
-    <w:lsdException w:name="Body Text Indent 3" w:semiHidden="1" w:unhideWhenUsed="1"/>
-    <w:lsdException w:name="Block Text" w:semiHidden="1" w:unhideWhenUsed="1"/>
-    <w:lsdException w:name="Hyperlink" w:semiHidden="1" w:unhideWhenUsed="1"/>
-    <w:lsdException w:name="FollowedHyperlink" w:semiHidden="1" w:unhideWhenUsed="1"/>
-    <w:lsdException w:name="Strong" w:uiPriority="22" w:qFormat="1"/>
-    <w:lsdException w:name="Emphasis" w:uiPriority="20" w:qFormat="1"/>
-    <w:lsdException w:name="Document Map" w:semiHidden="1" w:unhideWhenUsed="1"/>
-    <w:lsdException w:name="Plain Text" w:semiHidden="1" w:unhideWhenUsed="1"/>
-    <w:lsdException w:name="E-mail Signature" w:semiHidden="1" w:unhideWhenUsed="1"/>
-    <w:lsdException w:name="HTML Top of Form" w:semiHidden="1" w:unhideWhenUsed="1"/>
-    <w:lsdException w:name="HTML Bottom of Form" w:semiHidden="1" w:unhideWhenUsed="1"/>
-    <w:lsdException w:name="Normal (Web)" w:semiHidden="1" w:unhideWhenUsed="1"/>
-    <w:lsdException w:name="HTML Acronym" w:semiHidden="1" w:unhideWhenUsed="1"/>
-    <w:lsdException w:name="HTML Address" w:semiHidden="1" w:unhideWhenUsed="1"/>
-    <w:lsdException w:name="HTML Cite" w:semiHidden="1" w:unhideWhenUsed="1"/>
-    <w:lsdException w:name="HTML Code" w:semiHidden="1" w:unhideWhenUsed="1"/>
-    <w:lsdException w:name="HTML Definition" w:semiHidden="1" w:unhideWhenUsed="1"/>
-    <w:lsdException w:name="HTML Keyboard" w:semiHidden="1" w:unhideWhenUsed="1"/>
-    <w:lsdException w:name="HTML Preformatted" w:semiHidden="1" w:unhideWhenUsed="1"/>
-    <w:lsdException w:name="HTML Sample" w:semiHidden="1" w:unhideWhenUsed="1"/>
-    <w:lsdException w:name="HTML Typewriter" w:semiHidden="1" w:unhideWhenUsed="1"/>
-    <w:lsdException w:name="HTML Variable" w:semiHidden="1" w:unhideWhenUsed="1"/>
-    <w:lsdException w:name="Normal Table" w:semiHidden="1" w:unhideWhenUsed="1"/>
-    <w:lsdException w:name="annotation subject" w:semiHidden="1" w:unhideWhenUsed="1"/>
-    <w:lsdException w:name="No List" w:semiHidden="1" w:unhideWhenUsed="1"/>
-    <w:lsdException w:name="Outline List 1" w:semiHidden="1" w:unhideWhenUsed="1"/>
-    <w:lsdException w:name="Outline List 2" w:semiHidden="1" w:unhideWhenUsed="1"/>
-    <w:lsdException w:name="Outline List 3" w:semiHidden="1" w:unhideWhenUsed="1"/>
-    <w:lsdException w:name="Table Simple 1" w:semiHidden="1" w:unhideWhenUsed="1"/>
-    <w:lsdException w:name="Table Simple 2" w:semiHidden="1" w:unhideWhenUsed="1"/>
-    <w:lsdException w:name="Table Simple 3" w:semiHidden="1" w:unhideWhenUsed="1"/>
-    <w:lsdException w:name="Table Classic 1" w:semiHidden="1" w:unhideWhenUsed="1"/>
-    <w:lsdException w:name="Table Classic 2" w:semiHidden="1" w:unhideWhenUsed="1"/>
-    <w:lsdException w:name="Table Classic 3" w:semiHidden="1" w:unhideWhenUsed="1"/>
-    <w:lsdException w:name="Table Classic 4" w:semiHidden="1" w:unhideWhenUsed="1"/>
-    <w:lsdException w:name="Table Colorful 1" w:semiHidden="1" w:unhideWhenUsed="1"/>
-    <w:lsdException w:name="Table Colorful 2" w:semiHidden="1" w:unhideWhenUsed="1"/>
-    <w:lsdException w:name="Table Colorful 3" w:semiHidden="1" w:unhideWhenUsed="1"/>
-    <w:lsdException w:name="Table Columns 1" w:semiHidden="1" w:unhideWhenUsed="1"/>
-    <w:lsdException w:name="Table Columns 2" w:semiHidden="1" w:unhideWhenUsed="1"/>
-    <w:lsdException w:name="Table Columns 3" w:semiHidden="1" w:unhideWhenUsed="1"/>
-    <w:lsdException w:name="Table Columns 4" w:semiHidden="1" w:unhideWhenUsed="1"/>
-    <w:lsdException w:name="Table Columns 5" w:semiHidden="1" w:unhideWhenUsed="1"/>
-    <w:lsdException w:name="Table Grid 1" w:semiHidden="1" w:unhideWhenUsed="1"/>
-    <w:lsdException w:name="Table Grid 2" w:semiHidden="1" w:unhideWhenUsed="1"/>
-    <w:lsdException w:name="Table Grid 3" w:semiHidden="1" w:unhideWhenUsed="1"/>
-    <w:lsdException w:name="Table Grid 4" w:semiHidden="1" w:unhideWhenUsed="1"/>
-    <w:lsdException w:name="Table Grid 5" w:semiHidden="1" w:unhideWhenUsed="1"/>
-    <w:lsdException w:name="Table Grid 6" w:semiHidden="1" w:unhideWhenUsed="1"/>
-    <w:lsdException w:name="Table Grid 7" w:semiHidden="1" w:unhideWhenUsed="1"/>
-    <w:lsdException w:name="Table Grid 8" w:semiHidden="1" w:unhideWhenUsed="1"/>
-    <w:lsdException w:name="Table List 1" w:semiHidden="1" w:unhideWhenUsed="1"/>
-    <w:lsdException w:name="Table List 2" w:semiHidden="1" w:unhideWhenUsed="1"/>
-    <w:lsdException w:name="Table List 3" w:semiHidden="1" w:unhideWhenUsed="1"/>
-    <w:lsdException w:name="Table List 4" w:semiHidden="1" w:unhideWhenUsed="1"/>
-    <w:lsdException w:name="Table List 5" w:semiHidden="1" w:unhideWhenUsed="1"/>
-    <w:lsdException w:name="Table List 6" w:semiHidden="1" w:unhideWhenUsed="1"/>
-    <w:lsdException w:name="Table List 7" w:semiHidden="1" w:unhideWhenUsed="1"/>
-    <w:lsdException w:name="Table List 8" w:semiHidden="1" w:unhideWhenUsed="1"/>
-    <w:lsdException w:name="Table 3D effects 1" w:semiHidden="1" w:unhideWhenUsed="1"/>
-    <w:lsdException w:name="Table 3D effects 2" w:semiHidden="1" w:unhideWhenUsed="1"/>
-    <w:lsdException w:name="Table 3D effects 3" w:semiHidden="1" w:unhideWhenUsed="1"/>
-    <w:lsdException w:name="Table Contemporary" w:semiHidden="1" w:unhideWhenUsed="1"/>
-    <w:lsdException w:name="Table Elegant" w:semiHidden="1" w:unhideWhenUsed="1"/>
-    <w:lsdException w:name="Table Professional" w:semiHidden="1" w:unhideWhenUsed="1"/>
-    <w:lsdException w:name="Table Subtle 1" w:semiHidden="1" w:unhideWhenUsed="1"/>
-    <w:lsdException w:name="Table Subtle 2" w:semiHidden="1" w:unhideWhenUsed="1"/>
-    <w:lsdException w:name="Table Web 1" w:semiHidden="1" w:unhideWhenUsed="1"/>
-    <w:lsdException w:name="Table Web 2" w:semiHidden="1" w:unhideWhenUsed="1"/>
-    <w:lsdException w:name="Table Web 3" w:semiHidden="1" w:unhideWhenUsed="1"/>
-    <w:lsdException w:name="Balloon Text" w:semiHidden="1" w:unhideWhenUsed="1"/>
-    <w:lsdException w:name="Table Grid" w:uiPriority="39"/>
-    <w:lsdException w:name="Table Theme" w:semiHidden="1" w:unhideWhenUsed="1"/>
-    <w:lsdException w:name="Placeholder Text" w:semiHidden="1"/>
-    <w:lsdException w:name="No Spacing" w:uiPriority="1" w:qFormat="1"/>
-    <w:lsdException w:name="Light Shading" w:uiPriority="60"/>
-    <w:lsdException w:name="Light List" w:uiPriority="61"/>
-    <w:lsdException w:name="Light Grid" w:uiPriority="62"/>
-    <w:lsdException w:name="Medium Shading 1" w:uiPriority="63"/>
-    <w:lsdException w:name="Medium Shading 2" w:uiPriority="64"/>
-    <w:lsdException w:name="Medium List 1" w:uiPriority="65"/>
-    <w:lsdException w:name="Medium List 2" w:uiPriority="66"/>
-    <w:lsdException w:name="Medium Grid 1" w:uiPriority="67"/>
-    <w:lsdException w:name="Medium Grid 2" w:uiPriority="68"/>
-    <w:lsdException w:name="Medium Grid 3" w:uiPriority="69"/>
-    <w:lsdException w:name="Dark List" w:uiPriority="70"/>
-    <w:lsdException w:name="Colorful Shading" w:uiPriority="71"/>
-    <w:lsdException w:name="Colorful List" w:uiPriority="72"/>
-    <w:lsdException w:name="Colorful Grid" w:uiPriority="73"/>
-    <w:lsdException w:name="Light Shading Accent 1" w:uiPriority="60"/>
-    <w:lsdException w:name="Light List Accent 1" w:uiPriority="61"/>
-    <w:lsdException w:name="Light Grid Accent 1" w:uiPriority="62"/>
-    <w:lsdException w:name="Medium Shading 1 Accent 1" w:uiPriority="63"/>
-    <w:lsdException w:name="Medium Shading 2 Accent 1" w:uiPriority="64"/>
-    <w:lsdException w:name="Medium List 1 Accent 1" w:uiPriority="65"/>
-    <w:lsdException w:name="Revision" w:semiHidden="1"/>
-    <w:lsdException w:name="List Paragraph" w:uiPriority="34" w:qFormat="1"/>
-    <w:lsdException w:name="Quote" w:uiPriority="29" w:qFormat="1"/>
-    <w:lsdException w:name="Intense Quote" w:uiPriority="30" w:qFormat="1"/>
-    <w:lsdException w:name="Medium List 2 Accent 1" w:uiPriority="66"/>
-    <w:lsdException w:name="Medium Grid 1 Accent 1" w:uiPriority="67"/>
-    <w:lsdException w:name="Medium Grid 2 Accent 1" w:uiPriority="68"/>
-    <w:lsdException w:name="Medium Grid 3 Accent 1" w:uiPriority="69"/>
-    <w:lsdException w:name="Dark List Accent 1" w:uiPriority="70"/>
-    <w:lsdException w:name="Colorful Shading Accent 1" w:uiPriority="71"/>
-    <w:lsdException w:name="Colorful List Accent 1" w:uiPriority="72"/>
-    <w:lsdException w:name="Colorful Grid Accent 1" w:uiPriority="73"/>
-    <w:lsdException w:name="Light Shading Accent 2" w:uiPriority="60"/>
-    <w:lsdException w:name="Light List Accent 2" w:uiPriority="61"/>
-    <w:lsdException w:name="Light Grid Accent 2" w:uiPriority="62"/>
-    <w:lsdException w:name="Medium Shading 1 Accent 2" w:uiPriority="63"/>
-    <w:lsdException w:name="Medium Shading 2 Accent 2" w:uiPriority="64"/>
-    <w:lsdException w:name="Medium List 1 Accent 2" w:uiPriority="65"/>
-    <w:lsdException w:name="Medium List 2 Accent 2" w:uiPriority="66"/>
-    <w:lsdException w:name="Medium Grid 1 Accent 2" w:uiPriority="67"/>
-    <w:lsdException w:name="Medium Grid 2 Accent 2" w:uiPriority="68"/>
-    <w:lsdException w:name="Medium Grid 3 Accent 2" w:uiPriority="69"/>
-    <w:lsdException w:name="Dark List Accent 2" w:uiPriority="70"/>
-    <w:lsdException w:name="Colorful Shading Accent 2" w:uiPriority="71"/>
-    <w:lsdException w:name="Colorful List Accent 2" w:uiPriority="72"/>
-    <w:lsdException w:name="Colorful Grid Accent 2" w:uiPriority="73"/>
-    <w:lsdException w:name="Light Shading Accent 3" w:uiPriority="60"/>
-    <w:lsdException w:name="Light List Accent 3" w:uiPriority="61"/>
-    <w:lsdException w:name="Light Grid Accent 3" w:uiPriority="62"/>
-    <w:lsdException w:name="Medium Shading 1 Accent 3" w:uiPriority="63"/>
-    <w:lsdException w:name="Medium Shading 2 Accent 3" w:uiPriority="64"/>
-    <w:lsdException w:name="Medium List 1 Accent 3" w:uiPriority="65"/>
-    <w:lsdException w:name="Medium List 2 Accent 3" w:uiPriority="66"/>
-    <w:lsdException w:name="Medium Grid 1 Accent 3" w:uiPriority="67"/>
-    <w:lsdException w:name="Medium Grid 2 Accent 3" w:uiPriority="68"/>
-    <w:lsdException w:name="Medium Grid 3 Accent 3" w:uiPriority="69"/>
-    <w:lsdException w:name="Dark List Accent 3" w:uiPriority="70"/>
-    <w:lsdException w:name="Colorful Shading Accent 3" w:uiPriority="71"/>
-    <w:lsdException w:name="Colorful List Accent 3" w:uiPriority="72"/>
-    <w:lsdException w:name="Colorful Grid Accent 3" w:uiPriority="73"/>
-    <w:lsdException w:name="Light Shading Accent 4" w:uiPriority="60"/>
-    <w:lsdException w:name="Light List Accent 4" w:uiPriority="61"/>
-    <w:lsdException w:name="Light Grid Accent 4" w:uiPriority="62"/>
-    <w:lsdException w:name="Medium Shading 1 Accent 4" w:uiPriority="63"/>
-    <w:lsdException w:name="Medium Shading 2 Accent 4" w:uiPriority="64"/>
-    <w:lsdException w:name="Medium List 1 Accent 4" w:uiPriority="65"/>
-    <w:lsdException w:name="Medium List 2 Accent 4" w:uiPriority="66"/>
-    <w:lsdException w:name="Medium Grid 1 Accent 4" w:uiPriority="67"/>
-    <w:lsdException w:name="Medium Grid 2 Accent 4" w:uiPriority="68"/>
-    <w:lsdException w:name="Medium Grid 3 Accent 4" w:uiPriority="69"/>
-    <w:lsdException w:name="Dark List Accent 4" w:uiPriority="70"/>
-    <w:lsdException w:name="Colorful Shading Accent 4" w:uiPriority="71"/>
-    <w:lsdException w:name="Colorful List Accent 4" w:uiPriority="72"/>
-    <w:lsdException w:name="Colorful Grid Accent 4" w:uiPriority="73"/>
-    <w:lsdException w:name="Light Shading Accent 5" w:uiPriority="60"/>
-    <w:lsdException w:name="Light List Accent 5" w:uiPriority="61"/>
-    <w:lsdException w:name="Light Grid Accent 5" w:uiPriority="62"/>
-    <w:lsdException w:name="Medium Shading 1 Accent 5" w:uiPriority="63"/>
-    <w:lsdException w:name="Medium Shading 2 Accent 5" w:uiPriority="64"/>
-    <w:lsdException w:name="Medium List 1 Accent 5" w:uiPriority="65"/>
-    <w:lsdException w:name="Medium List 2 Accent 5" w:uiPriority="66"/>
-    <w:lsdException w:name="Medium Grid 1 Accent 5" w:uiPriority="67"/>
-    <w:lsdException w:name="Medium Grid 2 Accent 5" w:uiPriority="68"/>
-    <w:lsdException w:name="Medium Grid 3 Accent 5" w:uiPriority="69"/>
-    <w:lsdException w:name="Dark List Accent 5" w:uiPriority="70"/>
-    <w:lsdException w:name="Colorful Shading Accent 5" w:uiPriority="71"/>
-    <w:lsdException w:name="Colorful List Accent 5" w:uiPriority="72"/>
-    <w:lsdException w:name="Colorful Grid Accent 5" w:uiPriority="73"/>
-    <w:lsdException w:name="Light Shading Accent 6" w:uiPriority="60"/>
-    <w:lsdException w:name="Light List Accent 6" w:uiPriority="61"/>
-    <w:lsdException w:name="Light Grid Accent 6" w:uiPriority="62"/>
-    <w:lsdException w:name="Medium Shading 1 Accent 6" w:uiPriority="63"/>
-    <w:lsdException w:name="Medium Shading 2 Accent 6" w:uiPriority="64"/>
-    <w:lsdException w:name="Medium List 1 Accent 6" w:uiPriority="65"/>
-    <w:lsdException w:name="Medium List 2 Accent 6" w:uiPriority="66"/>
-    <w:lsdException w:name="Medium Grid 1 Accent 6" w:uiPriority="67"/>
-    <w:lsdException w:name="Medium Grid 2 Accent 6" w:uiPriority="68"/>
-    <w:lsdException w:name="Medium Grid 3 Accent 6" w:uiPriority="69"/>
-    <w:lsdException w:name="Dark List Accent 6" w:uiPriority="70"/>
-    <w:lsdException w:name="Colorful Shading Accent 6" w:uiPriority="71"/>
-    <w:lsdException w:name="Colorful List Accent 6" w:uiPriority="72"/>
-    <w:lsdException w:name="Colorful Grid Accent 6" w:uiPriority="73"/>
-    <w:lsdException w:name="Subtle Emphasis" w:uiPriority="19" w:qFormat="1"/>
-    <w:lsdException w:name="Intense Emphasis" w:uiPriority="21" w:qFormat="1"/>
-    <w:lsdException w:name="Subtle Reference" w:uiPriority="31" w:qFormat="1"/>
-    <w:lsdException w:name="Intense Reference" w:uiPriority="32" w:qFormat="1"/>
-    <w:lsdException w:name="Book Title" w:uiPriority="33" w:qFormat="1"/>
-    <w:lsdException w:name="Bibliography" w:semiHidden="1" w:uiPriority="37" w:unhideWhenUsed="1"/>
-    <w:lsdException w:name="TOC Heading" w:semiHidden="1" w:uiPriority="39" w:unhideWhenUsed="1" w:qFormat="1"/>
-    <w:lsdException w:name="Plain Table 1" w:uiPriority="41"/>
-    <w:lsdException w:name="Plain Table 2" w:uiPriority="42"/>
-    <w:lsdException w:name="Plain Table 3" w:uiPriority="43"/>
-    <w:lsdException w:name="Plain Table 4" w:uiPriority="44"/>
-    <w:lsdException w:name="Plain Table 5" w:uiPriority="45"/>
-    <w:lsdException w:name="Grid Table Light" w:uiPriority="40"/>
-    <w:lsdException w:name="Grid Table 1 Light" w:uiPriority="46"/>
-    <w:lsdException w:name="Grid Table 2" w:uiPriority="47"/>
-    <w:lsdException w:name="Grid Table 3" w:uiPriority="48"/>
-    <w:lsdException w:name="Grid Table 4" w:uiPriority="49"/>
-    <w:lsdException w:name="Grid Table 5 Dark" w:uiPriority="50"/>
-    <w:lsdException w:name="Grid Table 6 Colorful" w:uiPriority="51"/>
-    <w:lsdException w:name="Grid Table 7 Colorful" w:uiPriority="52"/>
-    <w:lsdException w:name="Grid Table 1 Light Accent 1" w:uiPriority="46"/>
-    <w:lsdException w:name="Grid Table 2 Accent 1" w:uiPriority="47"/>
-    <w:lsdException w:name="Grid Table 3 Accent 1" w:uiPriority="48"/>
-    <w:lsdException w:name="Grid Table 4 Accent 1" w:uiPriority="49"/>
-    <w:lsdException w:name="Grid Table 5 Dark Accent 1" w:uiPriority="50"/>
-    <w:lsdException w:name="Grid Table 6 Colorful Accent 1" w:uiPriority="51"/>
-    <w:lsdException w:name="Grid Table 7 Colorful Accent 1" w:uiPriority="52"/>
-    <w:lsdException w:name="Grid Table 1 Light Accent 2" w:uiPriority="46"/>
-    <w:lsdException w:name="Grid Table 2 Accent 2" w:uiPriority="47"/>
-    <w:lsdException w:name="Grid Table 3 Accent 2" w:uiPriority="48"/>
-    <w:lsdException w:name="Grid Table 4 Accent 2" w:uiPriority="49"/>
-    <w:lsdException w:name="Grid Table 5 Dark Accent 2" w:uiPriority="50"/>
-    <w:lsdException w:name="Grid Table 6 Colorful Accent 2" w:uiPriority="51"/>
-    <w:lsdException w:name="Grid Table 7 Colorful Accent 2" w:uiPriority="52"/>
-    <w:lsdException w:name="Grid Table 1 Light Accent 3" w:uiPriority="46"/>
-    <w:lsdException w:name="Grid Table 2 Accent 3" w:uiPriority="47"/>
-    <w:lsdException w:name="Grid Table 3 Accent 3" w:uiPriority="48"/>
-    <w:lsdException w:name="Grid Table 4 Accent 3" w:uiPriority="49"/>
-    <w:lsdException w:name="Grid Table 5 Dark Accent 3" w:uiPriority="50"/>
-    <w:lsdException w:name="Grid Table 6 Colorful Accent 3" w:uiPriority="51"/>
-    <w:lsdException w:name="Grid Table 7 Colorful Accent 3" w:uiPriority="52"/>
-    <w:lsdException w:name="Grid Table 1 Light Accent 4" w:uiPriority="46"/>
-    <w:lsdException w:name="Grid Table 2 Accent 4" w:uiPriority="47"/>
-    <w:lsdException w:name="Grid Table 3 Accent 4" w:uiPriority="48"/>
-    <w:lsdException w:name="Grid Table 4 Accent 4" w:uiPriority="49"/>
-    <w:lsdException w:name="Grid Table 5 Dark Accent 4" w:uiPriority="50"/>
-    <w:lsdException w:name="Grid Table 6 Colorful Accent 4" w:uiPriority="51"/>
-    <w:lsdException w:name="Grid Table 7 Colorful Accent 4" w:uiPriority="52"/>
-    <w:lsdException w:name="Grid Table 1 Light Accent 5" w:uiPriority="46"/>
-    <w:lsdException w:name="Grid Table 2 Accent 5" w:uiPriority="47"/>
-    <w:lsdException w:name="Grid Table 3 Accent 5" w:uiPriority="48"/>
-    <w:lsdException w:name="Grid Table 4 Accent 5" w:uiPriority="49"/>
-    <w:lsdException w:name="Grid Table 5 Dark Accent 5" w:uiPriority="50"/>
-    <w:lsdException w:name="Grid Table 6 Colorful Accent 5" w:uiPriority="51"/>
-    <w:lsdException w:name="Grid Table 7 Colorful Accent 5" w:uiPriority="52"/>
-    <w:lsdException w:name="Grid Table 1 Light Accent 6" w:uiPriority="46"/>
-    <w:lsdException w:name="Grid Table 2 Accent 6" w:uiPriority="47"/>
-    <w:lsdException w:name="Grid Table 3 Accent 6" w:uiPriority="48"/>
-    <w:lsdException w:name="Grid Table 4 Accent 6" w:uiPriority="49"/>
-    <w:lsdException w:name="Grid Table 5 Dark Accent 6" w:uiPriority="50"/>
-    <w:lsdException w:name="Grid Table 6 Colorful Accent 6" w:uiPriority="51"/>
-    <w:lsdException w:name="Grid Table 7 Colorful Accent 6" w:uiPriority="52"/>
-    <w:lsdException w:name="List Table 1 Light" w:uiPriority="46"/>
-    <w:lsdException w:name="List Table 2" w:uiPriority="47"/>
-    <w:lsdException w:name="List Table 3" w:uiPriority="48"/>
-    <w:lsdException w:name="List Table 4" w:uiPriority="49"/>
-    <w:lsdException w:name="List Table 5 Dark" w:uiPriority="50"/>
-    <w:lsdException w:name="List Table 6 Colorful" w:uiPriority="51"/>
-    <w:lsdException w:name="List Table 7 Colorful" w:uiPriority="52"/>
-    <w:lsdException w:name="List Table 1 Light Accent 1" w:uiPriority="46"/>
-    <w:lsdException w:name="List Table 2 Accent 1" w:uiPriority="47"/>
-    <w:lsdException w:name="List Table 3 Accent 1" w:uiPriority="48"/>
-    <w:lsdException w:name="List Table 4 Accent 1" w:uiPriority="49"/>
-    <w:lsdException w:name="List Table 5 Dark Accent 1" w:uiPriority="50"/>
-    <w:lsdException w:name="List Table 6 Colorful Accent 1" w:uiPriority="51"/>
-    <w:lsdException w:name="List Table 7 Colorful Accent 1" w:uiPriority="52"/>
-    <w:lsdException w:name="List Table 1 Light Accent 2" w:uiPriority="46"/>
-    <w:lsdException w:name="List Table 2 Accent 2" w:uiPriority="47"/>
-    <w:lsdException w:name="List Table 3 Accent 2" w:uiPriority="48"/>
-    <w:lsdException w:name="List Table 4 Accent 2" w:uiPriority="49"/>
-    <w:lsdException w:name="List Table 5 Dark Accent 2" w:uiPriority="50"/>
-    <w:lsdException w:name="List Table 6 Colorful Accent 2" w:uiPriority="51"/>
-    <w:lsdException w:name="List Table 7 Colorful Accent 2" w:uiPriority="52"/>
-    <w:lsdException w:name="List Table 1 Light Accent 3" w:uiPriority="46"/>
-    <w:lsdException w:name="List Table 2 Accent 3" w:uiPriority="47"/>
-    <w:lsdException w:name="List Table 3 Accent 3" w:uiPriority="48"/>
-    <w:lsdException w:name="List Table 4 Accent 3" w:uiPriority="49"/>
-    <w:lsdException w:name="List Table 5 Dark Accent 3" w:uiPriority="50"/>
-    <w:lsdException w:name="List Table 6 Colorful Accent 3" w:uiPriority="51"/>
-    <w:lsdException w:name="List Table 7 Colorful Accent 3" w:uiPriority="52"/>
-    <w:lsdException w:name="List Table 1 Light Accent 4" w:uiPriority="46"/>
-    <w:lsdException w:name="List Table 2 Accent 4" w:uiPriority="47"/>
-    <w:lsdException w:name="List Table 3 Accent 4" w:uiPriority="48"/>
-    <w:lsdException w:name="List Table 4 Accent 4" w:uiPriority="49"/>
-    <w:lsdException w:name="List Table 5 Dark Accent 4" w:uiPriority="50"/>
-    <w:lsdException w:name="List Table 6 Colorful Accent 4" w:uiPriority="51"/>
-    <w:lsdException w:name="List Table 7 Colorful Accent 4" w:uiPriority="52"/>
-    <w:lsdException w:name="List Table 1 Light Accent 5" w:uiPriority="46"/>
-    <w:lsdException w:name="List Table 2 Accent 5" w:uiPriority="47"/>
-    <w:lsdException w:name="List Table 3 Accent 5" w:uiPriority="48"/>
-    <w:lsdException w:name="List Table 4 Accent 5" w:uiPriority="49"/>
-    <w:lsdException w:name="List Table 5 Dark Accent 5" w:uiPriority="50"/>
-    <w:lsdException w:name="List Table 6 Colorful Accent 5" w:uiPriority="51"/>
-    <w:lsdException w:name="List Table 7 Colorful Accent 5" w:uiPriority="52"/>
-    <w:lsdException w:name="List Table 1 Light Accent 6" w:uiPriority="46"/>
-    <w:lsdException w:name="List Table 2 Accent 6" w:uiPriority="47"/>
-    <w:lsdException w:name="List Table 3 Accent 6" w:uiPriority="48"/>
-    <w:lsdException w:name="List Table 4 Accent 6" w:uiPriority="49"/>
-    <w:lsdException w:name="List Table 5 Dark Accent 6" w:uiPriority="50"/>
-    <w:lsdException w:name="List Table 6 Colorful Accent 6" w:uiPriority="51"/>
-    <w:lsdException w:name="List Table 7 Colorful Accent 6" w:uiPriority="52"/>
-    <w:lsdException w:name="Mention" w:semiHidden="1" w:unhideWhenUsed="1"/>
-    <w:lsdException w:name="Smart Hyperlink" w:semiHidden="1" w:unhideWhenUsed="1"/>
-    <w:lsdException w:name="Hashtag" w:semiHidden="1" w:unhideWhenUsed="1"/>
-    <w:lsdException w:name="Unresolved Mention" w:semiHidden="1" w:unhideWhenUsed="1"/>
-    <w:lsdException w:name="Smart Link" w:semiHidden="1" w:unhideWhenUsed="1"/>
+  <w:latentStyles w:count="260" w:defQFormat="0" w:defUnhideWhenUsed="1" w:defSemiHidden="1" w:defUIPriority="99" w:defLockedState="0">
+    <w:lsdException w:qFormat="1" w:unhideWhenUsed="0" w:uiPriority="0" w:semiHidden="0" w:name="Normal"/>
+    <w:lsdException w:qFormat="1" w:unhideWhenUsed="0" w:uiPriority="9" w:semiHidden="0" w:name="heading 1"/>
+    <w:lsdException w:qFormat="1" w:uiPriority="9" w:semiHidden="0" w:name="heading 2"/>
+    <w:lsdException w:qFormat="1" w:uiPriority="9" w:name="heading 3"/>
+    <w:lsdException w:qFormat="1" w:uiPriority="9" w:name="heading 4"/>
+    <w:lsdException w:qFormat="1" w:uiPriority="9" w:name="heading 5"/>
+    <w:lsdException w:qFormat="1" w:uiPriority="9" w:name="heading 6"/>
+    <w:lsdException w:qFormat="1" w:uiPriority="9" w:name="heading 7"/>
+    <w:lsdException w:qFormat="1" w:uiPriority="9" w:name="heading 8"/>
+    <w:lsdException w:qFormat="1" w:uiPriority="9" w:name="heading 9"/>
+    <w:lsdException w:uiPriority="99" w:name="index 1"/>
+    <w:lsdException w:uiPriority="99" w:name="index 2"/>
+    <w:lsdException w:uiPriority="99" w:name="index 3"/>
+    <w:lsdException w:uiPriority="99" w:name="index 4"/>
+    <w:lsdException w:uiPriority="99" w:name="index 5"/>
+    <w:lsdException w:uiPriority="99" w:name="index 6"/>
+    <w:lsdException w:uiPriority="99" w:name="index 7"/>
+    <w:lsdException w:uiPriority="99" w:name="index 8"/>
+    <w:lsdException w:uiPriority="99" w:name="index 9"/>
+    <w:lsdException w:uiPriority="39" w:name="toc 1"/>
+    <w:lsdException w:uiPriority="39" w:name="toc 2"/>
+    <w:lsdException w:uiPriority="39" w:name="toc 3"/>
+    <w:lsdException w:uiPriority="39" w:name="toc 4"/>
+    <w:lsdException w:uiPriority="39" w:name="toc 5"/>
+    <w:lsdException w:uiPriority="39" w:name="toc 6"/>
+    <w:lsdException w:uiPriority="39" w:name="toc 7"/>
+    <w:lsdException w:uiPriority="39" w:name="toc 8"/>
+    <w:lsdException w:uiPriority="39" w:name="toc 9"/>
+    <w:lsdException w:uiPriority="99" w:name="Normal Indent"/>
+    <w:lsdException w:uiPriority="99" w:name="footnote text"/>
+    <w:lsdException w:uiPriority="99" w:name="annotation text"/>
+    <w:lsdException w:uiPriority="99" w:name="header"/>
+    <w:lsdException w:uiPriority="99" w:name="footer"/>
+    <w:lsdException w:uiPriority="99" w:name="index heading"/>
+    <w:lsdException w:qFormat="1" w:uiPriority="35" w:name="caption"/>
+    <w:lsdException w:uiPriority="99" w:name="table of figures"/>
+    <w:lsdException w:uiPriority="99" w:name="envelope address"/>
+    <w:lsdException w:uiPriority="99" w:name="envelope return"/>
+    <w:lsdException w:uiPriority="99" w:name="footnote reference"/>
+    <w:lsdException w:uiPriority="99" w:name="annotation reference"/>
+    <w:lsdException w:uiPriority="99" w:name="line number"/>
+    <w:lsdException w:uiPriority="99" w:name="page number"/>
+    <w:lsdException w:qFormat="1" w:uiPriority="99" w:name="endnote reference"/>
+    <w:lsdException w:qFormat="1" w:uiPriority="99" w:name="endnote text"/>
+    <w:lsdException w:uiPriority="99" w:name="table of authorities"/>
+    <w:lsdException w:uiPriority="99" w:name="macro"/>
+    <w:lsdException w:uiPriority="99" w:name="toa heading"/>
+    <w:lsdException w:uiPriority="99" w:name="List"/>
+    <w:lsdException w:uiPriority="99" w:name="List Bullet"/>
+    <w:lsdException w:uiPriority="99" w:name="List Number"/>
+    <w:lsdException w:uiPriority="99" w:name="List 2"/>
+    <w:lsdException w:uiPriority="99" w:name="List 3"/>
+    <w:lsdException w:uiPriority="99" w:name="List 4"/>
+    <w:lsdException w:uiPriority="99" w:name="List 5"/>
+    <w:lsdException w:uiPriority="99" w:name="List Bullet 2"/>
+    <w:lsdException w:uiPriority="99" w:name="List Bullet 3"/>
+    <w:lsdException w:uiPriority="99" w:name="List Bullet 4"/>
+    <w:lsdException w:uiPriority="99" w:name="List Bullet 5"/>
+    <w:lsdException w:uiPriority="99" w:name="List Number 2"/>
+    <w:lsdException w:uiPriority="99" w:name="List Number 3"/>
+    <w:lsdException w:uiPriority="99" w:name="List Number 4"/>
+    <w:lsdException w:uiPriority="99" w:name="List Number 5"/>
+    <w:lsdException w:qFormat="1" w:unhideWhenUsed="0" w:uiPriority="10" w:semiHidden="0" w:name="Title"/>
+    <w:lsdException w:uiPriority="99" w:name="Closing"/>
+    <w:lsdException w:uiPriority="99" w:name="Signature"/>
+    <w:lsdException w:qFormat="1" w:uiPriority="1" w:name="Default Paragraph Font"/>
+    <w:lsdException w:uiPriority="99" w:name="Body Text"/>
+    <w:lsdException w:uiPriority="99" w:name="Body Text Indent"/>
+    <w:lsdException w:uiPriority="99" w:name="List Continue"/>
+    <w:lsdException w:uiPriority="99" w:name="List Continue 2"/>
+    <w:lsdException w:uiPriority="99" w:name="List Continue 3"/>
+    <w:lsdException w:uiPriority="99" w:name="List Continue 4"/>
+    <w:lsdException w:uiPriority="99" w:name="List Continue 5"/>
+    <w:lsdException w:uiPriority="99" w:name="Message Header"/>
+    <w:lsdException w:qFormat="1" w:unhideWhenUsed="0" w:uiPriority="11" w:semiHidden="0" w:name="Subtitle"/>
+    <w:lsdException w:uiPriority="99" w:name="Salutation"/>
+    <w:lsdException w:uiPriority="99" w:name="Date"/>
+    <w:lsdException w:uiPriority="99" w:name="Body Text First Indent"/>
+    <w:lsdException w:uiPriority="99" w:name="Body Text First Indent 2"/>
+    <w:lsdException w:uiPriority="99" w:name="Note Heading"/>
+    <w:lsdException w:uiPriority="99" w:name="Body Text 2"/>
+    <w:lsdException w:uiPriority="99" w:name="Body Text 3"/>
+    <w:lsdException w:uiPriority="99" w:name="Body Text Indent 2"/>
+    <w:lsdException w:uiPriority="99" w:name="Body Text Indent 3"/>
+    <w:lsdException w:uiPriority="99" w:name="Block Text"/>
+    <w:lsdException w:uiPriority="99" w:semiHidden="0" w:name="Hyperlink"/>
+    <w:lsdException w:uiPriority="99" w:name="FollowedHyperlink"/>
+    <w:lsdException w:qFormat="1" w:unhideWhenUsed="0" w:uiPriority="22" w:semiHidden="0" w:name="Strong"/>
+    <w:lsdException w:qFormat="1" w:unhideWhenUsed="0" w:uiPriority="20" w:semiHidden="0" w:name="Emphasis"/>
+    <w:lsdException w:uiPriority="99" w:name="Document Map"/>
+    <w:lsdException w:uiPriority="99" w:name="Plain Text"/>
+    <w:lsdException w:uiPriority="99" w:name="E-mail Signature"/>
+    <w:lsdException w:uiPriority="99" w:name="Normal (Web)"/>
+    <w:lsdException w:uiPriority="99" w:name="HTML Acronym"/>
+    <w:lsdException w:uiPriority="99" w:name="HTML Address"/>
+    <w:lsdException w:uiPriority="99" w:name="HTML Cite"/>
+    <w:lsdException w:uiPriority="99" w:name="HTML Code"/>
+    <w:lsdException w:uiPriority="99" w:name="HTML Definition"/>
+    <w:lsdException w:uiPriority="99" w:name="HTML Keyboard"/>
+    <w:lsdException w:uiPriority="99" w:name="HTML Preformatted"/>
+    <w:lsdException w:uiPriority="99" w:name="HTML Sample"/>
+    <w:lsdException w:uiPriority="99" w:name="HTML Typewriter"/>
+    <w:lsdException w:uiPriority="99" w:name="HTML Variable"/>
+    <w:lsdException w:qFormat="1" w:uiPriority="99" w:name="Normal Table"/>
+    <w:lsdException w:uiPriority="99" w:name="annotation subject"/>
+    <w:lsdException w:uiPriority="99" w:name="Table Simple 1"/>
+    <w:lsdException w:uiPriority="99" w:name="Table Simple 2"/>
+    <w:lsdException w:uiPriority="99" w:name="Table Simple 3"/>
+    <w:lsdException w:uiPriority="99" w:name="Table Classic 1"/>
+    <w:lsdException w:uiPriority="99" w:name="Table Classic 2"/>
+    <w:lsdException w:uiPriority="99" w:name="Table Classic 3"/>
+    <w:lsdException w:uiPriority="99" w:name="Table Classic 4"/>
+    <w:lsdException w:uiPriority="99" w:name="Table Colorful 1"/>
+    <w:lsdException w:uiPriority="99" w:name="Table Colorful 2"/>
+    <w:lsdException w:uiPriority="99" w:name="Table Colorful 3"/>
+    <w:lsdException w:uiPriority="99" w:name="Table Columns 1"/>
+    <w:lsdException w:uiPriority="99" w:name="Table Columns 2"/>
+    <w:lsdException w:uiPriority="99" w:name="Table Columns 3"/>
+    <w:lsdException w:uiPriority="99" w:name="Table Columns 4"/>
+    <w:lsdException w:uiPriority="99" w:name="Table Columns 5"/>
+    <w:lsdException w:uiPriority="99" w:name="Table Grid 1"/>
+    <w:lsdException w:uiPriority="99" w:name="Table Grid 2"/>
+    <w:lsdException w:uiPriority="99" w:name="Table Grid 3"/>
+    <w:lsdException w:uiPriority="99" w:name="Table Grid 4"/>
+    <w:lsdException w:uiPriority="99" w:name="Table Grid 5"/>
+    <w:lsdException w:uiPriority="99" w:name="Table Grid 6"/>
+    <w:lsdException w:uiPriority="99" w:name="Table Grid 7"/>
+    <w:lsdException w:uiPriority="99" w:name="Table Grid 8"/>
+    <w:lsdException w:uiPriority="99" w:name="Table List 1"/>
+    <w:lsdException w:uiPriority="99" w:name="Table List 2"/>
+    <w:lsdException w:uiPriority="99" w:name="Table List 3"/>
+    <w:lsdException w:uiPriority="99" w:name="Table List 4"/>
+    <w:lsdException w:uiPriority="99" w:name="Table List 5"/>
+    <w:lsdException w:uiPriority="99" w:name="Table List 6"/>
+    <w:lsdException w:uiPriority="99" w:name="Table List 7"/>
+    <w:lsdException w:uiPriority="99" w:name="Table List 8"/>
+    <w:lsdException w:uiPriority="99" w:name="Table 3D effects 1"/>
+    <w:lsdException w:uiPriority="99" w:name="Table 3D effects 2"/>
+    <w:lsdException w:uiPriority="99" w:name="Table 3D effects 3"/>
+    <w:lsdException w:uiPriority="99" w:name="Table Contemporary"/>
+    <w:lsdException w:uiPriority="99" w:name="Table Elegant"/>
+    <w:lsdException w:uiPriority="99" w:name="Table Professional"/>
+    <w:lsdException w:uiPriority="99" w:name="Table Subtle 1"/>
+    <w:lsdException w:uiPriority="99" w:name="Table Subtle 2"/>
+    <w:lsdException w:uiPriority="99" w:name="Table Web 1"/>
+    <w:lsdException w:uiPriority="99" w:name="Table Web 2"/>
+    <w:lsdException w:uiPriority="99" w:name="Table Web 3"/>
+    <w:lsdException w:uiPriority="99" w:name="Balloon Text"/>
+    <w:lsdException w:unhideWhenUsed="0" w:uiPriority="39" w:semiHidden="0" w:name="Table Grid"/>
+    <w:lsdException w:uiPriority="99" w:name="Table Theme"/>
+    <w:lsdException w:unhideWhenUsed="0" w:uiPriority="60" w:semiHidden="0" w:name="Light Shading"/>
+    <w:lsdException w:unhideWhenUsed="0" w:uiPriority="61" w:semiHidden="0" w:name="Light List"/>
+    <w:lsdException w:unhideWhenUsed="0" w:uiPriority="62" w:semiHidden="0" w:name="Light Grid"/>
+    <w:lsdException w:unhideWhenUsed="0" w:uiPriority="63" w:semiHidden="0" w:name="Medium Shading 1"/>
+    <w:lsdException w:unhideWhenUsed="0" w:uiPriority="64" w:semiHidden="0" w:name="Medium Shading 2"/>
+    <w:lsdException w:unhideWhenUsed="0" w:uiPriority="65" w:semiHidden="0" w:name="Medium List 1"/>
+    <w:lsdException w:unhideWhenUsed="0" w:uiPriority="66" w:semiHidden="0" w:name="Medium List 2"/>
+    <w:lsdException w:unhideWhenUsed="0" w:uiPriority="67" w:semiHidden="0" w:name="Medium Grid 1"/>
+    <w:lsdException w:unhideWhenUsed="0" w:uiPriority="68" w:semiHidden="0" w:name="Medium Grid 2"/>
+    <w:lsdException w:unhideWhenUsed="0" w:uiPriority="69" w:semiHidden="0" w:name="Medium Grid 3"/>
+    <w:lsdException w:unhideWhenUsed="0" w:uiPriority="70" w:semiHidden="0" w:name="Dark List"/>
+    <w:lsdException w:unhideWhenUsed="0" w:uiPriority="71" w:semiHidden="0" w:name="Colorful Shading"/>
+    <w:lsdException w:unhideWhenUsed="0" w:uiPriority="72" w:semiHidden="0" w:name="Colorful List"/>
+    <w:lsdException w:unhideWhenUsed="0" w:uiPriority="73" w:semiHidden="0" w:name="Colorful Grid"/>
+    <w:lsdException w:unhideWhenUsed="0" w:uiPriority="60" w:semiHidden="0" w:name="Light Shading Accent 1"/>
+    <w:lsdException w:unhideWhenUsed="0" w:uiPriority="61" w:semiHidden="0" w:name="Light List Accent 1"/>
+    <w:lsdException w:unhideWhenUsed="0" w:uiPriority="62" w:semiHidden="0" w:name="Light Grid Accent 1"/>
+    <w:lsdException w:unhideWhenUsed="0" w:uiPriority="63" w:semiHidden="0" w:name="Medium Shading 1 Accent 1"/>
+    <w:lsdException w:unhideWhenUsed="0" w:uiPriority="64" w:semiHidden="0" w:name="Medium Shading 2 Accent 1"/>
+    <w:lsdException w:unhideWhenUsed="0" w:uiPriority="65" w:semiHidden="0" w:name="Medium List 1 Accent 1"/>
+    <w:lsdException w:qFormat="1" w:unhideWhenUsed="0" w:uiPriority="0" w:semiHidden="0" w:name="List Paragraph"/>
+    <w:lsdException w:unhideWhenUsed="0" w:uiPriority="66" w:semiHidden="0" w:name="Medium List 2 Accent 1"/>
+    <w:lsdException w:unhideWhenUsed="0" w:uiPriority="67" w:semiHidden="0" w:name="Medium Grid 1 Accent 1"/>
+    <w:lsdException w:unhideWhenUsed="0" w:uiPriority="68" w:semiHidden="0" w:name="Medium Grid 2 Accent 1"/>
+    <w:lsdException w:unhideWhenUsed="0" w:uiPriority="69" w:semiHidden="0" w:name="Medium Grid 3 Accent 1"/>
+    <w:lsdException w:unhideWhenUsed="0" w:uiPriority="70" w:semiHidden="0" w:name="Dark List Accent 1"/>
+    <w:lsdException w:unhideWhenUsed="0" w:uiPriority="71" w:semiHidden="0" w:name="Colorful Shading Accent 1"/>
+    <w:lsdException w:unhideWhenUsed="0" w:uiPriority="72" w:semiHidden="0" w:name="Colorful List Accent 1"/>
+    <w:lsdException w:unhideWhenUsed="0" w:uiPriority="73" w:semiHidden="0" w:name="Colorful Grid Accent 1"/>
+    <w:lsdException w:unhideWhenUsed="0" w:uiPriority="60" w:semiHidden="0" w:name="Light Shading Accent 2"/>
+    <w:lsdException w:unhideWhenUsed="0" w:uiPriority="61" w:semiHidden="0" w:name="Light List Accent 2"/>
+    <w:lsdException w:unhideWhenUsed="0" w:uiPriority="62" w:semiHidden="0" w:name="Light Grid Accent 2"/>
+    <w:lsdException w:unhideWhenUsed="0" w:uiPriority="63" w:semiHidden="0" w:name="Medium Shading 1 Accent 2"/>
+    <w:lsdException w:unhideWhenUsed="0" w:uiPriority="64" w:semiHidden="0" w:name="Medium Shading 2 Accent 2"/>
+    <w:lsdException w:unhideWhenUsed="0" w:uiPriority="65" w:semiHidden="0" w:name="Medium List 1 Accent 2"/>
+    <w:lsdException w:unhideWhenUsed="0" w:uiPriority="66" w:semiHidden="0" w:name="Medium List 2 Accent 2"/>
+    <w:lsdException w:unhideWhenUsed="0" w:uiPriority="67" w:semiHidden="0" w:name="Medium Grid 1 Accent 2"/>
+    <w:lsdException w:unhideWhenUsed="0" w:uiPriority="68" w:semiHidden="0" w:name="Medium Grid 2 Accent 2"/>
+    <w:lsdException w:unhideWhenUsed="0" w:uiPriority="69" w:semiHidden="0" w:name="Medium Grid 3 Accent 2"/>
+    <w:lsdException w:unhideWhenUsed="0" w:uiPriority="70" w:semiHidden="0" w:name="Dark List Accent 2"/>
+    <w:lsdException w:unhideWhenUsed="0" w:uiPriority="71" w:semiHidden="0" w:name="Colorful Shading Accent 2"/>
+    <w:lsdException w:unhideWhenUsed="0" w:uiPriority="72" w:semiHidden="0" w:name="Colorful List Accent 2"/>
+    <w:lsdException w:unhideWhenUsed="0" w:uiPriority="73" w:semiHidden="0" w:name="Colorful Grid Accent 2"/>
+    <w:lsdException w:unhideWhenUsed="0" w:uiPriority="60" w:semiHidden="0" w:name="Light Shading Accent 3"/>
+    <w:lsdException w:unhideWhenUsed="0" w:uiPriority="61" w:semiHidden="0" w:name="Light List Accent 3"/>
+    <w:lsdException w:unhideWhenUsed="0" w:uiPriority="62" w:semiHidden="0" w:name="Light Grid Accent 3"/>
+    <w:lsdException w:unhideWhenUsed="0" w:uiPriority="63" w:semiHidden="0" w:name="Medium Shading 1 Accent 3"/>
+    <w:lsdException w:unhideWhenUsed="0" w:uiPriority="64" w:semiHidden="0" w:name="Medium Shading 2 Accent 3"/>
+    <w:lsdException w:unhideWhenUsed="0" w:uiPriority="65" w:semiHidden="0" w:name="Medium List 1 Accent 3"/>
+    <w:lsdException w:unhideWhenUsed="0" w:uiPriority="66" w:semiHidden="0" w:name="Medium List 2 Accent 3"/>
+    <w:lsdException w:unhideWhenUsed="0" w:uiPriority="67" w:semiHidden="0" w:name="Medium Grid 1 Accent 3"/>
+    <w:lsdException w:unhideWhenUsed="0" w:uiPriority="68" w:semiHidden="0" w:name="Medium Grid 2 Accent 3"/>
+    <w:lsdException w:unhideWhenUsed="0" w:uiPriority="69" w:semiHidden="0" w:name="Medium Grid 3 Accent 3"/>
+    <w:lsdException w:unhideWhenUsed="0" w:uiPriority="70" w:semiHidden="0" w:name="Dark List Accent 3"/>
+    <w:lsdException w:unhideWhenUsed="0" w:uiPriority="71" w:semiHidden="0" w:name="Colorful Shading Accent 3"/>
+    <w:lsdException w:unhideWhenUsed="0" w:uiPriority="72" w:semiHidden="0" w:name="Colorful List Accent 3"/>
+    <w:lsdException w:unhideWhenUsed="0" w:uiPriority="73" w:semiHidden="0" w:name="Colorful Grid Accent 3"/>
+    <w:lsdException w:unhideWhenUsed="0" w:uiPriority="60" w:semiHidden="0" w:name="Light Shading Accent 4"/>
+    <w:lsdException w:unhideWhenUsed="0" w:uiPriority="61" w:semiHidden="0" w:name="Light List Accent 4"/>
+    <w:lsdException w:unhideWhenUsed="0" w:uiPriority="62" w:semiHidden="0" w:name="Light Grid Accent 4"/>
+    <w:lsdException w:unhideWhenUsed="0" w:uiPriority="63" w:semiHidden="0" w:name="Medium Shading 1 Accent 4"/>
+    <w:lsdException w:unhideWhenUsed="0" w:uiPriority="64" w:semiHidden="0" w:name="Medium Shading 2 Accent 4"/>
+    <w:lsdException w:unhideWhenUsed="0" w:uiPriority="65" w:semiHidden="0" w:name="Medium List 1 Accent 4"/>
+    <w:lsdException w:unhideWhenUsed="0" w:uiPriority="66" w:semiHidden="0" w:name="Medium List 2 Accent 4"/>
+    <w:lsdException w:unhideWhenUsed="0" w:uiPriority="67" w:semiHidden="0" w:name="Medium Grid 1 Accent 4"/>
+    <w:lsdException w:unhideWhenUsed="0" w:uiPriority="68" w:semiHidden="0" w:name="Medium Grid 2 Accent 4"/>
+    <w:lsdException w:unhideWhenUsed="0" w:uiPriority="69" w:semiHidden="0" w:name="Medium Grid 3 Accent 4"/>
+    <w:lsdException w:unhideWhenUsed="0" w:uiPriority="70" w:semiHidden="0" w:name="Dark List Accent 4"/>
+    <w:lsdException w:unhideWhenUsed="0" w:uiPriority="71" w:semiHidden="0" w:name="Colorful Shading Accent 4"/>
+    <w:lsdException w:unhideWhenUsed="0" w:uiPriority="72" w:semiHidden="0" w:name="Colorful List Accent 4"/>
+    <w:lsdException w:unhideWhenUsed="0" w:uiPriority="73" w:semiHidden="0" w:name="Colorful Grid Accent 4"/>
+    <w:lsdException w:unhideWhenUsed="0" w:uiPriority="60" w:semiHidden="0" w:name="Light Shading Accent 5"/>
+    <w:lsdException w:unhideWhenUsed="0" w:uiPriority="61" w:semiHidden="0" w:name="Light List Accent 5"/>
+    <w:lsdException w:unhideWhenUsed="0" w:uiPriority="62" w:semiHidden="0" w:name="Light Grid Accent 5"/>
+    <w:lsdException w:unhideWhenUsed="0" w:uiPriority="63" w:semiHidden="0" w:name="Medium Shading 1 Accent 5"/>
+    <w:lsdException w:unhideWhenUsed="0" w:uiPriority="64" w:semiHidden="0" w:name="Medium Shading 2 Accent 5"/>
+    <w:lsdException w:unhideWhenUsed="0" w:uiPriority="65" w:semiHidden="0" w:name="Medium List 1 Accent 5"/>
+    <w:lsdException w:unhideWhenUsed="0" w:uiPriority="66" w:semiHidden="0" w:name="Medium List 2 Accent 5"/>
+    <w:lsdException w:unhideWhenUsed="0" w:uiPriority="67" w:semiHidden="0" w:name="Medium Grid 1 Accent 5"/>
+    <w:lsdException w:unhideWhenUsed="0" w:uiPriority="68" w:semiHidden="0" w:name="Medium Grid 2 Accent 5"/>
+    <w:lsdException w:unhideWhenUsed="0" w:uiPriority="69" w:semiHidden="0" w:name="Medium Grid 3 Accent 5"/>
+    <w:lsdException w:unhideWhenUsed="0" w:uiPriority="70" w:semiHidden="0" w:name="Dark List Accent 5"/>
+    <w:lsdException w:unhideWhenUsed="0" w:uiPriority="71" w:semiHidden="0" w:name="Colorful Shading Accent 5"/>
+    <w:lsdException w:unhideWhenUsed="0" w:uiPriority="72" w:semiHidden="0" w:name="Colorful List Accent 5"/>
+    <w:lsdException w:unhideWhenUsed="0" w:uiPriority="73" w:semiHidden="0" w:name="Colorful Grid Accent 5"/>
+    <w:lsdException w:unhideWhenUsed="0" w:uiPriority="60" w:semiHidden="0" w:name="Light Shading Accent 6"/>
+    <w:lsdException w:unhideWhenUsed="0" w:uiPriority="61" w:semiHidden="0" w:name="Light List Accent 6"/>
+    <w:lsdException w:unhideWhenUsed="0" w:uiPriority="62" w:semiHidden="0" w:name="Light Grid Accent 6"/>
+    <w:lsdException w:unhideWhenUsed="0" w:uiPriority="63" w:semiHidden="0" w:name="Medium Shading 1 Accent 6"/>
+    <w:lsdException w:unhideWhenUsed="0" w:uiPriority="64" w:semiHidden="0" w:name="Medium Shading 2 Accent 6"/>
+    <w:lsdException w:unhideWhenUsed="0" w:uiPriority="65" w:semiHidden="0" w:name="Medium List 1 Accent 6"/>
+    <w:lsdException w:unhideWhenUsed="0" w:uiPriority="66" w:semiHidden="0" w:name="Medium List 2 Accent 6"/>
+    <w:lsdException w:unhideWhenUsed="0" w:uiPriority="67" w:semiHidden="0" w:name="Medium Grid 1 Accent 6"/>
+    <w:lsdException w:unhideWhenUsed="0" w:uiPriority="68" w:semiHidden="0" w:name="Medium Grid 2 Accent 6"/>
+    <w:lsdException w:unhideWhenUsed="0" w:uiPriority="69" w:semiHidden="0" w:name="Medium Grid 3 Accent 6"/>
+    <w:lsdException w:unhideWhenUsed="0" w:uiPriority="70" w:semiHidden="0" w:name="Dark List Accent 6"/>
+    <w:lsdException w:unhideWhenUsed="0" w:uiPriority="71" w:semiHidden="0" w:name="Colorful Shading Accent 6"/>
+    <w:lsdException w:unhideWhenUsed="0" w:uiPriority="72" w:semiHidden="0" w:name="Colorful List Accent 6"/>
+    <w:lsdException w:unhideWhenUsed="0" w:uiPriority="73" w:semiHidden="0" w:name="Colorful Grid Accent 6"/>
   </w:latentStyles>
-  <w:style w:type="paragraph" w:default="1" w:styleId="Normal">
+  <w:style w:type="paragraph" w:default="1" w:styleId="1">
     <w:name w:val="Normal"/>
     <w:qFormat/>
+    <w:uiPriority w:val="0"/>
+    <w:rPr>
+      <w:rFonts w:ascii="Arial" w:hAnsi="Arial" w:eastAsia="Arial" w:cs="Arial"/>
+      <w:sz w:val="22"/>
+      <w:szCs w:val="22"/>
+      <w:lang w:val="en-US" w:eastAsia="en-US" w:bidi="ar-SA"/>
+    </w:rPr>
   </w:style>
-  <w:style w:type="paragraph" w:styleId="Heading1">
+  <w:style w:type="paragraph" w:styleId="2">
     <w:name w:val="heading 1"/>
+    <w:qFormat/>
     <w:uiPriority w:val="9"/>
-    <w:qFormat/>
     <w:pPr>
       <w:spacing w:before="240" w:after="120"/>
       <w:outlineLvl w:val="0"/>
     </w:pPr>
     <w:rPr>
+      <w:rFonts w:ascii="Arial" w:hAnsi="Arial" w:eastAsia="Arial" w:cs="Arial"/>
       <w:b/>
       <w:bCs/>
       <w:color w:val="2E3A87"/>
       <w:sz w:val="28"/>
       <w:szCs w:val="28"/>
+      <w:lang w:val="en-US" w:eastAsia="en-US" w:bidi="ar-SA"/>
     </w:rPr>
   </w:style>
-  <w:style w:type="paragraph" w:styleId="Heading2">
+  <w:style w:type="paragraph" w:styleId="3">
     <w:name w:val="heading 2"/>
-    <w:uiPriority w:val="9"/>
     <w:unhideWhenUsed/>
     <w:qFormat/>
+    <w:uiPriority w:val="9"/>
     <w:pPr>
       <w:spacing w:before="180" w:after="80"/>
       <w:outlineLvl w:val="1"/>
     </w:pPr>
     <w:rPr>
+      <w:rFonts w:ascii="Arial" w:hAnsi="Arial" w:eastAsia="Arial" w:cs="Arial"/>
       <w:b/>
       <w:bCs/>
       <w:color w:val="2E3A87"/>
       <w:sz w:val="24"/>
       <w:szCs w:val="24"/>
+      <w:lang w:val="en-US" w:eastAsia="en-US" w:bidi="ar-SA"/>
     </w:rPr>
   </w:style>
-  <w:style w:type="paragraph" w:styleId="Heading3">
+  <w:style w:type="paragraph" w:styleId="4">
     <w:name w:val="heading 3"/>
-    <w:uiPriority w:val="9"/>
     <w:semiHidden/>
     <w:unhideWhenUsed/>
     <w:qFormat/>
+    <w:uiPriority w:val="9"/>
     <w:pPr>
       <w:outlineLvl w:val="2"/>
     </w:pPr>
     <w:rPr>
+      <w:rFonts w:ascii="Arial" w:hAnsi="Arial" w:eastAsia="Arial" w:cs="Arial"/>
       <w:color w:val="1F4D78"/>
       <w:sz w:val="24"/>
       <w:szCs w:val="24"/>
+      <w:lang w:val="en-US" w:eastAsia="en-US" w:bidi="ar-SA"/>
     </w:rPr>
   </w:style>
-  <w:style w:type="paragraph" w:styleId="Heading4">
+  <w:style w:type="paragraph" w:styleId="5">
     <w:name w:val="heading 4"/>
-    <w:uiPriority w:val="9"/>
     <w:semiHidden/>
     <w:unhideWhenUsed/>
     <w:qFormat/>
+    <w:uiPriority w:val="9"/>
     <w:pPr>
       <w:outlineLvl w:val="3"/>
     </w:pPr>
     <w:rPr>
+      <w:rFonts w:ascii="Arial" w:hAnsi="Arial" w:eastAsia="Arial" w:cs="Arial"/>
       <w:i/>
       <w:iCs/>
       <w:color w:val="2E74B5"/>
+      <w:sz w:val="22"/>
+      <w:szCs w:val="22"/>
+      <w:lang w:val="en-US" w:eastAsia="en-US" w:bidi="ar-SA"/>
     </w:rPr>
   </w:style>
-  <w:style w:type="paragraph" w:styleId="Heading5">
+  <w:style w:type="paragraph" w:styleId="6">
     <w:name w:val="heading 5"/>
-    <w:uiPriority w:val="9"/>
     <w:semiHidden/>
     <w:unhideWhenUsed/>
     <w:qFormat/>
+    <w:uiPriority w:val="9"/>
     <w:pPr>
       <w:outlineLvl w:val="4"/>
     </w:pPr>
     <w:rPr>
+      <w:rFonts w:ascii="Arial" w:hAnsi="Arial" w:eastAsia="Arial" w:cs="Arial"/>
       <w:color w:val="2E74B5"/>
+      <w:sz w:val="22"/>
+      <w:szCs w:val="22"/>
+      <w:lang w:val="en-US" w:eastAsia="en-US" w:bidi="ar-SA"/>
     </w:rPr>
   </w:style>
-  <w:style w:type="paragraph" w:styleId="Heading6">
+  <w:style w:type="paragraph" w:styleId="7">
     <w:name w:val="heading 6"/>
-    <w:uiPriority w:val="9"/>
     <w:semiHidden/>
     <w:unhideWhenUsed/>
     <w:qFormat/>
+    <w:uiPriority w:val="9"/>
     <w:pPr>
       <w:outlineLvl w:val="5"/>
     </w:pPr>
     <w:rPr>
+      <w:rFonts w:ascii="Arial" w:hAnsi="Arial" w:eastAsia="Arial" w:cs="Arial"/>
       <w:color w:val="1F4D78"/>
+      <w:sz w:val="22"/>
+      <w:szCs w:val="22"/>
+      <w:lang w:val="en-US" w:eastAsia="en-US" w:bidi="ar-SA"/>
     </w:rPr>
   </w:style>
-  <w:style w:type="character" w:default="1" w:styleId="DefaultParagraphFont">
+  <w:style w:type="character" w:default="1" w:styleId="8">
     <w:name w:val="Default Paragraph Font"/>
-    <w:uiPriority w:val="1"/>
     <w:semiHidden/>
     <w:unhideWhenUsed/>
+    <w:qFormat/>
+    <w:uiPriority w:val="1"/>
   </w:style>
-  <w:style w:type="table" w:default="1" w:styleId="TableNormal">
+  <w:style w:type="table" w:default="1" w:styleId="9">
     <w:name w:val="Normal Table"/>
-    <w:uiPriority w:val="99"/>
     <w:semiHidden/>
     <w:unhideWhenUsed/>
+    <w:qFormat/>
+    <w:uiPriority w:val="99"/>
     <w:tblPr>
-      <w:tblInd w:w="0" w:type="dxa"/>
       <w:tblCellMar>
         <w:top w:w="0" w:type="dxa"/>
         <w:left w:w="108" w:type="dxa"/>
@@ -5010,99 +5043,113 @@
       </w:tblCellMar>
     </w:tblPr>
   </w:style>
-  <w:style w:type="numbering" w:default="1" w:styleId="NoList">
-    <w:name w:val="No List"/>
-    <w:uiPriority w:val="99"/>
+  <w:style w:type="character" w:styleId="10">
+    <w:name w:val="endnote reference"/>
     <w:semiHidden/>
     <w:unhideWhenUsed/>
-  </w:style>
-  <w:style w:type="paragraph" w:styleId="Title">
-    <w:name w:val="Title"/>
-    <w:uiPriority w:val="10"/>
     <w:qFormat/>
+    <w:uiPriority w:val="99"/>
     <w:rPr>
-      <w:sz w:val="56"/>
-      <w:szCs w:val="56"/>
+      <w:vertAlign w:val="superscript"/>
     </w:rPr>
   </w:style>
-  <w:style w:type="paragraph" w:customStyle="1" w:styleId="Strong1">
-    <w:name w:val="Strong1"/>
+  <w:style w:type="paragraph" w:styleId="11">
+    <w:name w:val="endnote text"/>
+    <w:link w:val="19"/>
+    <w:semiHidden/>
+    <w:unhideWhenUsed/>
     <w:qFormat/>
+    <w:uiPriority w:val="99"/>
     <w:rPr>
-      <w:b/>
-      <w:bCs/>
+      <w:rFonts w:ascii="Arial" w:hAnsi="Arial" w:eastAsia="Arial" w:cs="Arial"/>
+      <w:sz w:val="20"/>
+      <w:szCs w:val="20"/>
+      <w:lang w:val="en-US" w:eastAsia="en-US" w:bidi="ar-SA"/>
     </w:rPr>
   </w:style>
-  <w:style w:type="paragraph" w:styleId="ListParagraph">
-    <w:name w:val="List Paragraph"/>
-    <w:qFormat/>
+  <w:style w:type="character" w:styleId="12">
+    <w:name w:val="footnote reference"/>
+    <w:semiHidden/>
+    <w:unhideWhenUsed/>
+    <w:uiPriority w:val="99"/>
+    <w:rPr>
+      <w:vertAlign w:val="superscript"/>
+    </w:rPr>
   </w:style>
-  <w:style w:type="character" w:styleId="Hyperlink">
+  <w:style w:type="paragraph" w:styleId="13">
+    <w:name w:val="footnote text"/>
+    <w:link w:val="18"/>
+    <w:semiHidden/>
+    <w:unhideWhenUsed/>
+    <w:uiPriority w:val="99"/>
+    <w:rPr>
+      <w:rFonts w:ascii="Arial" w:hAnsi="Arial" w:eastAsia="Arial" w:cs="Arial"/>
+      <w:sz w:val="20"/>
+      <w:szCs w:val="20"/>
+      <w:lang w:val="en-US" w:eastAsia="en-US" w:bidi="ar-SA"/>
+    </w:rPr>
+  </w:style>
+  <w:style w:type="character" w:styleId="14">
     <w:name w:val="Hyperlink"/>
+    <w:unhideWhenUsed/>
     <w:uiPriority w:val="99"/>
-    <w:unhideWhenUsed/>
     <w:rPr>
       <w:color w:val="0563C1"/>
       <w:u w:val="single"/>
     </w:rPr>
   </w:style>
-  <w:style w:type="character" w:styleId="FootnoteReference">
-    <w:name w:val="footnote reference"/>
-    <w:uiPriority w:val="99"/>
+  <w:style w:type="paragraph" w:styleId="15">
+    <w:name w:val="Title"/>
+    <w:qFormat/>
+    <w:uiPriority w:val="10"/>
+    <w:rPr>
+      <w:rFonts w:ascii="Arial" w:hAnsi="Arial" w:eastAsia="Arial" w:cs="Arial"/>
+      <w:sz w:val="56"/>
+      <w:szCs w:val="56"/>
+      <w:lang w:val="en-US" w:eastAsia="en-US" w:bidi="ar-SA"/>
+    </w:rPr>
+  </w:style>
+  <w:style w:type="paragraph" w:customStyle="1" w:styleId="16">
+    <w:name w:val="Strong1"/>
+    <w:qFormat/>
+    <w:uiPriority w:val="0"/>
+    <w:rPr>
+      <w:rFonts w:ascii="Arial" w:hAnsi="Arial" w:eastAsia="Arial" w:cs="Arial"/>
+      <w:b/>
+      <w:bCs/>
+      <w:sz w:val="22"/>
+      <w:szCs w:val="22"/>
+      <w:lang w:val="en-US" w:eastAsia="en-US" w:bidi="ar-SA"/>
+    </w:rPr>
+  </w:style>
+  <w:style w:type="paragraph" w:styleId="17">
+    <w:name w:val="List Paragraph"/>
+    <w:qFormat/>
+    <w:uiPriority w:val="0"/>
+    <w:rPr>
+      <w:rFonts w:ascii="Arial" w:hAnsi="Arial" w:eastAsia="Arial" w:cs="Arial"/>
+      <w:sz w:val="22"/>
+      <w:szCs w:val="22"/>
+      <w:lang w:val="en-US" w:eastAsia="en-US" w:bidi="ar-SA"/>
+    </w:rPr>
+  </w:style>
+  <w:style w:type="character" w:customStyle="1" w:styleId="18">
+    <w:name w:val="Footnote Text Char"/>
+    <w:link w:val="13"/>
     <w:semiHidden/>
     <w:unhideWhenUsed/>
-    <w:rPr>
-      <w:vertAlign w:val="superscript"/>
-    </w:rPr>
-  </w:style>
-  <w:style w:type="paragraph" w:styleId="FootnoteText">
-    <w:name w:val="footnote text"/>
-    <w:link w:val="FootnoteTextChar"/>
     <w:uiPriority w:val="99"/>
-    <w:semiHidden/>
-    <w:unhideWhenUsed/>
     <w:rPr>
       <w:sz w:val="20"/>
       <w:szCs w:val="20"/>
     </w:rPr>
   </w:style>
-  <w:style w:type="character" w:customStyle="1" w:styleId="FootnoteTextChar">
-    <w:name w:val="Footnote Text Char"/>
-    <w:link w:val="FootnoteText"/>
-    <w:uiPriority w:val="99"/>
+  <w:style w:type="character" w:customStyle="1" w:styleId="19">
+    <w:name w:val="Endnote Text Char"/>
+    <w:link w:val="11"/>
     <w:semiHidden/>
     <w:unhideWhenUsed/>
-    <w:rPr>
-      <w:sz w:val="20"/>
-      <w:szCs w:val="20"/>
-    </w:rPr>
-  </w:style>
-  <w:style w:type="character" w:styleId="EndnoteReference">
-    <w:name w:val="endnote reference"/>
     <w:uiPriority w:val="99"/>
-    <w:semiHidden/>
-    <w:unhideWhenUsed/>
-    <w:rPr>
-      <w:vertAlign w:val="superscript"/>
-    </w:rPr>
-  </w:style>
-  <w:style w:type="paragraph" w:styleId="EndnoteText">
-    <w:name w:val="endnote text"/>
-    <w:link w:val="EndnoteTextChar"/>
-    <w:uiPriority w:val="99"/>
-    <w:semiHidden/>
-    <w:unhideWhenUsed/>
-    <w:rPr>
-      <w:sz w:val="20"/>
-      <w:szCs w:val="20"/>
-    </w:rPr>
-  </w:style>
-  <w:style w:type="character" w:customStyle="1" w:styleId="EndnoteTextChar">
-    <w:name w:val="Endnote Text Char"/>
-    <w:link w:val="EndnoteText"/>
-    <w:uiPriority w:val="99"/>
-    <w:semiHidden/>
-    <w:unhideWhenUsed/>
     <w:rPr>
       <w:sz w:val="20"/>
       <w:szCs w:val="20"/>
@@ -5154,7 +5201,7 @@
     </a:clrScheme>
     <a:fontScheme name="Office">
       <a:majorFont>
-        <a:latin typeface="Aptos Display" panose="02110004020202020204"/>
+        <a:latin typeface="Aptos Display"/>
         <a:ea typeface=""/>
         <a:cs typeface=""/>
         <a:font script="Jpan" typeface="游ゴシック Light"/>
@@ -5187,26 +5234,9 @@
         <a:font script="Viet" typeface="Times New Roman"/>
         <a:font script="Uigh" typeface="Microsoft Uighur"/>
         <a:font script="Geor" typeface="Sylfaen"/>
-        <a:font script="Armn" typeface="Arial"/>
-        <a:font script="Bugi" typeface="Leelawadee UI"/>
-        <a:font script="Bopo" typeface="Microsoft JhengHei"/>
-        <a:font script="Java" typeface="Javanese Text"/>
-        <a:font script="Lisu" typeface="Segoe UI"/>
-        <a:font script="Mymr" typeface="Myanmar Text"/>
-        <a:font script="Nkoo" typeface="Ebrima"/>
-        <a:font script="Olck" typeface="Nirmala UI"/>
-        <a:font script="Osma" typeface="Ebrima"/>
-        <a:font script="Phag" typeface="Phagspa"/>
-        <a:font script="Syrn" typeface="Estrangelo Edessa"/>
-        <a:font script="Syrj" typeface="Estrangelo Edessa"/>
-        <a:font script="Syre" typeface="Estrangelo Edessa"/>
-        <a:font script="Sora" typeface="Nirmala UI"/>
-        <a:font script="Tale" typeface="Microsoft Tai Le"/>
-        <a:font script="Talu" typeface="Microsoft New Tai Lue"/>
-        <a:font script="Tfng" typeface="Ebrima"/>
       </a:majorFont>
       <a:minorFont>
-        <a:latin typeface="Aptos" panose="02110004020202020204"/>
+        <a:latin typeface="Aptos"/>
         <a:ea typeface=""/>
         <a:cs typeface=""/>
         <a:font script="Jpan" typeface="游明朝"/>
@@ -5239,23 +5269,6 @@
         <a:font script="Viet" typeface="Arial"/>
         <a:font script="Uigh" typeface="Microsoft Uighur"/>
         <a:font script="Geor" typeface="Sylfaen"/>
-        <a:font script="Armn" typeface="Arial"/>
-        <a:font script="Bugi" typeface="Leelawadee UI"/>
-        <a:font script="Bopo" typeface="Microsoft JhengHei"/>
-        <a:font script="Java" typeface="Javanese Text"/>
-        <a:font script="Lisu" typeface="Segoe UI"/>
-        <a:font script="Mymr" typeface="Myanmar Text"/>
-        <a:font script="Nkoo" typeface="Ebrima"/>
-        <a:font script="Olck" typeface="Nirmala UI"/>
-        <a:font script="Osma" typeface="Ebrima"/>
-        <a:font script="Phag" typeface="Phagspa"/>
-        <a:font script="Syrn" typeface="Estrangelo Edessa"/>
-        <a:font script="Syrj" typeface="Estrangelo Edessa"/>
-        <a:font script="Syre" typeface="Estrangelo Edessa"/>
-        <a:font script="Sora" typeface="Nirmala UI"/>
-        <a:font script="Tale" typeface="Microsoft Tai Le"/>
-        <a:font script="Talu" typeface="Microsoft New Tai Lue"/>
-        <a:font script="Tfng" typeface="Ebrima"/>
       </a:minorFont>
     </a:fontScheme>
     <a:fmtScheme name="Office">
@@ -5417,11 +5430,5 @@
       </a:style>
     </a:lnDef>
   </a:objectDefaults>
-  <a:extraClrSchemeLst/>
-  <a:extLst>
-    <a:ext uri="{05A4C25C-085E-4340-85A3-A5531E510DB2}">
-      <thm15:themeFamily xmlns:thm15="http://schemas.microsoft.com/office/thememl/2012/main" name="Office Theme" id="{2E142A2C-CD16-42D6-873A-C26D2A0506FA}" vid="{1BDDFF52-6CD6-40A5-AB3C-68EB2F1E4D0A}"/>
-    </a:ext>
-  </a:extLst>
 </a:theme>
 </file>
</xml_diff>